<commit_message>
Fix: Ajout des accents français (é, è, ê, à, ù, ç, etc.)
</commit_message>
<xml_diff>
--- a/Rapport_PFE_Varcadia_ABDOUH_Yassir.docx
+++ b/Rapport_PFE_Varcadia_ABDOUH_Yassir.docx
@@ -99,7 +99,7 @@
           <w:color w:val="1A1A1A"/>
           <w:sz w:val="34"/>
         </w:rPr>
-        <w:t>L'Impact de l'Intelligence Artificielle sur l'Efficacite</w:t>
+        <w:t>L'Impact de l'Intelligence Artificielle sur l'Efficacité</w:t>
       </w:r>
     </w:p>
     <w:p>
@@ -115,7 +115,7 @@
           <w:color w:val="1A1A1A"/>
           <w:sz w:val="34"/>
         </w:rPr>
-        <w:t>des Strategies du Marketing Digital</w:t>
+        <w:t>des Stratégies du Marketing Digital</w:t>
       </w:r>
     </w:p>
     <w:p>
@@ -175,7 +175,7 @@
                 <w:color w:val="1F4E79"/>
                 <w:sz w:val="23"/>
               </w:rPr>
-              <w:t>Realise par :</w:t>
+              <w:t>Réalisé par :</w:t>
             </w:r>
           </w:p>
         </w:tc>
@@ -289,7 +289,7 @@
                 <w:color w:val="1F4E79"/>
                 <w:sz w:val="23"/>
               </w:rPr>
-              <w:t>Annee universitaire :</w:t>
+              <w:t>Année universitaire :</w:t>
             </w:r>
           </w:p>
         </w:tc>
@@ -328,7 +328,7 @@
           <w:color w:val="595959"/>
           <w:sz w:val="20"/>
         </w:rPr>
-        <w:t>Annee universitaire 2025 / 2026</w:t>
+        <w:t>Année universitaire 2025 / 2026</w:t>
       </w:r>
     </w:p>
     <w:p>
@@ -368,7 +368,7 @@
           <w:color w:val="1A1A1A"/>
           <w:sz w:val="24"/>
         </w:rPr>
-        <w:t>Au terme de ce travail, je tiens a exprimer toute ma gratitude envers les personnes qui ont contribue, de pres ou de loin, a sa realisation. Ce rapport n'aurait pas vu le jour sans leur soutien, leur confiance et leur disponibilite.</w:t>
+        <w:t>Au terme de ce travail, je tiens à exprimer toute ma gratitude envers les personnes qui ont contribué, de pres où de loin, à sa realisation. Ce rapport n'aurait pas vu le jour sans leur soutien, leur confiance et leur disponibilite.</w:t>
       </w:r>
     </w:p>
     <w:p>
@@ -384,7 +384,7 @@
           <w:color w:val="1A1A1A"/>
           <w:sz w:val="24"/>
         </w:rPr>
-        <w:t>Je remercie en premier lieu Madame Hasnaa ALAMI, mon encadrante pedagogique a l'ENCG d'El Jadida, pour sa disponibilite, ses orientations methodologiques rigoureuses et son soutien bienveillant tout au long de ce projet. Sa capacite a guider sans imposer m'a permis de conserver une approche personnelle et authentique dans ce travail, tout en respectant les exigences academiques attendues d'un projet de fin d'etudes.</w:t>
+        <w:t>Je remercie en premier lieu Madame Hasnaa ALAMI, mon encadrante pedagogique à l'ENCG d'El Jadida, pour sa disponibilite, ses orientations methodologiques rigoureuses et son soutien bienveillant tout au long de ce projet. Sa capacité à guider sans imposer m'à permis de conserver une approche personnelle et authentique dans ce travail, tout en respectant les exigences académiques attendues d'un projet de fin d'études.</w:t>
       </w:r>
     </w:p>
     <w:p>
@@ -400,7 +400,7 @@
           <w:color w:val="1A1A1A"/>
           <w:sz w:val="24"/>
         </w:rPr>
-        <w:t>Mes remerciements s'adressent egalement a l'ensemble de l'equipe de l'agence 360 Widma Digitale, qui m'a accueilli dans un cadre professionnel stimulant et m'a confie des responsabilites reelles. Cette experience a ete, a plus d'un titre, formatrice et enrichissante ; elle m'a permis de confronter les connaissances theoriques acquises a l'ecole aux realites operationnelles du metier.</w:t>
+        <w:t>Mes remerciements s'adressent egalement à l'ensemble de l'équipe de l'agence 360 Widma Digitale, qui m'à accueilli dans un cadre professionnel stimulant et m'à confie des responsabilites réelles. Cette expérience à été, à plus d'un titre, formatrice et enrichissante ; elle m'à permis de confronter les connaissances théoriques acquises à l'école aux realites operationnelles du metier.</w:t>
       </w:r>
     </w:p>
     <w:p>
@@ -416,7 +416,7 @@
           <w:color w:val="1A1A1A"/>
           <w:sz w:val="24"/>
         </w:rPr>
-        <w:t>Je souhaite aussi exprimer ma reconnaissance envers les fondateurs de Varcadia, parc de jeux et de loisirs de Soualem, pour la confiance qu'ils ont accordee a nos deux agences pour piloter leur strategie de lancement. Leur ouverture d'esprit et leur volonte d'innover ont rendu possible l'experimentation decrite dans ce rapport.</w:t>
+        <w:t>Je souhaite aussi exprimer ma reconnaissance envers les fondateurs de Varcadia, parc de jeux et de loisirs de Soualem, pour la confiance qu'ils ont accordee à nos deux agences pour piloter leur stratégie de lancement. Leur ouverture d'esprit et leur volonte d'innover ont rendu possible l'expérimentation décrite dans ce rapport.</w:t>
       </w:r>
     </w:p>
     <w:p>
@@ -432,7 +432,7 @@
           <w:color w:val="1A1A1A"/>
           <w:sz w:val="24"/>
         </w:rPr>
-        <w:t>Je remercie enfin l'equipe de Volcano Vision, l'agence que j'ai fondee durant mon parcours universitaire, dont la collaboration avec Widma Digitale a ete determinante dans la reussite de ce projet. Mener une structure entrepreneuriale en parallele de mes etudes m'a appris autant sur moi-meme que sur le metier, et m'a offert un terrain d'application directement relie a la problematique de ce memoire.</w:t>
+        <w:t>Je remercie enfin l'équipe de Volcano Vision, l'agence que j'ai fondée durant mon parcours universitaire, dont la collaboration avec Widma Digitale à été déterminante dans la reussite de ce projet. Mener une structure entrepreneuriale en parallele de mes études m'à appris autant sur moi-même que sur le metier, et m'à offert un terrain d'application directement relie à la problematique de ce memoire.</w:t>
       </w:r>
     </w:p>
     <w:p>
@@ -448,7 +448,7 @@
           <w:color w:val="1A1A1A"/>
           <w:sz w:val="24"/>
         </w:rPr>
-        <w:t>A ma famille, mes amis et mes proches : merci pour votre patience et vos encouragements constants tout au long de ces annees d'etudes.</w:t>
+        <w:t>À ma famille, mes amis et mes proches : merci pour votre patience et vos encouragements constants tout au long de ces années d'études.</w:t>
       </w:r>
     </w:p>
     <w:p>
@@ -472,7 +472,7 @@
           <w:color w:val="1F4E79"/>
           <w:sz w:val="36"/>
         </w:rPr>
-        <w:t>Resume</w:t>
+        <w:t>Résumé</w:t>
       </w:r>
     </w:p>
     <w:p>
@@ -488,7 +488,7 @@
           <w:color w:val="1A1A1A"/>
           <w:sz w:val="24"/>
         </w:rPr>
-        <w:t>Ce rapport de stage de Projet de Fin d'Etudes, realise dans le cadre de la cinquieme annee de la filiere Marketing a l'Ecole Nationale de Commerce et de Gestion d'El Jadida, traite de l'impact de l'intelligence artificielle sur l'efficacite des strategies de marketing digital. L'analyse se concentre sur deux dimensions fondamentales : l'optimisation du ciblage publicitaire et la generation de contenu par intelligence artificielle.</w:t>
+        <w:t>Ce rapport de stage de Projet de Fin d'Études, réalisé dans le cadre de la cinquieme année de la filiere Marketing à l'École Nationale de Commerce et de Gestion d'El Jadida, traite de l'impact de l'intelligence artificielle sur l'efficacité des stratégies de marketing digital. L'analysé se concentré sur deux dimensions fondamentales : l'optimisation du ciblage publicitaire et la generation de contenu par intelligence artificielle.</w:t>
       </w:r>
     </w:p>
     <w:p>
@@ -504,7 +504,7 @@
           <w:color w:val="1A1A1A"/>
           <w:sz w:val="24"/>
         </w:rPr>
-        <w:t>Le stage a ete effectue au sein de l'agence 360 Widma Digitale, en collaboration avec Volcano Vision, agence de communication fondee par l'auteur durant son parcours universitaire. Cette double implication a permis de conduire, de bout en bout, une campagne de lancement pour Varcadia, parc de jeux nouvellement ouvert a Soualem.</w:t>
+        <w:t>Le stage à été effectué au sein de l'agence 360 Widma Digitale, en collaboration avec Volcano Vision, agence de communication fondée par l'auteur durant son parcours universitaire. Cette double implication à permis de conduire, de bout en bout, une campagne de lancement pour Varcadia, parc de jeux nouvellement ouvert à Soualem.</w:t>
       </w:r>
     </w:p>
     <w:p>
@@ -520,7 +520,7 @@
           <w:color w:val="1A1A1A"/>
           <w:sz w:val="24"/>
         </w:rPr>
-        <w:t>La campagne, pilotee par des outils d'IA generative tels que Kling AI et Nano Banana Pro, s'est appuyee sur une strategie multicanale incluant YouTube Ads, Meta Ads et l'affichage urbain. Deux videos ont structure le dispositif creatif : un teaser narratif fonde sur l'evasion d'un quotidien monotone, puis une video de devoilement mettant en scene une mascotte. En un mois de teasing, plus d'un million de vues ont ete enregistrees, et l'ouverture du parc a attire une forte affluence, confirmant la pertinence de l'approche.</w:t>
+        <w:t>La campagne, pilotee par des outils d'IA générative tels que Kling AI et Nano Banana Pro, s'est appuyee sur une stratégie multicanale incluant YouTube Ads, Meta Ads et l'affichage urbain. Deux videos ont structure le dispositif créatif : un teaser narratif fondé sur l'evasion d'un quotidien monotone, puis une video de dévoilement mettant en scene une mascotte. En un mois de teasing, plus d'un million de vues ont été enregistrees, et l'ouverture du parc à attire une forte affluence, confirmant la pertinence de l'approche.</w:t>
       </w:r>
     </w:p>
     <w:p>
@@ -536,7 +536,7 @@
           <w:color w:val="1A1A1A"/>
           <w:sz w:val="24"/>
         </w:rPr>
-        <w:t>Mots-cles :</w:t>
+        <w:t>Mots-clés :</w:t>
       </w:r>
       <w:r>
         <w:rPr>
@@ -546,7 +546,7 @@
           <w:color w:val="1A1A1A"/>
           <w:sz w:val="24"/>
         </w:rPr>
-        <w:t xml:space="preserve"> intelligence artificielle, marketing digital, ciblage publicitaire, IA generative, Varcadia, Kling AI, Nano Banana Pro, YouTube Ads, Meta Ads, campagne de lancement, teasing, Maroc.</w:t>
+        <w:t xml:space="preserve"> intelligence artificielle, marketing digital, ciblage publicitaire, IA générative, Varcadia, Kling AI, Nano Banana Pro, YouTube Ads, Meta Ads, campagne de lancement, teasing, Maroc.</w:t>
       </w:r>
     </w:p>
     <w:p>
@@ -577,7 +577,7 @@
           <w:color w:val="1A1A1A"/>
           <w:sz w:val="24"/>
         </w:rPr>
-        <w:t>This end-of-studies internship report, carried out within the fifth year of the Marketing program at the National School of Commerce and Management of El Jadida, examines the impact of artificial intelligence on the effectiveness of digital marketing strategies. The analysis focuses on two core dimensions: the optimisation of advertising targeting and AI-based content generation.</w:t>
+        <w:t>This end-of-studies internship report, carried out within the fifth year of the Marketing program at the National School of Commerce and Management of El Jadida, examines the impact of artificial intelligence on the effectiveness of digital marketing stratégies. The analysis focuses on two core dimensions: the optimisation of advertising targeting and AI-based content generation.</w:t>
       </w:r>
     </w:p>
     <w:p>
@@ -593,7 +593,7 @@
           <w:color w:val="1A1A1A"/>
           <w:sz w:val="24"/>
         </w:rPr>
-        <w:t>The internship took place at the 360 agency Widma Digitale, in collaboration with Volcano Vision, a communication agency founded by the author during his university studies. This dual involvement made it possible to run, end to end, a launch campaign for Varcadia, a newly opened amusement park in Soualem, Morocco.</w:t>
+        <w:t>The internship took place at the 360 agency Widma Digitale, in collaboration with Volcano Vision, a communication agency founded by the author during his university studies. This dual involvement made it possible to run, end to end, à launch campaign for Varcadia, à newly opened amusement park in Soualem, Morocco.</w:t>
       </w:r>
     </w:p>
     <w:p>
@@ -609,7 +609,7 @@
           <w:color w:val="1A1A1A"/>
           <w:sz w:val="24"/>
         </w:rPr>
-        <w:t>Driven by generative AI tools such as Kling AI and Nano Banana Pro, the campaign relied on a multichannel strategy including YouTube Ads, Meta Ads and out-of-home advertising. Two videos structured the creative system: a narrative teaser based on escaping a dull routine, then a reveal video featuring a mascot. Within one month of teasing, more than one million views were recorded, and the park opening attracted strong attendance, confirming the relevance of the approach.</w:t>
+        <w:t>Driven by générative AI tools such as Kling AI and Nano Banana Pro, the campaign relied on a multichannel strategy including YouTube Ads, Meta Ads and out-of-home advertising. Two videos structured the créative system: à narrative teaser based on escaping à dull routine, then à reveal video featuring à mascot. Within one month of teasing, more than one million views were recorded, and the park opening attracted strong attendance, confirming the relevance of the approach.</w:t>
       </w:r>
     </w:p>
     <w:p>
@@ -635,7 +635,7 @@
           <w:color w:val="1A1A1A"/>
           <w:sz w:val="24"/>
         </w:rPr>
-        <w:t xml:space="preserve"> artificial intelligence, digital marketing, ad targeting, generative AI, Varcadia, Kling AI, Nano Banana Pro, YouTube Ads, Meta Ads, launch campaign, teasing, Morocco.</w:t>
+        <w:t xml:space="preserve"> artificial intelligence, digital marketing, ad targeting, générative AI, Varcadia, Kling AI, Nano Banana Pro, YouTube Ads, Meta Ads, launch campaign, teasing, Morocco.</w:t>
       </w:r>
     </w:p>
     <w:p>
@@ -890,7 +890,7 @@
                 <w:color w:val="1A1A1A"/>
                 <w:sz w:val="22"/>
               </w:rPr>
-              <w:t>Generative Artificial Intelligence (IA generative)</w:t>
+              <w:t>Générative Artificial Intelligence (IA générative)</w:t>
             </w:r>
           </w:p>
         </w:tc>
@@ -934,7 +934,7 @@
                 <w:color w:val="1A1A1A"/>
                 <w:sz w:val="22"/>
               </w:rPr>
-              <w:t>Large Language Model (grand modele de langage)</w:t>
+              <w:t>Large Language Model (grand modèle de langage)</w:t>
             </w:r>
           </w:p>
         </w:tc>
@@ -1022,7 +1022,7 @@
                 <w:color w:val="1A1A1A"/>
                 <w:sz w:val="22"/>
               </w:rPr>
-              <w:t>Return On Ad Spend (retour sur les depenses publicitaires)</w:t>
+              <w:t>Return On Ad Spend (retour sur les dépenses publicitaires)</w:t>
             </w:r>
           </w:p>
         </w:tc>
@@ -1066,7 +1066,7 @@
                 <w:color w:val="1A1A1A"/>
                 <w:sz w:val="22"/>
               </w:rPr>
-              <w:t>Cost Per Click (cout par clic)</w:t>
+              <w:t>Cost Per Click (coût par clic)</w:t>
             </w:r>
           </w:p>
         </w:tc>
@@ -1110,7 +1110,7 @@
                 <w:color w:val="1A1A1A"/>
                 <w:sz w:val="22"/>
               </w:rPr>
-              <w:t>Cost Per Acquisition (cout par acquisition)</w:t>
+              <w:t>Cost Per Acquisition (coût par acquisition)</w:t>
             </w:r>
           </w:p>
         </w:tc>
@@ -1154,7 +1154,7 @@
                 <w:color w:val="1A1A1A"/>
                 <w:sz w:val="22"/>
               </w:rPr>
-              <w:t>Cost Per View (cout par vue)</w:t>
+              <w:t>Cost Per View (coût par vue)</w:t>
             </w:r>
           </w:p>
         </w:tc>
@@ -1242,7 +1242,7 @@
                 <w:color w:val="1A1A1A"/>
                 <w:sz w:val="22"/>
               </w:rPr>
-              <w:t>Cost Per Mille (cout pour mille impressions)</w:t>
+              <w:t>Cost Per Mille (coût pour mille impressions)</w:t>
             </w:r>
           </w:p>
         </w:tc>
@@ -1330,7 +1330,7 @@
                 <w:color w:val="1A1A1A"/>
                 <w:sz w:val="22"/>
               </w:rPr>
-              <w:t>Key Performance Indicator (indicateur cle de performance)</w:t>
+              <w:t>Key Performance Indicator (indicateur clé de performance)</w:t>
             </w:r>
           </w:p>
         </w:tc>
@@ -1374,7 +1374,7 @@
                 <w:color w:val="1A1A1A"/>
                 <w:sz w:val="22"/>
               </w:rPr>
-              <w:t>Search Engine Optimization (referencement naturel)</w:t>
+              <w:t>Search Engine Optimization (référencement naturel)</w:t>
             </w:r>
           </w:p>
         </w:tc>
@@ -1418,7 +1418,7 @@
                 <w:color w:val="1A1A1A"/>
                 <w:sz w:val="22"/>
               </w:rPr>
-              <w:t>Search Engine Marketing (referencement payant)</w:t>
+              <w:t>Search Engine Marketing (référencement payant)</w:t>
             </w:r>
           </w:p>
         </w:tc>
@@ -1550,7 +1550,7 @@
                 <w:color w:val="1A1A1A"/>
                 <w:sz w:val="22"/>
               </w:rPr>
-              <w:t>User Generated Content (contenu genere par les utilisateurs)</w:t>
+              <w:t>User Generated Content (contenu généré par les utilisateurs)</w:t>
             </w:r>
           </w:p>
         </w:tc>
@@ -1594,7 +1594,7 @@
                 <w:color w:val="1A1A1A"/>
                 <w:sz w:val="22"/>
               </w:rPr>
-              <w:t>Ecole Nationale de Commerce et de Gestion</w:t>
+              <w:t>École Nationale de Commerce et de Gestion</w:t>
             </w:r>
           </w:p>
         </w:tc>
@@ -1638,7 +1638,7 @@
                 <w:color w:val="1A1A1A"/>
                 <w:sz w:val="22"/>
               </w:rPr>
-              <w:t>Projet de Fin d'Etudes</w:t>
+              <w:t>Projet de Fin d'Études</w:t>
             </w:r>
           </w:p>
         </w:tc>
@@ -1700,7 +1700,7 @@
           <w:color w:val="1A1A1A"/>
           <w:sz w:val="24"/>
         </w:rPr>
-        <w:t>Resume / Abstract</w:t>
+        <w:t>Résumé / Abstract</w:t>
       </w:r>
     </w:p>
     <w:p>
@@ -1760,7 +1760,7 @@
           <w:color w:val="1A1A1A"/>
           <w:sz w:val="24"/>
         </w:rPr>
-        <w:t xml:space="preserve">   Chapitre 1 - Le marketing digital a l'ere de l'intelligence artificielle</w:t>
+        <w:t xml:space="preserve">   Chapitre 1 - Le marketing digital à l'ere de l'intelligence artificielle</w:t>
       </w:r>
     </w:p>
     <w:p>
@@ -1820,7 +1820,7 @@
           <w:color w:val="1A1A1A"/>
           <w:sz w:val="24"/>
         </w:rPr>
-        <w:t xml:space="preserve">   Chapitre 4 - Methodologie de recherche</w:t>
+        <w:t xml:space="preserve">   Chapitre 4 - Méthodologie de recherche</w:t>
       </w:r>
     </w:p>
     <w:p>
@@ -1835,7 +1835,7 @@
           <w:color w:val="1A1A1A"/>
           <w:sz w:val="24"/>
         </w:rPr>
-        <w:t xml:space="preserve">   Chapitre 5 - Resultats et analyse</w:t>
+        <w:t xml:space="preserve">   Chapitre 5 - Résultats et analysé</w:t>
       </w:r>
     </w:p>
     <w:p>
@@ -1850,7 +1850,7 @@
           <w:color w:val="1A1A1A"/>
           <w:sz w:val="24"/>
         </w:rPr>
-        <w:t xml:space="preserve">   Chapitre 6 - Campagne Varcadia : demonstration appliquee</w:t>
+        <w:t xml:space="preserve">   Chapitre 6 - Campagne Varcadia : démonstration appliquee</w:t>
       </w:r>
     </w:p>
     <w:p>
@@ -1934,7 +1934,7 @@
           <w:color w:val="1F4E79"/>
           <w:sz w:val="28"/>
         </w:rPr>
-        <w:t>Contexte et interet du sujet</w:t>
+        <w:t>Contexte et intérêt du sujet</w:t>
       </w:r>
     </w:p>
     <w:p>
@@ -1950,7 +1950,7 @@
           <w:color w:val="1A1A1A"/>
           <w:sz w:val="24"/>
         </w:rPr>
-        <w:t>Le marketing digital est aujourd'hui l'un des secteurs professionnels les plus rapidement transformes par l'intelligence artificielle. La capacite des algorithmes a traiter des volumes massifs de donnees, a predire des comportements d'achat et a generer des contenus visuels ou redactionnels de haute qualite a redessine, en quelques annees seulement, les pratiques des agences et des annonceurs. Ce qui relevait hier de la prospective releve aujourd'hui du quotidien operationnel des equipes marketing, y compris dans les structures de taille modeste.</w:t>
+        <w:t>Le marketing digital est aujourd'hui l'un des secteurs professionnels les plus rapidement transformes par l'intelligence artificielle. La capacité des algorithmes à traiter des volumes massifs de donnees, à predire des comportements d'achat et à generer des contenus visuels où rédactionnels de haute qualité à redessine, en quelques années seulement, les pratiques des agences et des annonceurs. Ce qui relevait hier de la prospective releve aujourd'hui du quotidien operationnel des équipes marketing, y compris dans les structures de taille modeste.</w:t>
       </w:r>
     </w:p>
     <w:p>
@@ -1966,7 +1966,7 @@
           <w:color w:val="1A1A1A"/>
           <w:sz w:val="24"/>
         </w:rPr>
-        <w:t>Ce sujet presente un double interet. D'un point de vue academique, il s'inscrit au carrefour de deux domaines en pleine effervescence : le marketing digital et l'intelligence artificielle, offrant ainsi un terrain d'analyse particulierement fertile pour un travail de fin d'etudes en marketing. La litterature scientifique sur l'IA appliquee au marketing connait une croissance exponentielle, mais les etudes ancrees dans le contexte marocain et fondees sur des cas reels demeurent rares, ce qui confere a ce travail une valeur exploratoire.</w:t>
+        <w:t>Ce sujet présenté un double intérêt. D'un point de vue académique, il s'inscrit au carrefour de deux domaines en pleine effervescence : le marketing digital et l'intelligence artificielle, offrant ainsi un terrain d'analysé particulièrement fertile pour un travail de fin d'études en marketing. La litterature scientifique sur l'IA appliquee au marketing connait une croissance exponentielle, mais les études ancrees dans le contexte marocain et fondées sur des cas réels demeurent rares, ce qui confere à ce travail une valeur exploratoire.</w:t>
       </w:r>
     </w:p>
     <w:p>
@@ -1982,7 +1982,7 @@
           <w:color w:val="1A1A1A"/>
           <w:sz w:val="24"/>
         </w:rPr>
-        <w:t>D'un point de vue professionnel, la maitrise des outils d'IA generative et des plateformes publicitaires pilotees par algorithme constitue desormais une competence differenciante sur le marche du travail, y compris au Maroc. Les annonceurs attendent de leurs prestataires une capacite a produire vite, bien et a moindre cout ; l'IA devient l'instrument central de cette promesse. Documenter, depuis l'interieur d'une agence, la maniere dont ces outils sont reellement mobilises repond donc a un besoin concret du secteur.</w:t>
+        <w:t>D'un point de vue professionnel, la maitrise des outils d'IA générative et des plateformes publicitaires pilotees par algorithme constitué désormais une compétence differenciante sur le marché du travail, y compris au Maroc. Les annonceurs attendent de leurs prestataires une capacité à produire vite, bien et à moindre coût ; l'IA devient l'instrument central de cette promesse. Documenter, depuis l'interieur d'une agence, la manière dont ces outils sont reellement mobilises repond donc à un besoin concret du secteur.</w:t>
       </w:r>
     </w:p>
     <w:p>
@@ -2013,7 +2013,7 @@
           <w:color w:val="1A1A1A"/>
           <w:sz w:val="24"/>
         </w:rPr>
-        <w:t>Dans un environnement numerique caracterise par une concurrence croissante pour l'attention du consommateur et une explosion du volume de contenus disponibles, les approches marketing traditionnelles montrent leurs limites. Les marques cherchent des leviers plus efficaces, plus rapides et moins couteux pour atteindre leurs cibles et mesurer l'impact de leurs actions. La saturation publicitaire, la fragmentation des audiences et la montee des exigences de personnalisation rendent les methodes anciennes de moins en moins rentables.</w:t>
+        <w:t>Dans un environnement numérique caracterise par une concurrence croissante pour l'attention du consommateur et une explosion du volume de contenus disponibles, les approches marketing traditionnelles montrent leurs limites. Les marques cherchent des leviers plus efficaces, plus rapides et moins coûteux pour atteindre leurs cibles et mesurer l'impact de leurs actions. La saturation publicitaire, la fragmentation des audiences et la montee des exigences de personnalisation rendent les méthodes anciennes de moins en moins rentables.</w:t>
       </w:r>
     </w:p>
     <w:p>
@@ -2046,7 +2046,7 @@
           <w:color w:val="1F4E79"/>
           <w:sz w:val="25"/>
         </w:rPr>
-        <w:t>Dans quelle mesure l'intelligence artificielle ameliore-t-elle l'efficacite des strategies de marketing digital, notamment a travers l'optimisation du ciblage et la personnalisation du contenu publicitaire ?</w:t>
+        <w:t>Dans quelle mesuré l'intelligence artificielle améliore-t-elle l'efficacité des stratégies de marketing digital, notamment à travers l'optimisation du ciblage et la personnalisation du contenu publicitaire ?</w:t>
       </w:r>
     </w:p>
     <w:p>
@@ -2062,7 +2062,7 @@
           <w:color w:val="1A1A1A"/>
           <w:sz w:val="24"/>
         </w:rPr>
-        <w:t>Cette problematique nous amene a formuler trois hypotheses de travail, qui guideront l'ensemble de notre demarche empirique :</w:t>
+        <w:t>Cette problematique nous amene à formuler trois hypotheses de travail, qui guideront l'ensemble de notre démarche empirique :</w:t>
       </w:r>
     </w:p>
     <w:p>
@@ -2089,7 +2089,7 @@
           <w:color w:val="1A1A1A"/>
           <w:sz w:val="23"/>
         </w:rPr>
-        <w:t xml:space="preserve"> l'utilisation de l'IA dans le ciblage publicitaire ameliore significativement le taux de conversion des campagnes.</w:t>
+        <w:t xml:space="preserve"> l'utilisation de l'IA dans le ciblage publicitaire améliore significativement le taux de conversion des campagnes.</w:t>
       </w:r>
     </w:p>
     <w:p>
@@ -2116,7 +2116,7 @@
           <w:color w:val="1A1A1A"/>
           <w:sz w:val="23"/>
         </w:rPr>
-        <w:t xml:space="preserve"> le contenu genere par IA atteint un niveau de qualite et d'engagement comparable a celui produit par des equipes creatives humaines, des lors qu'il est supervise.</w:t>
+        <w:t xml:space="preserve"> le contenu généré par IA atteint un niveau de qualité et d'engagement comparable à celui produit par des équipes créatives humaines, des lors qu'il est supervise.</w:t>
       </w:r>
     </w:p>
     <w:p>
@@ -2143,7 +2143,7 @@
           <w:color w:val="1A1A1A"/>
           <w:sz w:val="23"/>
         </w:rPr>
-        <w:t xml:space="preserve"> les entreprises integrant l'IA dans leur strategie marketing acquierent un avantage concurrentiel mesurable sur leurs concurrents.</w:t>
+        <w:t xml:space="preserve"> les entreprises integrant l'IA dans leur stratégie marketing acquierent un avantage concurrentiel mesurable sur leurs concurrents.</w:t>
       </w:r>
     </w:p>
     <w:p>
@@ -2174,7 +2174,7 @@
           <w:color w:val="1A1A1A"/>
           <w:sz w:val="24"/>
         </w:rPr>
-        <w:t>Ce rapport poursuit trois objectifs complementaires. Il vise d'abord a dresser un etat de l'art rigoureux des outils et techniques d'IA appliques au marketing digital, en s'appuyant sur la litterature academique et sur les pratiques professionnelles observees sur le terrain. Il cherche ensuite a evaluer, de maniere empirique, l'impact reel de ces outils sur les performances des campagnes menees dans le contexte marocain. Il ambitionne enfin de documenter, a travers le cas Varcadia, les conditions de succes d'une campagne de lancement entierement pilotee par IA generative, afin d'en tirer des enseignements transferables a d'autres projets.</w:t>
+        <w:t>Ce rapport poursuit trois objectifs complémentaires. Il vise d'abord à dresser un état de l'art rigoureux des outils et techniques d'IA appliques au marketing digital, en s'appuyant sur la litterature académique et sur les pratiques professionnelles observées sur le terrain. Il cherche ensuite à evaluer, de manière empirique, l'impact réel de ces outils sur les performances des campagnes menees dans le contexte marocain. Il ambitionne enfin de documenter, à travers le cas Varcadia, les conditions de succes d'une campagne de lancement entièrement pilotee par IA générative, afin d'en tirer des enseignements transferables à d'autres projets.</w:t>
       </w:r>
     </w:p>
     <w:p>
@@ -2189,7 +2189,7 @@
           <w:color w:val="1F4E79"/>
           <w:sz w:val="28"/>
         </w:rPr>
-        <w:t>Methodologie</w:t>
+        <w:t>Méthodologie</w:t>
       </w:r>
     </w:p>
     <w:p>
@@ -2205,7 +2205,7 @@
           <w:color w:val="1A1A1A"/>
           <w:sz w:val="24"/>
         </w:rPr>
-        <w:t>Pour repondre a notre problematique, nous avons adopte une demarche methodologique mixte, combinant une approche quantitative et une approche qualitative. L'approche quantitative s'est appuyee sur un questionnaire administre aupres de professionnels du marketing digital au Maroc, afin de mesurer les niveaux d'adoption de l'IA et les performances percues. L'approche qualitative a repose sur des entretiens semi-directifs menes aupres de decideurs marketing et sur l'analyse detaillee de la campagne Varcadia, conduite par les agences Widma Digitale et Volcano Vision.</w:t>
+        <w:t>Pour répondre à notre problematique, nous avons adopté une démarche méthodologique mixte, combinant une approche quantitative et une approche qualitative. L'approche quantitative s'est appuyee sur un questionnaire administre auprès de professionnels du marketing digital au Maroc, afin de mesurer les niveaux d'adoption de l'IA et les performances perçues. L'approche qualitative à repose sur des entretiens semi-directifs menes auprès de decideurs marketing et sur l'analysé détaillée de la campagne Varcadia, conduite par les agences Widma Digitale et Volcano Vision.</w:t>
       </w:r>
     </w:p>
     <w:p>
@@ -2221,7 +2221,7 @@
           <w:color w:val="1A1A1A"/>
           <w:sz w:val="24"/>
         </w:rPr>
-        <w:t>Les donnees collectees ont ete traitees a l'aide du logiciel SPSS pour les analyses statistiques, et par analyse de contenu thematique pour les donnees qualitatives. Les indicateurs de performance de la campagne Varcadia (nombre de vues, taux d'engagement, cout par vue, affluence a l'ouverture) ont constitue notre principal terrain de validation empirique.</w:t>
+        <w:t>Les donnees collectées ont été traitees à l'aide du logiciel SPSS pour les analyses statistiques, et par analysé de contenu thématique pour les donnees qualitatives. Les indicateurs de performance de la campagne Varcadia (nombre de vues, taux d'engagement, coût par vue, affluence à l'ouverture) ont constitué notre principal terrain de validation empirique.</w:t>
       </w:r>
     </w:p>
     <w:p>
@@ -2252,7 +2252,7 @@
           <w:color w:val="1A1A1A"/>
           <w:sz w:val="24"/>
         </w:rPr>
-        <w:t>Ce rapport est structure en deux parties principales. La premiere partie, theorique et conceptuelle, presente en trois chapitres le cadre de reference dans lequel s'inscrit notre reflexion : l'evolution du marketing digital vers une logique data-driven, l'apport de l'IA dans l'optimisation du ciblage publicitaire, et les nouvelles capacites de generation de contenu offertes par l'IA generative. La seconde partie, empirique et pratique, expose notre methodologie de recherche, les resultats de notre enquete terrain, et la description detaillee de la campagne Varcadia comme validation concrete de nos hypotheses de travail.</w:t>
+        <w:t>Ce rapport est structure en deux parties principales. La première partie, théorique et conceptuelle, présenté en trois chapitres le cadre de référence dans lequel s'inscrit notre réflexion : l'évolution du marketing digital vers une logique data-driven, l'apport de l'IA dans l'optimisation du ciblage publicitaire, et les nouvelles capacités de generation de contenu offertes par l'IA générative. La seconde partie, empirique et pratique, expose notre méthodologie de recherche, les résultats de notre enquête terrain, et la description détaillée de la campagne Varcadia comme validation concrete de nos hypotheses de travail.</w:t>
       </w:r>
     </w:p>
     <w:p>
@@ -2292,7 +2292,7 @@
           <w:color w:val="1A1A1A"/>
           <w:sz w:val="24"/>
         </w:rPr>
-        <w:t>Ce stage de fin d'etudes presente une particularite : il a ete realise dans le cadre d'une collaboration entre deux structures, l'agence 360 Widma Digitale, structure d'accueil principale, et Volcano Vision, agence de communication fondee par l'auteur durant son parcours universitaire. Cette double appartenance a constitue un atout determinant pour mener le projet Varcadia de bout en bout.</w:t>
+        <w:t>Ce stage de fin d'études présenté une particularite : il à été réalisé dans le cadre d'une collaboration entre deux structures, l'agence 360 Widma Digitale, structure d'accueil principale, et Volcano Vision, agence de communication fondée par l'auteur durant son parcours universitaire. Cette double appartenance à constitué un atout déterminant pour mener le projet Varcadia de bout en bout.</w:t>
       </w:r>
     </w:p>
     <w:p>
@@ -2323,7 +2323,7 @@
           <w:color w:val="1A1A1A"/>
           <w:sz w:val="24"/>
         </w:rPr>
-        <w:t>Widma Digitale est une agence de communication dite &lt;&lt; 360 &gt;&gt;, ce qui signifie qu'elle couvre l'ensemble des leviers de communication d'une marque : strategie, creation, production de contenu, community management, achat media et pilotage de campagnes publicitaires digitales. Son positionnement repose sur la capacite a accompagner ses clients sur toute la chaine de valeur, de la reflexion strategique jusqu'a l'execution operationnelle et la mesure des resultats.</w:t>
+        <w:t>Widma Digitale est une agence de communication dite &lt;&lt; 360 &gt;&gt;, ce qui signifie qu'elle couvre l'ensemble des leviers de communication d'une marque : stratégie, creation, production de contenu, community management, achat media et pilotage de campagnes publicitaires digitales. Son positionnement repose sur la capacité à accompagner ses clients sur toute la chaîne de valeur, de la réflexion stratégique jusqu'à l'execution operationnelle et la mesuré des résultats.</w:t>
       </w:r>
     </w:p>
     <w:p>
@@ -2339,7 +2339,7 @@
           <w:color w:val="1A1A1A"/>
           <w:sz w:val="24"/>
         </w:rPr>
-        <w:t>L'agence intervient pour une clientele variee, composee d'entreprises locales et de marques cherchant a renforcer leur presence numerique. Son organisation, structuree autour de poles complementaires (strategie, creation, media), favorise une approche integree des projets, dans laquelle chaque campagne beneficie a la fois d'une vision strategique et d'une execution creative maitrisee.</w:t>
+        <w:t>L'agence intervient pour une clientele variee, composee d'entreprises locales et de marques cherchant à renforcer leur presence numérique. Son organisation, structuree autour de pôles complémentaires (stratégie, creation, media), favorise une approche intégrée des projets, dans laquelle chaque campagne bénéficie à la fois d'une vision stratégique et d'une execution créative maitrisee.</w:t>
       </w:r>
     </w:p>
     <w:p>
@@ -2370,7 +2370,7 @@
           <w:color w:val="1A1A1A"/>
           <w:sz w:val="24"/>
         </w:rPr>
-        <w:t>Volcano Vision est une agence de communication fondee par l'auteur de ce rapport durant ses etudes a l'ENCG. Specialisee dans la production de contenu et l'exploitation des outils d'IA generative, elle s'est positionnee sur un creneau encore peu occupe au Maroc : la creation de contenus video de haute qualite a cout maitrise, grace a une maitrise avancee d'outils tels que Kling AI et Nano Banana Pro. Cette experience entrepreneuriale, menee en parallele du cursus universitaire, a constitue un laboratoire d'apprentissage direct des problematiques abordees dans ce memoire.</w:t>
+        <w:t>Volcano Vision est une agence de communication fondée par l'auteur de ce rapport durant ses études a l'ENCG. Specialisee dans la production de contenu et l'exploitation des outils d'IA générative, elle s'est positionnee sur un creneau encore peu occupe au Maroc : la creation de contenus video de haute qualité à coût maitrise, grâce à une maitrise avancee d'outils tels que Kling AI et Nano Banana Pro. Cette expérience entrepreneuriale, menee en parallele du cursus universitaire, à constitué un laboratoire d'apprentissage direct des problematiques abordees dans ce memoire.</w:t>
       </w:r>
     </w:p>
     <w:p>
@@ -2386,7 +2386,7 @@
           <w:color w:val="1A1A1A"/>
           <w:sz w:val="24"/>
         </w:rPr>
-        <w:t>Diriger une structure entrepreneuriale tout en poursuivant ses etudes a represente un defi exigeant, mais formateur : il a fallu apprendre a gerer la relation client, a respecter des delais de production, a piloter une petite equipe et a assumer la responsabilite finale de la qualite des livrables. Ces competences se sont revelees directement utiles dans la conduite du projet Varcadia.</w:t>
+        <w:t>Diriger une structure entrepreneuriale tout en poursuivant ses études à represente un defi exigeant, mais formateur : il à fallu apprendre à gerer la relation client, à respecter des délais de production, à piloter une petite équipe et à assumer la responsabilite finale de la qualité des livrables. Ces compétences se sont révélées directement utiles dans la conduite du projet Varcadia.</w:t>
       </w:r>
     </w:p>
     <w:p>
@@ -2417,7 +2417,7 @@
           <w:color w:val="1A1A1A"/>
           <w:sz w:val="24"/>
         </w:rPr>
-        <w:t>La collaboration entre les deux agences sur le projet Varcadia a repose sur une repartition claire des roles : Widma Digitale a apporte son expertise strategique, sa connaissance du marche et sa capacite media, tandis que Volcano Vision a pris en charge une part importante de la production de contenu, notamment la creation des sequences generees par IA. Cette complementarite illustre concretement la maniere dont la maitrise de l'IA generative peut devenir un avantage differenciant pour une jeune structure, en lui permettant de collaborer d'egal a egal avec une agence etablie.</w:t>
+        <w:t>La collaboration entre les deux agences sur le projet Varcadia à repose sur une repartition claire des rôles : Widma Digitale à apporte son expertise stratégique, sa connaissance du marché et sa capacité media, tandis que Volcano Vision à pris en charge une part importante de la production de contenu, notamment la creation des sequences générées par IA. Cette complémentarité illustre concretement la manière dont la maitrise de l'IA générative peut devenir un avantage différenciant pour une jeune structure, en lui permettant de collaborer d'egal à egal avec une agence etablie.</w:t>
       </w:r>
     </w:p>
     <w:p>
@@ -2448,7 +2448,7 @@
           <w:color w:val="1A1A1A"/>
           <w:sz w:val="24"/>
         </w:rPr>
-        <w:t>Au cours de ce stage, les principales missions confiees a l'auteur ont ete les suivantes :</w:t>
+        <w:t>Au cours de ce stage, les principales missions confiees à l'auteur ont été les suivantes :</w:t>
       </w:r>
     </w:p>
     <w:p>
@@ -2465,7 +2465,7 @@
           <w:color w:val="1A1A1A"/>
           <w:sz w:val="23"/>
         </w:rPr>
-        <w:t>Participer a l'elaboration de la strategie de lancement de Varcadia.</w:t>
+        <w:t>Participer à l'élaboration de la stratégie de lancement de Varcadia.</w:t>
       </w:r>
     </w:p>
     <w:p>
@@ -2482,7 +2482,7 @@
           <w:color w:val="1A1A1A"/>
           <w:sz w:val="23"/>
         </w:rPr>
-        <w:t>Concevoir et rediger les scenarios des deux videos de la campagne.</w:t>
+        <w:t>Concevoir et rédiger les scenarios des deux videos de la campagne.</w:t>
       </w:r>
     </w:p>
     <w:p>
@@ -2499,7 +2499,7 @@
           <w:color w:val="1A1A1A"/>
           <w:sz w:val="23"/>
         </w:rPr>
-        <w:t>Produire les sequences generees par IA (Kling AI) et assurer le montage (Nano Banana Pro).</w:t>
+        <w:t>Produire les sequences générées par IA (Kling AI) et assurer le montage (Nano Banana Pro).</w:t>
       </w:r>
     </w:p>
     <w:p>
@@ -2574,7 +2574,7 @@
           <w:color w:val="2E75B6"/>
           <w:sz w:val="36"/>
         </w:rPr>
-        <w:t>Cadre Theorique et Conceptuel</w:t>
+        <w:t>Cadre Théorique et Conceptuel</w:t>
       </w:r>
     </w:p>
     <w:p>
@@ -2609,7 +2609,7 @@
           <w:color w:val="1F4E79"/>
           <w:sz w:val="36"/>
         </w:rPr>
-        <w:t>Le Marketing Digital a l'Ere de l'Intelligence Artificielle</w:t>
+        <w:t>Le Marketing Digital à l'Ere de l'Intelligence Artificielle</w:t>
       </w:r>
     </w:p>
     <w:p>
@@ -2624,7 +2624,7 @@
           <w:color w:val="1F4E79"/>
           <w:sz w:val="28"/>
         </w:rPr>
-        <w:t>1.1  Evolution du marketing digital : du marketing traditionnel au marketing data-driven</w:t>
+        <w:t>1.1  Évolution du marketing digital : du marketing traditionnel au marketing data-driven</w:t>
       </w:r>
     </w:p>
     <w:p>
@@ -2640,7 +2640,7 @@
           <w:color w:val="1A1A1A"/>
           <w:sz w:val="24"/>
         </w:rPr>
-        <w:t>Le marketing a traverse, en l'espace de trois decennies, une mutation sans precedent dans son histoire. Les dispositifs classiques de communication commerciale, fondes sur des medias de masse tels que la television, la radio, la presse ecrite ou l'affichage publicitaire, reposaient sur une logique unidirectionnelle : la marque emettait un message uniforme vers une audience large et peu differenciee, sans possibilite reelle d'interaction ni de mesure precise des retombees. La performance d'une campagne se jugeait alors a l'estime, sur la base d'indicateurs indirects comme la notoriete declaree ou l'evolution globale des ventes.</w:t>
+        <w:t>Le marketing à traverse, en l'espace de trois décennies, une mutation sans precedent dans son histoire. Les dispositifs classiques de communication commerciale, fondés sur des medias de masse tels que la television, la radio, la presse écrite où l'affichage publicitaire, reposaient sur une logique unidirectionnelle : la marque emettait un message uniforme vers une audience large et peu differenciee, sans possibilite réelle d'interaction ni de mesuré precise des retombees. La performance d'une campagne se jugeait alors à l'estime, sur la basé d'indicateurs indirects comme la notoriété déclarée où l'évolution globale des ventes.</w:t>
       </w:r>
     </w:p>
     <w:p>
@@ -2656,7 +2656,7 @@
           <w:color w:val="1A1A1A"/>
           <w:sz w:val="24"/>
         </w:rPr>
-        <w:t>L'avenement d'Internet, puis la generalisation du Web 2.0 et des plateformes sociales, ont profondement reconfigure ces pratiques. Les marques ont progressivement decouvert la possibilite de communiquer de facon interactive, de segmenter leurs audiences avec precision et de mesurer en temps reel l'impact de chaque action marketing. Chaque clic, chaque vue, chaque seconde de visionnage est devenue une donnee exploitable. C'est dans ce contexte qu'est nee la notion de marketing data-driven, qui place la donnee au centre des decisions strategiques et operationnelles.</w:t>
+        <w:t>L'avenement d'Internet, puis la generalisation du Web 2.0 et des plateformes sociales, ont profondement reconfigure ces pratiques. Les marques ont progressivement decouvert la possibilite de communiquer de façon interactive, de segmenter leurs audiences avec precision et de mesurer en temps réel l'impact de chaque action marketing. Chaque clic, chaque vue, chaque seconde de visionnage est devenue une donnee exploitable. C'est dans ce contexte qu'est nee la notion de marketing data-driven, qui place la donnee au centre des décisions stratégiques et operationnelles.</w:t>
       </w:r>
     </w:p>
     <w:p>
@@ -2672,7 +2672,7 @@
           <w:color w:val="1A1A1A"/>
           <w:sz w:val="24"/>
         </w:rPr>
-        <w:t>Selon Kotler et al. (2021), le passage au marketing data-driven represente une rupture epistemologique majeure : il ne s'agit plus de concevoir des campagnes sur la base de l'intuition ou de l'experience accumulee, mais de laisser les donnees guider chaque decision, de la conception du message a l'optimisation du budget en passant par le choix des canaux de diffusion. Le marketeur cesse d'etre un simple emetteur de messages pour devenir un pilote de systemes apprenants.</w:t>
+        <w:t>Selon Kotler et al. (2021), le passage au marketing data-driven represente une rupture épistémologique majeure : il ne s'agit plus de concevoir des campagnes sur la basé de l'intuition où de l'expérience accumulee, mais de laisser les donnees guider chaque décision, de la conception du message a l'optimisation du budget en passant par le choix des canaux de diffusion. Le marketeur cesse d'être un simple emetteur de messages pour devenir un pilote de systèmes apprenants.</w:t>
       </w:r>
     </w:p>
     <w:p>
@@ -2688,7 +2688,7 @@
           <w:color w:val="1A1A1A"/>
           <w:sz w:val="24"/>
         </w:rPr>
-        <w:t>L'intelligence artificielle constitue aujourd'hui le principal moteur de cette approche. Elle permet d'analyser en temps reel des volumes de donnees que nul analyste humain ne pourrait traiter dans les memes delais, d'identifier des correlations non apparentes et de produire des recommandations actionnables qui ameliorent en continu les performances des campagnes. Le tableau ci-dessous synthetise les ruptures introduites par ce basculement.</w:t>
+        <w:t>L'intelligence artificielle constitué aujourd'hui le principal moteur de cette approche. Elle permet d'analyser en temps réel des volumes de donnees que nul analyste humain ne pourrait traiter dans les mêmes délais, d'identifier des corrélations non apparentes et de produire des recommandations actionnables qui ameliorent en continu les performances des campagnes. Le tableau ci-dessous synthetise les ruptures introduites par ce basculement.</w:t>
       </w:r>
     </w:p>
     <w:p>
@@ -2891,7 +2891,7 @@
                 <w:color w:val="1A1A1A"/>
                 <w:sz w:val="21"/>
               </w:rPr>
-              <w:t>Quelques criteres statiques</w:t>
+              <w:t>Quelques critères statiques</w:t>
             </w:r>
           </w:p>
         </w:tc>
@@ -2935,7 +2935,7 @@
                 <w:color w:val="1A1A1A"/>
                 <w:sz w:val="21"/>
               </w:rPr>
-              <w:t>Decision</w:t>
+              <w:t>Décision</w:t>
             </w:r>
           </w:p>
         </w:tc>
@@ -2956,7 +2956,7 @@
                 <w:color w:val="1A1A1A"/>
                 <w:sz w:val="21"/>
               </w:rPr>
-              <w:t>Intuition et experience</w:t>
+              <w:t>Intuition et expérience</w:t>
             </w:r>
           </w:p>
         </w:tc>
@@ -2977,7 +2977,7 @@
                 <w:color w:val="1A1A1A"/>
                 <w:sz w:val="21"/>
               </w:rPr>
-              <w:t>Donnees et modeles predictifs</w:t>
+              <w:t>Donnees et modèles predictifs</w:t>
             </w:r>
           </w:p>
         </w:tc>
@@ -3000,7 +3000,7 @@
                 <w:color w:val="1A1A1A"/>
                 <w:sz w:val="21"/>
               </w:rPr>
-              <w:t>Mesure</w:t>
+              <w:t>Mesuré</w:t>
             </w:r>
           </w:p>
         </w:tc>
@@ -3021,7 +3021,7 @@
                 <w:color w:val="1A1A1A"/>
                 <w:sz w:val="21"/>
               </w:rPr>
-              <w:t>Indirecte, differee</w:t>
+              <w:t>Indirecte, différée</w:t>
             </w:r>
           </w:p>
         </w:tc>
@@ -3042,7 +3042,7 @@
                 <w:color w:val="1A1A1A"/>
                 <w:sz w:val="21"/>
               </w:rPr>
-              <w:t>Directe, en temps reel</w:t>
+              <w:t>Directe, en temps réel</w:t>
             </w:r>
           </w:p>
         </w:tc>
@@ -3130,7 +3130,7 @@
                 <w:color w:val="1A1A1A"/>
                 <w:sz w:val="21"/>
               </w:rPr>
-              <w:t>Cout de production</w:t>
+              <w:t>Coût de production</w:t>
             </w:r>
           </w:p>
         </w:tc>
@@ -3172,7 +3172,7 @@
                 <w:color w:val="1A1A1A"/>
                 <w:sz w:val="21"/>
               </w:rPr>
-              <w:t>Reduit, scalable</w:t>
+              <w:t>Réduit, scalable</w:t>
             </w:r>
           </w:p>
         </w:tc>
@@ -3211,7 +3211,7 @@
           <w:color w:val="1A1A1A"/>
           <w:sz w:val="24"/>
         </w:rPr>
-        <w:t>L'intelligence artificielle peut etre definie comme l'ensemble des techniques et des systemes permettant a une machine de simuler des capacites cognitives caracteristiques de l'intelligence humaine, telles que l'apprentissage, le raisonnement, la comprehension du langage ou la reconnaissance visuelle. Appliquee au marketing, elle recouvre un spectre de technologies aux niveaux de complexite et aux modalites d'application tres varies. Il serait reducteur de parler de l'IA au singulier : il s'agit plutot d'une famille de technologies dont chacune repond a des besoins specifiques.</w:t>
+        <w:t>L'intelligence artificielle peut être définie comme l'ensemble des techniques et des systèmes permettant à une machine de simuler des capacités cognitives caracteristiques de l'intelligence humaine, telles que l'apprentissage, le raisonnement, la compréhension du langage où la reconnaissance visuelle. Appliquee au marketing, elle recouvre un spectre de technologies aux niveaux de complexité et aux modalites d'application très varies. Il serait reducteur de parler de l'IA au singulier : il s'agit plutôt d'une famille de technologies dont chacune repond à des besoins spécifiques.</w:t>
       </w:r>
     </w:p>
     <w:p>
@@ -3242,7 +3242,7 @@
           <w:color w:val="1A1A1A"/>
           <w:sz w:val="24"/>
         </w:rPr>
-        <w:t>Le Machine Learning, ou apprentissage automatique, constitue le fondement de la plupart des applications d'IA marketing actuelles. Il regroupe des algorithmes capables d'apprendre a partir de donnees historiques et d'ajuster leurs predictions sans intervention humaine explicite. Dans le domaine publicitaire, ces algorithmes optimisent les encheres en temps reel, predisent la probabilite de conversion de chaque utilisateur et personnalisent l'experience publicitaire a grande echelle. C'est cette famille d'algorithmes qui anime, en arriere-plan, les systemes d'encheres de YouTube Ads et de Meta Ads.</w:t>
+        <w:t>Le Machine Learning, où apprentissage automatique, constitué le fondement de la plupart des applications d'IA marketing actuelles. Il regroupe des algorithmes capables d'apprendre à partir de donnees historiques et d'ajuster leurs predictions sans intervention humaine explicite. Dans le domaine publicitaire, ces algorithmes optimisent les encheres en temps réel, predisent la probabilite de conversion de chaque utilisateur et personnalisent l'expérience publicitaire à grande échelle. C'est cette famille d'algorithmes qui anime, en arriere-plan, les systèmes d'encheres de YouTube Ads et de Meta Ads.</w:t>
       </w:r>
     </w:p>
     <w:p>
@@ -3273,7 +3273,7 @@
           <w:color w:val="1A1A1A"/>
           <w:sz w:val="24"/>
         </w:rPr>
-        <w:t>Le traitement automatique du langage naturel permet aux machines de comprendre, d'analyser et de produire du texte en langage humain. Ses applications marketing incluent l'analyse semantique des avis clients, la generation automatique de contenus redactionnels et la creation de chatbots conversationnels capables de repondre aux questions des consommateurs en temps reel. Les grands modeles de langage (LLM) ont fait franchir un seuil qualitatif decisif a cette categorie.</w:t>
+        <w:t>Le traitement automatique du langage naturel permet aux machines de comprendre, d'analyser et de produire du texte en langage humain. Ses applications marketing incluent l'analysé sémantique des avis clients, la generation automatique de contenus rédactionnels et la creation de chatbots conversationnels capables de répondre aux questions des consommateurs en temps réel. Les grands modèles de langage (LLM) ont fait franchir un seuil qualitatif decisif à cette catégorie.</w:t>
       </w:r>
     </w:p>
     <w:p>
@@ -3304,7 +3304,7 @@
           <w:color w:val="1A1A1A"/>
           <w:sz w:val="24"/>
         </w:rPr>
-        <w:t>La vision par ordinateur permet aux systemes d'IA d'analyser et d'interpreter des images et des videos. En marketing, cette technologie intervient dans la reconnaissance de produits dans des contenus publies sur les reseaux sociaux, dans la moderation automatique de contenus visuels et dans la generation d'images publicitaires. Elle est egalement au coeur des outils de generation video que nous avons mobilises pour la campagne Varcadia.</w:t>
+        <w:t>La vision par ordinateur permet aux systèmes d'IA d'analyser et d'interpreter des images et des videos. En marketing, cette technologie intervient dans la reconnaissance de produits dans des contenus publies sur les réseaux sociaux, dans la moderation automatique de contenus visuels et dans la generation d'images publicitaires. Elle est egalement au coeur des outils de generation video que nous avons mobilises pour la campagne Varcadia.</w:t>
       </w:r>
     </w:p>
     <w:p>
@@ -3319,7 +3319,7 @@
           <w:color w:val="2E75B6"/>
           <w:sz w:val="25"/>
         </w:rPr>
-        <w:t>1.2.4  L'IA generative</w:t>
+        <w:t>1.2.4  L'IA générative</w:t>
       </w:r>
     </w:p>
     <w:p>
@@ -3335,7 +3335,7 @@
           <w:color w:val="1A1A1A"/>
           <w:sz w:val="24"/>
         </w:rPr>
-        <w:t>L'IA generative represente la tendance la plus recente et la plus structurante pour le secteur. Elle designe les systemes capables de creer du contenu original, qu'il s'agisse de texte, d'image, d'audio ou de video, a partir d'instructions formulees en langage naturel. Des outils comme Kling AI ou Nano Banana Pro illustrent cette categorie, et c'est precisement a travers leur utilisation que nous avons conduit la campagne Varcadia. Leur particularite est de deplacer le travail humain de l'execution vers la conception : on ne produit plus l'image, on decrit l'image que l'on souhaite obtenir.</w:t>
+        <w:t>L'IA générative represente la tendance la plus récente et la plus structurante pour le secteur. Elle désigne les systèmes capables de créer du contenu original, qu'il s'agisse de texte, d'image, d'audio où de video, à partir d'instructions formulees en langage naturel. Des outils comme Kling AI où Nano Banana Pro illustrent cette catégorie, et c'est precisement à travers leur utilisation que nous avons conduit la campagne Varcadia. Leur particularite est de déplacer le travail humain de l'execution vers la conception : on ne produit plus l'image, on décrit l'image que l'on souhaite obtenir.</w:t>
       </w:r>
     </w:p>
     <w:p>
@@ -3366,7 +3366,7 @@
           <w:color w:val="1A1A1A"/>
           <w:sz w:val="24"/>
         </w:rPr>
-        <w:t>Le panorama des outils d'IA appliques au marketing digital est vaste et en evolution permanente. Pour les besoins de ce travail, nous les regroupons en quatre grandes categories fonctionnelles, presentees dans le tableau suivant.</w:t>
+        <w:t>Le panorama des outils d'IA appliques au marketing digital est vaste et en évolution permanente. Pour les besoins de ce travail, nous les regroupons en quatre grandes catégories fonctionnelles, présentées dans le tableau suivant.</w:t>
       </w:r>
     </w:p>
     <w:p>
@@ -3416,7 +3416,7 @@
                 <w:color w:val="FFFFFF"/>
                 <w:sz w:val="21"/>
               </w:rPr>
-              <w:t>Categorie</w:t>
+              <w:t>Catégorie</w:t>
             </w:r>
           </w:p>
         </w:tc>
@@ -3678,7 +3678,7 @@
                 <w:color w:val="1A1A1A"/>
                 <w:sz w:val="21"/>
               </w:rPr>
-              <w:t>Edition / montage</w:t>
+              <w:t>Édition / montage</w:t>
             </w:r>
           </w:p>
         </w:tc>
@@ -3809,7 +3809,7 @@
           <w:color w:val="1A1A1A"/>
           <w:sz w:val="24"/>
         </w:rPr>
-        <w:t>Les outils de generation et d'optimisation textuelle permettent de produire des copies publicitaires, des scripts video, des objets d'e-mail ou des publications sur les reseaux sociaux. Ils reposent sur des modeles de langage de grande taille et peuvent generer des contenus adaptes a des tons, des cibles et des formats specifiques, en quelques secondes.</w:t>
+        <w:t>Les outils de generation et d'optimisation textuelle permettent de produire des copies publicitaires, des scripts video, des objets d'e-mail où des publications sur les réseaux sociaux. Ils reposent sur des modèles de langage de grande taille et peuvent generer des contenus adaptes à des tons, des cibles et des formats spécifiques, en quelques secondes.</w:t>
       </w:r>
     </w:p>
     <w:p>
@@ -3825,7 +3825,7 @@
           <w:color w:val="1A1A1A"/>
           <w:sz w:val="24"/>
         </w:rPr>
-        <w:t>Les outils de generation visuelle permettent de creer des images publicitaires de haute qualite a partir de descriptions textuelles. Le niveau de realisme atteint par les derniers modeles est tel que les visuels generes sont desormais largement utilises dans des campagnes commerciales reelles, y compris par de grandes marques. Les outils de generation video, eux, representent la categorie la plus recemment accessible au grand public : Kling AI, developpe par Kuaishou Technology, permet de generer des sequences video fluides et coherentes a partir de textes ou d'images de reference. Nano Banana Pro offre quant a lui des fonctionnalites d'edition et de generation particulierement adaptees a la production de contenus courts formats pour les reseaux sociaux.</w:t>
+        <w:t>Les outils de generation visuelle permettent de créer des images publicitaires de haute qualité a partir de descriptions textuelles. Le niveau de realisme atteint par les derniers modèles est tel que les visuels générés sont désormais largement utilises dans des campagnes commerciales réelles, y compris par de grandes marques. Les outils de generation video, eux, representent la catégorie la plus recemment accessible au grand public : Kling AI, développé par Kuaishou Technology, permet de generer des sequences video fluides et cohérentes à partir de textes où d'images de référence. Nano Banana Pro offre quant à lui des fonctionnalites d'édition et de generation particulièrement adaptees à la production de contenus courts formats pour les réseaux sociaux.</w:t>
       </w:r>
     </w:p>
     <w:p>
@@ -3840,7 +3840,7 @@
           <w:color w:val="1F4E79"/>
           <w:sz w:val="28"/>
         </w:rPr>
-        <w:t>1.4  Etat de l'adoption de l'IA dans les strategies marketing au Maroc</w:t>
+        <w:t>1.4  État de l'adoption de l'IA dans les stratégies marketing au Maroc</w:t>
       </w:r>
     </w:p>
     <w:p>
@@ -3856,7 +3856,7 @@
           <w:color w:val="1A1A1A"/>
           <w:sz w:val="24"/>
         </w:rPr>
-        <w:t>A l'echelle mondiale, l'adoption de l'IA dans les strategies marketing a franchi un seuil decisif. Selon les donnees recentes du secteur, une large majorite des directions marketing de grandes entreprises declarent avoir integre au moins un outil d'IA dans leurs pratiques, et les projections de croissance du marche mondial de l'IA marketing sont particulierement elevees pour les cinq prochaines annees.</w:t>
+        <w:t>À l'échelle mondiale, l'adoption de l'IA dans les stratégies marketing à franchi un seuil decisif. Selon les donnees récentes du secteur, une large majorite des directions marketing de grandes entreprises déclarent avoir intégré au moins un outil d'IA dans leurs pratiques, et les projections de croissance du marché mondial de l'IA marketing sont particulièrement elevees pour les cinq prochaines années.</w:t>
       </w:r>
     </w:p>
     <w:p>
@@ -3872,7 +3872,7 @@
           <w:color w:val="1A1A1A"/>
           <w:sz w:val="24"/>
         </w:rPr>
-        <w:t>Au Maroc, le contexte est celui d'un marche digital en forte croissance. Le taux de penetration d'Internet depasse 70% de la population, et les plateformes sociales comptent plusieurs dizaines de millions d'utilisateurs actifs. Les entreprises marocaines, notamment dans les secteurs du commerce, du tourisme, des services et des loisirs, commencent a integrer des outils d'IA dans leurs pratiques marketing, meme si cette adoption reste plus progressive que dans les marches europeens ou nord-americains. Cette progressivite s'explique autant par des freins de competences que par une certaine prudence culturelle face a des technologies encore percues comme experimentales.</w:t>
+        <w:t>Au Maroc, le contexte est celui d'un marché digital en forte croissance. Le taux de penetration d'Internet dépassé 70% de la population, et les plateformes sociales comptent plusieurs dizaines de millions d'utilisateurs actifs. Les entreprises marocaines, notamment dans les secteurs du commerce, du tourisme, des services et des loisirs, commencent à integrer des outils d'IA dans leurs pratiques marketing, même si cette adoption reste plus progressive que dans les marchés europeens ou nord-americains. Cette progressivite s'explique autant par des freins de compétences que par une certaine prudence culturelle face à des technologies encore perçues comme experimentales.</w:t>
       </w:r>
     </w:p>
     <w:p>
@@ -3888,7 +3888,7 @@
           <w:color w:val="1A1A1A"/>
           <w:sz w:val="24"/>
         </w:rPr>
-        <w:t>C'est dans ce contexte que des agences specialisees comme Widma Digitale et des structures emergentes comme Volcano Vision jouent un role de facilitateur essentiel. En mettant ces technologies avancees a la portee de clients locaux qui n'auraient pas, seuls, les ressources ou les competences pour les exploiter, elles contribuent a accelerer la diffusion de l'innovation marketing au Maroc. La campagne Varcadia, decrite dans la seconde partie de ce rapport, illustre concretement ce role de passeur technologique.</w:t>
+        <w:t>C'est dans ce contexte que des agences specialisees comme Widma Digitale et des structures emergentes comme Volcano Vision jouent un rôle de facilitateur essentiel. En mettant ces technologies avancees a la portee de clients locaux qui n'auraient pas, seuls, les ressources où les compétences pour les exploiter, elles contribuent à accélérer la diffusion de l'innovation marketing au Maroc. La campagne Varcadia, décrite dans la seconde partie de ce rapport, illustre concretement ce rôle de passeur technologique.</w:t>
       </w:r>
     </w:p>
     <w:p>
@@ -3906,7 +3906,7 @@
           <w:color w:val="595959"/>
           <w:sz w:val="18"/>
         </w:rPr>
-        <w:t>Notes et references</w:t>
+        <w:t>Notes et références</w:t>
       </w:r>
     </w:p>
     <w:p>
@@ -3936,7 +3936,7 @@
           <w:color w:val="595959"/>
           <w:sz w:val="18"/>
         </w:rPr>
-        <w:t>2. Russell, S., &amp; Norvig, P. (2020). Artificial Intelligence: A Modern Approach (4e ed.). Pearson.</w:t>
+        <w:t>2. Russell, S., &amp; Norvig, P. (2020). Artificial Intelligence: À Modern Approach (4e ed.). Pearson.</w:t>
       </w:r>
     </w:p>
     <w:p>
@@ -3951,7 +3951,7 @@
           <w:color w:val="595959"/>
           <w:sz w:val="18"/>
         </w:rPr>
-        <w:t>3. Kuaishou Technology (2024). Kling AI : Generative Video Platform. Documentation officielle.</w:t>
+        <w:t>3. Kuaishou Technology (2024). Kling AI : Générative Video Platform. Documentation officielle.</w:t>
       </w:r>
     </w:p>
     <w:p>
@@ -3966,7 +3966,7 @@
           <w:color w:val="595959"/>
           <w:sz w:val="18"/>
         </w:rPr>
-        <w:t>4. ANRT (2024). Tableau de bord du marche des telecommunications au Maroc.</w:t>
+        <w:t>4. ANRT (2024). Tableau de bord du marché des telecommunications au Maroc.</w:t>
       </w:r>
     </w:p>
     <w:p>
@@ -4032,7 +4032,7 @@
           <w:color w:val="1A1A1A"/>
           <w:sz w:val="24"/>
         </w:rPr>
-        <w:t>Le ciblage publicitaire constitue l'un des leviers les plus determinants de l'efficacite d'une campagne marketing. Il designe l'ensemble des mecanismes permettant d'identifier et d'atteindre, parmi une population donnee, les individus les plus susceptibles d'etre receptifs a un message particulier et de realiser l'action souhaitee par l'annonceur. Un ciblage precis evite la dispersion du budget sur des audiences indifferentes et concentre l'investissement la ou il produit le plus de valeur.</w:t>
+        <w:t>Le ciblage publicitaire constitué l'un des leviers les plus determinants de l'efficacité d'une campagne marketing. Il désigne l'ensemble des mecanismes permettant d'identifier et d'atteindre, parmi une population donnee, les individus les plus susceptibles d'être receptifs à un message particulier et de realiser l'action souhaitee par l'annonceur. Un ciblage precis evite la dispersion du budget sur des audiences indifferentes et concentré l'investissement la où il produit le plus de valeur.</w:t>
       </w:r>
     </w:p>
     <w:p>
@@ -4048,7 +4048,7 @@
           <w:color w:val="1A1A1A"/>
           <w:sz w:val="24"/>
         </w:rPr>
-        <w:t>Le ciblage demographique repose sur des criteres factuels tels que l'age, le sexe, la localisation geographique, le niveau d'etudes ou la categorie socioprofessionnelle. Simple a mettre en oeuvre, il offre une couverture large mais une precision limitee. Dans le cadre de la campagne Varcadia, ce premier niveau de ciblage a ete fondamental : nous visions les familles avec enfants en bas age, les jeunes entre 15 et 30 ans, et les habitants de la region de Casablanca-Settat, avec une priorite donnee a Soualem et a ses communes limitrophes.</w:t>
+        <w:t>Le ciblage démographique repose sur des critères factuels tels que l'âge, le sexe, la localisation geographique, le niveau d'études où la catégorie socioprofessionnelle. Simple à mettre en oeuvre, il offre une couverture large mais une precision limitee. Dans le cadre de la campagne Varcadia, ce premier niveau de ciblage à été fondamental : nous visions les familles avec enfants en bas âge, les jeunes entre 15 et 30 ans, et les habitants de la région de Casablanca-Settat, avec une priorite donnee à Soualem et à ses communes limitrophes.</w:t>
       </w:r>
     </w:p>
     <w:p>
@@ -4064,7 +4064,7 @@
           <w:color w:val="1A1A1A"/>
           <w:sz w:val="24"/>
         </w:rPr>
-        <w:t>Le ciblage comportemental exploite les donnees generees par les activites en ligne des utilisateurs : pages visitees, videos regardees, produits consultes, temps passe sur differents types de contenus. Ces donnees comportementales, collectees et interpretees par les algorithmes des plateformes publicitaires, permettent de construire des profils d'intention d'achat et d'adresser des messages a des individus dont le comportement recent indique un interet pour l'offre promue.</w:t>
+        <w:t>Le ciblage comportemental exploite les donnees générées par les activités en ligne des utilisateurs : pages visitees, videos regardees, produits consultes, temps passe sur différents types de contenus. Ces donnees comportementales, collectées et interpretees par les algorithmes des plateformes publicitaires, permettent de construire des profils d'intention d'achat et d'adresser des messages a des individus dont le comportement récent indique un intérêt pour l'offre promue.</w:t>
       </w:r>
     </w:p>
     <w:p>
@@ -4080,7 +4080,7 @@
           <w:color w:val="1A1A1A"/>
           <w:sz w:val="24"/>
         </w:rPr>
-        <w:t>Le reciblage, ou retargeting, permet de recontacter des utilisateurs ayant deja interagi avec la marque. Applique a la campagne Varcadia, cette technique a ete utilisee dans la phase de devoilement pour retoucher les audiences ayant visionne le teaser mais n'ayant pas encore effectue d'action de conversion. Le tableau ci-dessous recapitule les niveaux de ciblage et leur usage concret dans la campagne.</w:t>
+        <w:t>Le reciblage, où retargeting, permet de recontacter des utilisateurs ayant déjà interagi avec la marque. Applique à la campagne Varcadia, cette technique à été utilisee dans la phase de dévoilement pour retoucher les audiences ayant visionne le teaser mais n'ayant pas encore effectué d'action de conversion. Le tableau ci-dessous recapitule les niveaux de ciblage et leur usage concret dans la campagne.</w:t>
       </w:r>
     </w:p>
     <w:p>
@@ -4096,7 +4096,7 @@
           <w:color w:val="1F4E79"/>
           <w:sz w:val="20"/>
         </w:rPr>
-        <w:t>Tableau 2.1 - Strategie de ciblage de la campagne Varcadia</w:t>
+        <w:t>Tableau 2.1 - Stratégie de ciblage de la campagne Varcadia</w:t>
       </w:r>
     </w:p>
     <w:tbl>
@@ -4197,7 +4197,7 @@
                 <w:color w:val="1A1A1A"/>
                 <w:sz w:val="21"/>
               </w:rPr>
-              <w:t>Demographique</w:t>
+              <w:t>Démographique</w:t>
             </w:r>
           </w:p>
         </w:tc>
@@ -4218,7 +4218,7 @@
                 <w:color w:val="1A1A1A"/>
                 <w:sz w:val="21"/>
               </w:rPr>
-              <w:t>Age, sexe, localisation</w:t>
+              <w:t>Âge, sexe, localisation</w:t>
             </w:r>
           </w:p>
         </w:tc>
@@ -4239,7 +4239,7 @@
                 <w:color w:val="1A1A1A"/>
                 <w:sz w:val="21"/>
               </w:rPr>
-              <w:t>Familles 25-45 ans, jeunes 15-30 ans, region CS</w:t>
+              <w:t>Familles 25-45 ans, jeunes 15-30 ans, région CS</w:t>
             </w:r>
           </w:p>
         </w:tc>
@@ -4348,7 +4348,7 @@
                 <w:color w:val="1A1A1A"/>
                 <w:sz w:val="21"/>
               </w:rPr>
-              <w:t>Centres d'interet, intentions</w:t>
+              <w:t>Centres d'intérêt, intentions</w:t>
             </w:r>
           </w:p>
         </w:tc>
@@ -4434,7 +4434,7 @@
                 <w:color w:val="1A1A1A"/>
                 <w:sz w:val="21"/>
               </w:rPr>
-              <w:t>Extension a partir des premiers spectateurs</w:t>
+              <w:t>Extension à partir des premiers spectateurs</w:t>
             </w:r>
           </w:p>
         </w:tc>
@@ -4522,7 +4522,7 @@
           <w:color w:val="1F4E79"/>
           <w:sz w:val="28"/>
         </w:rPr>
-        <w:t>2.2  L'apport de l'IA dans l'analyse des donnees et la segmentation</w:t>
+        <w:t>2.2  L'apport de l'IA dans l'analysé des donnees et la segmentation</w:t>
       </w:r>
     </w:p>
     <w:p>
@@ -4538,7 +4538,7 @@
           <w:color w:val="1A1A1A"/>
           <w:sz w:val="24"/>
         </w:rPr>
-        <w:t>L'intelligence artificielle a fondamentalement transforme les capacites de segmentation des audiences. La ou les approches manuelles reposaient sur un nombre limite de criteres statiques, les algorithmes de Machine Learning permettent de traiter simultanement des milliers de variables et d'identifier des micro-segments d'une granularite inedite. Cette finesse de segmentation autorise des messages plus pertinents et, par consequent, un meilleur retour sur investissement.</w:t>
+        <w:t>L'intelligence artificielle à fondamentalement transforme les capacités de segmentation des audiences. La où les approches manuelles reposaient sur un nombre limite de critères statiques, les algorithmes de Machine Learning permettent de traiter simultanement des milliers de variables et d'identifier des micro-segments d'une granularite inedite. Cette finesse de segmentation autorise des messages plus pertinents et, par consequent, un meilleur retour sur investissement.</w:t>
       </w:r>
     </w:p>
     <w:p>
@@ -4554,7 +4554,7 @@
           <w:color w:val="1A1A1A"/>
           <w:sz w:val="24"/>
         </w:rPr>
-        <w:t>Les modeles predictifs estiment la probabilite qu'un utilisateur realise une action souhaitee (achat, visite, inscription) en croisant ses caracteristiques demographiques avec ses comportements passes et le contexte de navigation. Cette approche predictive permet aux equipes marketing d'allouer leurs budgets de facon beaucoup plus efficiente, en concentrant les investissements sur les segments presentant le meilleur potentiel de conversion.</w:t>
+        <w:t>Les modèles predictifs estiment la probabilite qu'un utilisateur réalisé une action souhaitee (achat, visite, inscription) en croisant ses caracteristiques démographiques avec ses comportements passes et le contexte de navigation. Cette approche predictive permet aux équipes marketing d'allouer leurs budgets de façon beaucoup plus efficiente, en concentrant les investissements sur les segments presentant le meilleur potentiel de conversion.</w:t>
       </w:r>
     </w:p>
     <w:p>
@@ -4570,7 +4570,7 @@
           <w:color w:val="1A1A1A"/>
           <w:sz w:val="24"/>
         </w:rPr>
-        <w:t>Les algorithmes de clustering non supervise permettent quant a eux d'identifier automatiquement des groupes d'utilisateurs partageant des comportements similaires, sans que ces groupes aient ete definis a priori. Cette capacite a faire emerger des segments inattendus peut reveler des opportunites de ciblage que l'analyse humaine n'aurait pas identifiees. Lors de la campagne Varcadia, l'algorithme de Meta a ainsi etendu spontanement la diffusion vers des segments de jeunes adultes sans enfants, initialement secondaires dans notre plan, mais qui se sont reveles fortement engages.</w:t>
+        <w:t>Les algorithmes de clustering non supervise permettent quant à eux d'identifier automatiquement des groupes d'utilisateurs partageant des comportements similaires, sans que ces groupes aient été definis à priori. Cette capacité à faire émerger des segments inattendus peut révéler des opportunites de ciblage que l'analysé humaine n'aurait pas identifiées. Lors de la campagne Varcadia, l'algorithme de Meta à ainsi etendu spontanement la diffusion vers des segments de jeunes adultes sans enfants, initialement secondaires dans notre plan, mais qui se sont reveles fortement engages.</w:t>
       </w:r>
     </w:p>
     <w:p>
@@ -4585,7 +4585,7 @@
           <w:color w:val="1F4E79"/>
           <w:sz w:val="28"/>
         </w:rPr>
-        <w:t>2.3  Personnalisation dynamique et recommandation en temps reel</w:t>
+        <w:t>2.3  Personnalisation dynamique et recommandation en temps réel</w:t>
       </w:r>
     </w:p>
     <w:p>
@@ -4601,7 +4601,7 @@
           <w:color w:val="1A1A1A"/>
           <w:sz w:val="24"/>
         </w:rPr>
-        <w:t>La personnalisation dynamique designe la capacite d'adapter, en temps reel, le contenu d'une communication publicitaire en fonction du contexte immediat de l'utilisateur : l'heure de la journee, sa localisation, l'appareil qu'il utilise, son comportement de navigation recent ou son stade dans le tunnel d'achat. Cette approche permet d'atteindre un niveau de pertinence publicitaire nettement superieur a celui des campagnes statiques.</w:t>
+        <w:t>La personnalisation dynamique désigne la capacité d'adapter, en temps réel, le contenu d'une communication publicitaire en fonction du contexte immediat de l'utilisateur : l'heure de la journee, sa localisation, l'appareil qu'il utilise, son comportement de navigation récent où son stade dans le tunnel d'achat. Cette approche permet d'atteindre un niveau de pertinence publicitaire nettement superieur à celui des campagnes statiques.</w:t>
       </w:r>
     </w:p>
     <w:p>
@@ -4617,7 +4617,7 @@
           <w:color w:val="1A1A1A"/>
           <w:sz w:val="24"/>
         </w:rPr>
-        <w:t>Les systemes de recommandation, fondes sur le filtrage collaboratif ou sur des approches hybrides, permettent de proposer a chaque utilisateur des contenus, produits ou services correspondant a ses preferences individuelles. Ces systemes constituent la colonne vertebrale des moteurs de recommandation de plateformes comme YouTube, dont l'algorithme determine en grande partie quels contenus et quelles publicites sont presentes a chaque utilisateur. Comprendre cette mecanique permet a l'annonceur de concevoir des contenus qui maximisent leur probabilite d'etre recommandes.</w:t>
+        <w:t>Les systèmes de recommandation, fondés sur le filtrage collaboratif où sur des approches hybrides, permettent de proposer à chaque utilisateur des contenus, produits où services correspondant à ses preferences individuelles. Ces systèmes constituent la colonne vertebrale des moteurs de recommandation de plateformes comme YouTube, dont l'algorithme déterminé en grande partie quels contenus et quelles publicites sont présentés à chaque utilisateur. Comprendre cette mecanique permet à l'annonceur de concevoir des contenus qui maximisent leur probabilite d'être recommandes.</w:t>
       </w:r>
     </w:p>
     <w:p>
@@ -4648,7 +4648,7 @@
           <w:color w:val="1A1A1A"/>
           <w:sz w:val="24"/>
         </w:rPr>
-        <w:t>YouTube Ads offre des capacites de ciblage particulierement avancees dans le domaine de la publicite video. Les annonceurs peuvent definir leurs audiences sur la base des centres d'interet, des intentions d'achat, des caracteristiques demographiques ou du comportement sur la plateforme. Les formats TrueView facturent l'annonceur uniquement lorsque l'utilisateur choisit de regarder la publicite, garantissant un engagement minimal de l'audience exposee.</w:t>
+        <w:t>YouTube Ads offre des capacités de ciblage particulièrement avancees dans le domaine de la publicite video. Les annonceurs peuvent définir leurs audiences sur la basé des centres d'intérêt, des intentions d'achat, des caracteristiques démographiques où du comportement sur la plateforme. Les formats TrueView facturent l'annonceur uniquement lorsque l'utilisateur choisit de regarder la publicite, garantissant un engagement minimal de l'audience exposee.</w:t>
       </w:r>
     </w:p>
     <w:p>
@@ -4664,7 +4664,7 @@
           <w:color w:val="1A1A1A"/>
           <w:sz w:val="24"/>
         </w:rPr>
-        <w:t>Meta Ads, accessible via Facebook et Instagram, se distingue par la richesse des donnees sociales et comportementales disponibles. L'algorithme d'optimisation de Meta apprend en continu a identifier les profils d'utilisateurs les plus susceptibles de realiser l'action souhaitee. Pour la campagne Varcadia, Meta Ads a constitue le principal canal d'engagement organique, grace notamment aux formats Reels et Stories, particulierement adaptes a la consommation mobile et au contenu video court.</w:t>
+        <w:t>Meta Ads, accessible via Facebook et Instagram, se distingue par la richesse des donnees sociales et comportementales disponibles. L'algorithme d'optimisation de Meta apprend en continu à identifier les profils d'utilisateurs les plus susceptibles de realiser l'action souhaitee. Pour la campagne Varcadia, Meta Ads à constitué le principal canal d'engagement organique, grâce notamment aux formats Réels et Stories, particulièrement adaptes à la consommation mobile et au contenu video court.</w:t>
       </w:r>
     </w:p>
     <w:p>
@@ -4680,7 +4680,7 @@
           <w:color w:val="1A1A1A"/>
           <w:sz w:val="24"/>
         </w:rPr>
-        <w:t>L'affichage urbain, enfin, a complete le dispositif digital en assurant une presence physique dans la ville de Soualem. Ce canal traditionnel a joue un role important dans la construction de la notoriete locale et dans la creation d'un effet d'anticipation au sein de la communaute, contribuant a ancrer Varcadia dans le paysage de la ville avant meme son ouverture. La complementarite entre la portee mesurable du digital et l'ancrage territorial de l'affichage constitue l'un des enseignements majeurs de la campagne, sur lequel nous reviendrons au chapitre 6.</w:t>
+        <w:t>L'affichage urbain, enfin, à complet le dispositif digital en assurant une presence physique dans la ville de Soualem. Ce canal traditionnel à joue un rôle important dans la construction de la notoriété locale et dans la creation d'un effet d'anticipation au sein de la communauté, contribuant à ancrer Varcadia dans le paysage de la ville avant même son ouverture. La complémentarité entre la portee mesurable du digital et l'ancrage territorial de l'affichage constitué l'un des enseignements majeurs de la campagne, sur lequel nous reviendrons au chapitre 6.</w:t>
       </w:r>
     </w:p>
     <w:p>
@@ -4698,7 +4698,7 @@
           <w:color w:val="595959"/>
           <w:sz w:val="18"/>
         </w:rPr>
-        <w:t>Notes et references</w:t>
+        <w:t>Notes et références</w:t>
       </w:r>
     </w:p>
     <w:p>
@@ -4778,7 +4778,7 @@
           <w:color w:val="1F4E79"/>
           <w:sz w:val="28"/>
         </w:rPr>
-        <w:t>3.1  Le contenu marketing a l'ere de l'IA generative</w:t>
+        <w:t>3.1  Le contenu marketing à l'ere de l'IA générative</w:t>
       </w:r>
     </w:p>
     <w:p>
@@ -4794,7 +4794,7 @@
           <w:color w:val="1A1A1A"/>
           <w:sz w:val="24"/>
         </w:rPr>
-        <w:t>La creation publicitaire a longtemps repose sur la seule creativite humaine. Concepteurs, directeurs artistiques, realisateurs et redacteurs constituaient le coeur des equipes creatives, responsables de l'elaboration de messages capables de capter l'attention du consommateur, de susciter une emotion et d'inciter a l'action. Ce processus, riche mais long et couteux, s'avere de plus en plus difficile a soutenir dans un environnement ou la demande de contenus est exponentielle et ou les formats se multiplient sur chaque plateforme.</w:t>
+        <w:t>La creation publicitaire à longtemps repose sur la seule créativité humaine. Concepteurs, directeurs artistiques, realisateurs et rédacteurs constituaient le coeur des équipes créatives, responsables de l'élaboration de messages capables de capter l'attention du consommateur, de susciter une émotion et d'inciter à l'action. Ce processus, riche mais long et coûteux, s'avéré de plus en plus difficile a soutenir dans un environnement où la demande de contenus est exponentielle et où les formats se multiplient sur chaque plateforme.</w:t>
       </w:r>
     </w:p>
     <w:p>
@@ -4810,7 +4810,7 @@
           <w:color w:val="1A1A1A"/>
           <w:sz w:val="24"/>
         </w:rPr>
-        <w:t>L'IA generative a ouvert une nouvelle ere pour la production de contenus marketing. Elle ne remplace pas le jugement creatif humain, mais en demultiplie la portee : un brief bien formule peut desormais produire, en quelques minutes, des dizaines de variantes visuelles ou redactionnelles, que l'equipe peut ensuite selectionner, affiner et deployer. Le role du marketeur se deplace ainsi de l'execution vers la direction artistique et la definition des intentions. Cette evolution est au coeur de la methode de travail que nous avons appliquee chez Volcano Vision et Widma Digitale.</w:t>
+        <w:t>L'IA générative à ouvert une nouvelle ere pour la production de contenus marketing. Elle ne remplace pas le jugement créatif humain, mais en démultiplie la portee : un brief bien formule peut désormais produire, en quelques minutes, des dizaines de variantes visuelles où rédactionnelles, que l'équipe peut ensuite selectionner, affiner et déployer. Le rôle du marketeur se déplace ainsi de l'execution vers la direction artistique et la definition des intentions. Cette évolution est au coeur de la méthode de travail que nous avons appliquee chez Volcano Vision et Widma Digitale.</w:t>
       </w:r>
     </w:p>
     <w:p>
@@ -4825,7 +4825,7 @@
           <w:color w:val="1F4E79"/>
           <w:sz w:val="28"/>
         </w:rPr>
-        <w:t>3.2  Kling AI et Nano Banana Pro : deux outils au coeur de notre demarche</w:t>
+        <w:t>3.2  Kling AI et Nano Banana Pro : deux outils au coeur de notre démarche</w:t>
       </w:r>
     </w:p>
     <w:p>
@@ -4841,7 +4841,7 @@
           <w:color w:val="1A1A1A"/>
           <w:sz w:val="24"/>
         </w:rPr>
-        <w:t>Kling AI est une plateforme de generation video par intelligence artificielle developpee par Kuaishou Technology, l'un des leaders mondiaux de la video courte. Elle permet de generer des sequences video coherentes et realistes a partir de descriptions textuelles (text-to-video) ou d'images de reference (image-to-video). Ses capacites de simulation des mouvements physiques et de maintien de la coherence temporelle entre les plans la distinguent des solutions concurrentes et en font un outil particulierement adapte a la production de contenus publicitaires video.</w:t>
+        <w:t>Kling AI est une plateforme de generation video par intelligence artificielle développée par Kuaishou Technology, l'un des leaders mondiaux de la video courte. Elle permet de generer des sequences video cohérentes et realistes à partir de descriptions textuelles (text-to-video) où d'images de référence (image-to-video). Ses capacités de simulation des mouvements physiques et de maintien de la cohérence temporelle entre les plans la distinguent des solutions concurrentes et en font un outil particulièrement adapte à la production de contenus publicitaires video.</w:t>
       </w:r>
     </w:p>
     <w:p>
@@ -4857,7 +4857,7 @@
           <w:color w:val="1A1A1A"/>
           <w:sz w:val="24"/>
         </w:rPr>
-        <w:t>Nano Banana Pro est un outil d'edition et de generation video assiste par IA, concu pour la production de contenus courts formats destines aux plateformes de diffusion sociales et publicitaires. Il propose des fonctionnalites d'edition automatisee, de synchronisation musicale intelligente, d'ajout d'effets visuels generes par IA et d'optimisation automatique des formats selon les specifications de chaque plateforme. Sa prise en main intuitive le rend accessible a des equipes de petite taille, comme c'est le cas chez Volcano Vision.</w:t>
+        <w:t>Nano Banana Pro est un outil d'édition et de generation video assisté par IA, conçu pour la production de contenus courts formats destines aux plateformes de diffusion sociales et publicitaires. Il propose des fonctionnalites d'édition automatisee, de synchronisation musicale intelligente, d'ajout d'effets visuels générés par IA et d'optimisation automatique des formats selon les specifications de chaque plateforme. Sa prise en main intuitive le rend accessible à des équipes de petite taille, comme c'est le cas chez Volcano Vision.</w:t>
       </w:r>
     </w:p>
     <w:p>
@@ -4873,7 +4873,7 @@
           <w:color w:val="1A1A1A"/>
           <w:sz w:val="24"/>
         </w:rPr>
-        <w:t>Dans le cadre de la campagne Varcadia, nous avons utilise ces deux outils de maniere complementaire. Kling AI a ete mobilise pour generer des sequences visuelles immersives et spectaculaires, venant enrichir les rushes filmes sur place au sein du parc. Nano Banana Pro a assure l'edition et l'assemblage final des pieces, ainsi que l'adaptation aux differents formats requis par YouTube Ads et Meta Ads. Le tableau ci-dessous resume la repartition des roles entre les deux outils.</w:t>
+        <w:t>Dans le cadre de la campagne Varcadia, nous avons utilise ces deux outils de manière complémentaire. Kling AI à été mobilise pour generer des sequences visuelles immersives et spectaculaires, venant enrichir les rushes filmes sur place au sein du parc. Nano Banana Pro à assure l'édition et l'assemblage final des pièces, ainsi que l'adaptation aux différents formats requis par YouTube Ads et Meta Ads. Le tableau ci-dessous résumé la repartition des rôles entre les deux outils.</w:t>
       </w:r>
     </w:p>
     <w:p>
@@ -4889,7 +4889,7 @@
           <w:color w:val="1F4E79"/>
           <w:sz w:val="20"/>
         </w:rPr>
-        <w:t>Tableau 3.1 - Repartition des roles entre Kling AI et Nano Banana Pro</w:t>
+        <w:t>Tableau 3.1 - Repartition des rôles entre Kling AI et Nano Banana Pro</w:t>
       </w:r>
     </w:p>
     <w:tbl>
@@ -4923,7 +4923,7 @@
                 <w:color w:val="FFFFFF"/>
                 <w:sz w:val="21"/>
               </w:rPr>
-              <w:t>Etape de production</w:t>
+              <w:t>Étape de production</w:t>
             </w:r>
           </w:p>
         </w:tc>
@@ -4990,7 +4990,7 @@
                 <w:color w:val="1A1A1A"/>
                 <w:sz w:val="21"/>
               </w:rPr>
-              <w:t>Tournage des rushes reels</w:t>
+              <w:t>Tournage des rushes réels</w:t>
             </w:r>
           </w:p>
         </w:tc>
@@ -5162,7 +5162,7 @@
                 <w:color w:val="1A1A1A"/>
                 <w:sz w:val="21"/>
               </w:rPr>
-              <w:t>Mouvement fluide, coherence des plans</w:t>
+              <w:t>Mouvement fluide, cohérence des plans</w:t>
             </w:r>
           </w:p>
         </w:tc>
@@ -5315,7 +5315,7 @@
           <w:color w:val="1F4E79"/>
           <w:sz w:val="28"/>
         </w:rPr>
-        <w:t>3.3  Performance du contenu genere par IA : indicateurs et resultats</w:t>
+        <w:t>3.3  Performance du contenu généré par IA : indicateurs et résultats</w:t>
       </w:r>
     </w:p>
     <w:p>
@@ -5331,7 +5331,7 @@
           <w:color w:val="1A1A1A"/>
           <w:sz w:val="24"/>
         </w:rPr>
-        <w:t>L'evaluation de la performance d'un contenu publicitaire genere par IA repose sur les memes indicateurs que tout contenu publicitaire digital. Le taux de visionnage mesure la proportion d'utilisateurs ayant regarde la publicite jusqu'a un seuil defini. Le taux de clics evalue la capacite du contenu a generer des actions de la part de l'audience exposee. Le cout par acquisition rapporte le budget investi au nombre de conversions generees. Le retour sur les depenses publicitaires mesure les revenus generes pour chaque unite monetaire investie.</w:t>
+        <w:t>L'evaluation de la performance d'un contenu publicitaire généré par IA repose sur les mêmes indicateurs que tout contenu publicitaire digital. Le taux de visionnage mesuré la proportion d'utilisateurs ayant regarde la publicite jusqu'à un seuil défini. Le taux de clics évalué la capacité du contenu à generer des actions de la part de l'audience exposee. Le coût par acquisition rapporte le budget investi au nombre de conversions générées. Le retour sur les dépenses publicitaires mesuré les revenus générés pour chaque unite monetaire investie.</w:t>
       </w:r>
     </w:p>
     <w:p>
@@ -5347,7 +5347,7 @@
           <w:color w:val="1A1A1A"/>
           <w:sz w:val="24"/>
         </w:rPr>
-        <w:t>Les indicateurs qualitatifs sont tout aussi importants : le taux d'engagement, qui agrege les commentaires, partages et reactions, permet d'evaluer l'adhesion de l'audience au contenu ; le sentiment global des commentaires renseigne sur la perception de la marque ; la memorisation publicitaire, evaluee via des etudes specifiques, mesure l'ancrage du message dans la memoire des consommateurs.</w:t>
+        <w:t>Les indicateurs qualitatifs sont tout aussi importants : le taux d'engagement, qui agrege les commentaires, partages et reactions, permet d'evaluer l'adhesion de l'audience au contenu ; le sentiment global des commentaires renseigne sur la perception de la marque ; la memorisation publicitaire, évaluée via des études spécifiques, mesuré l'ancrage du message dans la memoire des consommateurs.</w:t>
       </w:r>
     </w:p>
     <w:p>
@@ -5363,7 +5363,7 @@
           <w:color w:val="1A1A1A"/>
           <w:sz w:val="24"/>
         </w:rPr>
-        <w:t>Pour la campagne Varcadia, les resultats obtenus ont valide notre approche. Plus d'un million de vues ont ete enregistrees sur l'ensemble des plateformes en un mois de teasing. Le taux d'engagement sur Meta Ads a depasse les benchmarks habituels pour ce type de campagne locale au Maroc. Surtout, la forte affluence enregistree des le jour de l'ouverture du parc constitue l'indicateur de conversion le plus parlant et le plus concret de l'efficacite globale de la strategie deployee. Le detail chiffre de ces resultats est presente au chapitre 6.</w:t>
+        <w:t>Pour la campagne Varcadia, les résultats obtenus ont validé notre approche. Plus d'un million de vues ont été enregistrees sur l'ensemble des plateformes en un mois de teasing. Le taux d'engagement sur Meta Ads à dépassé les benchmarks habituels pour ce type de campagne locale au Maroc. Surtout, la forte affluence enregistree des le jour de l'ouverture du parc constitué l'indicateur de conversion le plus parlant et le plus concret de l'efficacité globale de la stratégie déployée. Le détail chiffre de ces résultats est présenté au chapitre 6.</w:t>
       </w:r>
     </w:p>
     <w:p>
@@ -5378,7 +5378,7 @@
           <w:color w:val="1F4E79"/>
           <w:sz w:val="28"/>
         </w:rPr>
-        <w:t>3.4  Limites ethiques et enjeux de propriete intellectuelle</w:t>
+        <w:t>3.4  Limites éthiques et enjeux de propriété intellectuelle</w:t>
       </w:r>
     </w:p>
     <w:p>
@@ -5394,7 +5394,7 @@
           <w:color w:val="1A1A1A"/>
           <w:sz w:val="24"/>
         </w:rPr>
-        <w:t>Le recours a l'IA generative dans la production de contenus publicitaires souleve des questions ethiques et juridiques importantes. La transparence vis-a-vis du consommateur est l'une des plus debattues : faut-il indiquer qu'un contenu a ete produit ou assiste par IA ? Si aucune reglementation n'impose encore cette obligation de facon universelle, plusieurs organismes de regulation publicitaire et associations professionnelles plaident pour l'adoption de standards de transparence.</w:t>
+        <w:t>Le recours à l'IA générative dans la production de contenus publicitaires souleve des questions éthiques et juridiques importantes. La transparence vis-a-vis du consommateur est l'une des plus débattues : faut-il indiquer qu'un contenu à été produit où assisté par IA ? Si aucune réglementation n'impose encore cette obligation de façon universelle, plusieurs organismes de régulation publicitaire et associations professionnelles plaident pour l'adoption de standards de transparence.</w:t>
       </w:r>
     </w:p>
     <w:p>
@@ -5410,7 +5410,7 @@
           <w:color w:val="1A1A1A"/>
           <w:sz w:val="24"/>
         </w:rPr>
-        <w:t>Les questions de propriete intellectuelle sont egalement complexes. Les modeles d'IA generative sont entraines sur de vastes corpus dont les droits appartiennent a des tiers. La question de savoir si les contenus generes sont protegeables, et a qui appartiennent les droits sur ces contenus, fait l'objet de debats juridiques en cours dans de nombreuses juridictions, y compris en Europe et aux Etats-Unis. Les annonceurs doivent donc rester vigilants sur les conditions d'utilisation des outils qu'ils emploient.</w:t>
+        <w:t>Les questions de propriété intellectuelle sont egalement complexes. Les modèles d'IA générative sont entraines sur de vastes corpus dont les droits appartiennent à des tiers. La question de savoir si les contenus générés sont protegeables, et à qui appartiennent les droits sur ces contenus, fait l'objet de debats juridiques en cours dans de nombreuses juridictions, y compris en Europe et aux Etats-Unis. Les annonceurs doivent donc rester vigilants sur les conditions d'utilisation des outils qu'ils emploient.</w:t>
       </w:r>
     </w:p>
     <w:p>
@@ -5426,7 +5426,7 @@
           <w:color w:val="1A1A1A"/>
           <w:sz w:val="24"/>
         </w:rPr>
-        <w:t>Enfin, les risques de biais algorithmiques meritent une attention particuliere. Les modeles d'IA peuvent reproduire ou amplifier des stereotypes presents dans leurs donnees d'entrainement, produisant des contenus qui vehiculent des representations biaisees. Une supervision humaine rigoureuse reste donc indispensable tout au long du processus de creation et de validation des contenus generes par IA. Cette exigence de supervision a guide notre methode de travail sur la campagne Varcadia, ou chaque sequence generee a fait l'objet d'une validation creative avant diffusion.</w:t>
+        <w:t>Enfin, les risques de biais algorithmiques meritent une attention particulière. Les modèles d'IA peuvent reproduire où amplifier des stereotypes presents dans leurs donnees d'entrainement, produisant des contenus qui vehiculent des representations biaisées. Une supervision humaine rigoureuse reste donc indispensable tout au long du processus de creation et de validation des contenus générés par IA. Cette exigence de supervision à guide notre méthode de travail sur la campagne Varcadia, où chaque sequence générée à fait l'objet d'une validation créative avant diffusion.</w:t>
       </w:r>
     </w:p>
     <w:p>
@@ -5444,7 +5444,7 @@
           <w:color w:val="595959"/>
           <w:sz w:val="18"/>
         </w:rPr>
-        <w:t>Notes et references</w:t>
+        <w:t>Notes et références</w:t>
       </w:r>
     </w:p>
     <w:p>
@@ -5474,7 +5474,7 @@
           <w:color w:val="595959"/>
           <w:sz w:val="18"/>
         </w:rPr>
-        <w:t>8. ARPP France (2024). Recommandations sur l'usage de l'IA generative en publicite.</w:t>
+        <w:t>8. ARPP France (2024). Recommandations sur l'usage de l'IA générative en publicite.</w:t>
       </w:r>
     </w:p>
     <w:p>
@@ -5515,7 +5515,7 @@
           <w:color w:val="2E75B6"/>
           <w:sz w:val="36"/>
         </w:rPr>
-        <w:t>Etude Empirique et Application Pratique</w:t>
+        <w:t>Étude Empirique et Application Pratique</w:t>
       </w:r>
     </w:p>
     <w:p>
@@ -5550,7 +5550,7 @@
           <w:color w:val="1F4E79"/>
           <w:sz w:val="36"/>
         </w:rPr>
-        <w:t>Methodologie de Recherche</w:t>
+        <w:t>Méthodologie de Recherche</w:t>
       </w:r>
     </w:p>
     <w:p>
@@ -5565,7 +5565,7 @@
           <w:color w:val="1F4E79"/>
           <w:sz w:val="28"/>
         </w:rPr>
-        <w:t>4.1  Positionnement epistemologique</w:t>
+        <w:t>4.1  Positionnement épistémologique</w:t>
       </w:r>
     </w:p>
     <w:p>
@@ -5581,7 +5581,7 @@
           <w:color w:val="1A1A1A"/>
           <w:sz w:val="24"/>
         </w:rPr>
-        <w:t>Ce travail s'inscrit dans un paradigme post-positiviste. Nous reconnaissons la complexite et la subjectivite partielle des phenomenes etudies, tout en cherchant a les apprehender de la facon la plus rigoureuse et la plus systematique possible. Notre positionnement est pragmatique : nous privilegions les methodes qui permettent de repondre le mieux possible a notre problematique, independamment de leur appartenance a un courant methodologique unique. Cette posture est particulierement adaptee a un objet d'etude aussi mouvant que l'IA marketing, ou la theorie peine a suivre le rythme de l'innovation.</w:t>
+        <w:t>Ce travail s'inscrit dans un paradigme post-positiviste. Nous reconnaissons la complexité et la subjectivite partielle des phenomenes etudies, tout en cherchant à les apprehender de la façon la plus rigoureuse et la plus systématique possible. Notre positionnement est pragmatique : nous privilegions les méthodes qui permettent de répondre le mieux possible à notre problematique, independamment de leur appartenance à un courant méthodologique unique. Cette posture est particulièrement adaptee à un objet d'étude aussi mouvant que l'IA marketing, où la theorie peine à suivre le rythme de l'innovation.</w:t>
       </w:r>
     </w:p>
     <w:p>
@@ -5596,7 +5596,7 @@
           <w:color w:val="1F4E79"/>
           <w:sz w:val="28"/>
         </w:rPr>
-        <w:t>4.2  Methode mixte : approche quantitative et qualitative</w:t>
+        <w:t>4.2  Méthode mixte : approche quantitative et qualitative</w:t>
       </w:r>
     </w:p>
     <w:p>
@@ -5612,7 +5612,7 @@
           <w:color w:val="1A1A1A"/>
           <w:sz w:val="24"/>
         </w:rPr>
-        <w:t>Nous avons adopte une demarche methodologique mixte, combinant une enquete quantitative par questionnaire et une etude de cas qualitative. Ces deux approches se completent : la premiere permet de dresser un tableau statistique des pratiques d'adoption de l'IA dans le marketing digital marocain, tandis que la seconde permet d'analyser en profondeur un cas concret et d'en tirer des enseignements transferables.</w:t>
+        <w:t>Nous avons adopté une démarche méthodologique mixte, combinant une enquête quantitative par questionnaire et une étude de cas qualitative. Ces deux approches se completent : la première permet de dresser un tableau statistique des pratiques d'adoption de l'IA dans le marketing digital marocain, tandis que la seconde permet d'analyser en profondeur un cas concret et d'en tirer des enseignements transferables.</w:t>
       </w:r>
     </w:p>
     <w:p>
@@ -5628,7 +5628,7 @@
           <w:color w:val="1A1A1A"/>
           <w:sz w:val="24"/>
         </w:rPr>
-        <w:t>L'enquete quantitative a ete conduite via un questionnaire auto-administre en ligne, diffuse aupres d'un echantillon de professionnels du marketing digital au Maroc. Le questionnaire etait structure en quatre parties : profil du repondant, niveau d'adoption de l'IA dans les pratiques marketing, evaluation de l'impact percu sur les performances, et perception du contenu genere par IA.</w:t>
+        <w:t>L'enquête quantitative à été conduite via un questionnaire auto-administre en ligne, diffusé auprès d'un échantillon de professionnels du marketing digital au Maroc. Le questionnaire était structure en quatre parties : profil du répondant, niveau d'adoption de l'IA dans les pratiques marketing, evaluation de l'impact perçu sur les performances, et perception du contenu généré par IA.</w:t>
       </w:r>
     </w:p>
     <w:p>
@@ -5644,7 +5644,7 @@
           <w:color w:val="1A1A1A"/>
           <w:sz w:val="24"/>
         </w:rPr>
-        <w:t>L'etude qualitative a repose sur des entretiens semi-directifs menes aupres de cinq professionnels du secteur, ainsi que sur l'analyse detaillee de la campagne Varcadia. Les entretiens ont ete enregistres, retranscrits et analyses par la methode de l'analyse de contenu thematique. La triangulation de ces differentes sources de donnees renforce la validite de nos conclusions.</w:t>
+        <w:t>L'étude qualitative à repose sur des entretiens semi-directifs menes auprès de cinq professionnels du secteur, ainsi que sur l'analysé détaillée de la campagne Varcadia. Les entretiens ont été enregistres, retranscrits et analyses par la méthode de l'analysé de contenu thématique. La triangulation de ces différentes sources de donnees renforce la validite de nos conclusions.</w:t>
       </w:r>
     </w:p>
     <w:p>
@@ -5659,7 +5659,7 @@
           <w:color w:val="1F4E79"/>
           <w:sz w:val="28"/>
         </w:rPr>
-        <w:t>4.3  Population cible et echantillonnage</w:t>
+        <w:t>4.3  Population cible et échantillonnage</w:t>
       </w:r>
     </w:p>
     <w:p>
@@ -5675,7 +5675,7 @@
           <w:color w:val="1A1A1A"/>
           <w:sz w:val="24"/>
         </w:rPr>
-        <w:t>La population cible de notre etude quantitative est constituee des professionnels du marketing digital exercant au Maroc, qu'ils soient salaries d'entreprises, freelances ou collaborateurs d'agences. Nous avons opte pour un echantillonnage par convenance, en diffusant le questionnaire via les reseaux professionnels LinkedIn et via les communautes digitales marocaines actives sur les plateformes sociales.</w:t>
+        <w:t>La population cible de notre étude quantitative est constituée des professionnels du marketing digital exercant au Maroc, qu'ils soient salaries d'entreprises, freelances où collaborateurs d'agences. Nous avons opte pour un échantillonnage par convenance, en diffusant le questionnaire via les réseaux professionnels LinkedIn et via les communautes digitales marocaines actives sur les plateformes sociales.</w:t>
       </w:r>
     </w:p>
     <w:p>
@@ -5691,7 +5691,7 @@
           <w:color w:val="1A1A1A"/>
           <w:sz w:val="24"/>
         </w:rPr>
-        <w:t>L'echantillon final comprend 87 repondants, dont une majorite travaille en agence de communication ou de marketing digital. Les profils representent une diversite de secteurs d'activite, de tailles d'entreprises et de niveaux d'experience, ce qui confere a notre echantillon une certaine representativite, meme si les conclusions ne sauraient etre generalisees a l'ensemble du secteur.</w:t>
+        <w:t>L'échantillon final comprend 87 répondants, dont une majorite travaille en agence de communication ou de marketing digital. Les profils representent une diversite de secteurs d'activité, de tailles d'entreprises et de niveaux d'expérience, ce qui confere à notre échantillon une certaine representativite, même si les conclusions ne sauraient être generalisees à l'ensemble du secteur.</w:t>
       </w:r>
     </w:p>
     <w:p>
@@ -5707,7 +5707,7 @@
           <w:color w:val="1F4E79"/>
           <w:sz w:val="20"/>
         </w:rPr>
-        <w:t>Tableau 4.1 - Profil de l'echantillon (n = 87)</w:t>
+        <w:t>Tableau 4.1 - Profil de l'échantillon (n = 87)</w:t>
       </w:r>
     </w:p>
     <w:tbl>
@@ -5763,7 +5763,7 @@
                 <w:color w:val="FFFFFF"/>
                 <w:sz w:val="21"/>
               </w:rPr>
-              <w:t>Categorie</w:t>
+              <w:t>Catégorie</w:t>
             </w:r>
           </w:p>
         </w:tc>
@@ -5785,7 +5785,7 @@
                 <w:color w:val="FFFFFF"/>
                 <w:sz w:val="21"/>
               </w:rPr>
-              <w:t>Part de l'echantillon</w:t>
+              <w:t>Part de l'échantillon</w:t>
             </w:r>
           </w:p>
         </w:tc>
@@ -6001,7 +6001,7 @@
                 <w:color w:val="1A1A1A"/>
                 <w:sz w:val="21"/>
               </w:rPr>
-              <w:t>Experience</w:t>
+              <w:t>Expérience</w:t>
             </w:r>
           </w:p>
         </w:tc>
@@ -6086,7 +6086,7 @@
                 <w:color w:val="1A1A1A"/>
                 <w:sz w:val="21"/>
               </w:rPr>
-              <w:t>3 a 7 ans</w:t>
+              <w:t>3 à 7 ans</w:t>
             </w:r>
           </w:p>
         </w:tc>
@@ -6194,7 +6194,7 @@
                 <w:color w:val="1A1A1A"/>
                 <w:sz w:val="21"/>
               </w:rPr>
-              <w:t>Tranche d'age</w:t>
+              <w:t>Tranche d'âge</w:t>
             </w:r>
           </w:p>
         </w:tc>
@@ -6387,7 +6387,7 @@
           <w:color w:val="1F4E79"/>
           <w:sz w:val="28"/>
         </w:rPr>
-        <w:t>4.4  Outils de collecte et d'analyse des donnees</w:t>
+        <w:t>4.4  Outils de collecté et d'analysé des donnees</w:t>
       </w:r>
     </w:p>
     <w:p>
@@ -6403,7 +6403,7 @@
           <w:color w:val="1A1A1A"/>
           <w:sz w:val="24"/>
         </w:rPr>
-        <w:t>Le questionnaire a ete concu et administre via Google Forms. Les donnees collectees ont ete exportees vers le logiciel SPSS pour les traitements statistiques, incluant des analyses descriptives (frequences, moyennes, ecarts-types) et des analyses bivariees (croisements, tests du khi-deux) visant a identifier des associations entre les variables d'interet.</w:t>
+        <w:t>Le questionnaire à été conçu et administre via Google Forms. Les donnees collectées ont été exportees vers le logiciel SPSS pour les traitements statistiques, incluant des analyses descriptives (frequences, moyennes, ecarts-types) et des analyses bivariees (croisements, tests du khi-deux) visant à identifier des associations entre les variables d'intérêt.</w:t>
       </w:r>
     </w:p>
     <w:p>
@@ -6419,7 +6419,7 @@
           <w:color w:val="1A1A1A"/>
           <w:sz w:val="24"/>
         </w:rPr>
-        <w:t>L'analyse qualitative des entretiens et de la campagne Varcadia a repose sur une grille d'analyse thematique construite a partir de nos hypotheses de recherche et affinee au fil des lectures. Les themes retenus couvrent les motivations d'adoption de l'IA, les freins rencontres, les indicateurs de performance utilises et la perception du contenu genere par IA par les professionnels et par les consommateurs.</w:t>
+        <w:t>L'analysé qualitative des entretiens et de la campagne Varcadia à repose sur une grille d'analysé thématique construite à partir de nos hypotheses de recherche et affinee au fil des lectures. Les thèmes retenus couvrent les motivations d'adoption de l'IA, les freins rencontres, les indicateurs de performance utilises et la perception du contenu généré par IA par les professionnels et par les consommateurs.</w:t>
       </w:r>
     </w:p>
     <w:p>
@@ -6454,7 +6454,7 @@
           <w:color w:val="1F4E79"/>
           <w:sz w:val="36"/>
         </w:rPr>
-        <w:t>Resultats et Analyse</w:t>
+        <w:t>Résultats et Analysé</w:t>
       </w:r>
     </w:p>
     <w:p>
@@ -6469,7 +6469,7 @@
           <w:color w:val="1F4E79"/>
           <w:sz w:val="28"/>
         </w:rPr>
-        <w:t>5.1  Etat de l'adoption de l'IA dans le marketing digital marocain</w:t>
+        <w:t>5.1  État de l'adoption de l'IA dans le marketing digital marocain</w:t>
       </w:r>
     </w:p>
     <w:p>
@@ -6485,7 +6485,7 @@
           <w:color w:val="1A1A1A"/>
           <w:sz w:val="24"/>
         </w:rPr>
-        <w:t>Les resultats de notre enquete font ressortir un tableau nuance de l'adoption de l'IA dans les pratiques marketing digitales au Maroc. Pres de 62% des repondants declarent utiliser au moins un outil d'IA dans leurs activites quotidiennes, mais cette utilisation reste souvent ponctuelle et limitee a des taches precises, principalement la redaction de contenus et la creation visuelle.</w:t>
+        <w:t>Les résultats de notre enquête font ressortir un tableau nuance de l'adoption de l'IA dans les pratiques marketing digitales au Maroc. Pres de 62% des répondants déclarent utiliser au moins un outil d'IA dans leurs activités quotidiennes, mais cette utilisation reste souvent ponctuelle et limitee à des tâches precises, principalement la redaction de contenus et la creation visuelle.</w:t>
       </w:r>
     </w:p>
     <w:p>
@@ -6556,7 +6556,7 @@
           <w:color w:val="1A1A1A"/>
           <w:sz w:val="24"/>
         </w:rPr>
-        <w:t>Les outils les plus cites sont les assistants redactionnels bases sur des modeles de langage (utilises par 54% des repondants), suivis par les outils de creation d'images (41%) et les plateformes d'automatisation des publications sur les reseaux sociaux (38%). Les outils de generation video, pourtant au coeur de notre experimentation Varcadia, ne sont utilises que par 18% des repondants, temoignant d'un potentiel de diffusion encore important et d'une avance competitive pour les agences qui les maitrisent des aujourd'hui.</w:t>
+        <w:t>Les outils les plus cités sont les assistants rédactionnels basés sur des modèles de langage (utilises par 54% des répondants), suivis par les outils de creation d'images (41%) et les plateformes d'automatisation des publications sur les réseaux sociaux (38%). Les outils de generation video, pourtant au coeur de notre expérimentation Varcadia, ne sont utilises que par 18% des répondants, temoignant d'un potentiel de diffusion encore important et d'une avance compétitive pour les agences qui les maitrisent des aujourd'hui.</w:t>
       </w:r>
     </w:p>
     <w:p>
@@ -6572,7 +6572,7 @@
           <w:color w:val="1A1A1A"/>
           <w:sz w:val="24"/>
         </w:rPr>
-        <w:t>Les principaux freins identifies sont le manque de formation et de maitrise technique (cite par 58% des repondants), le cout percu des solutions professionnelles (43%) et les incertitudes quant a la qualite et a l'originalite des contenus produits (37%). Ces freins confirment le role strategique que peuvent jouer les agences specialisees comme Widma Digitale et Volcano Vision dans la diffusion et la valorisation de ces technologies.</w:t>
+        <w:t>Les principaux freins identifies sont le manque de formation et de maitrise technique (cité par 58% des répondants), le coût perçu des solutions professionnelles (43%) et les incertitudes quant à la qualité et à l'originalite des contenus produits (37%). Ces freins confirment le rôle stratégique que peuvent jouer les agences specialisees comme Widma Digitale et Volcano Vision dans la diffusion et la valorisation de ces technologies.</w:t>
       </w:r>
     </w:p>
     <w:p>
@@ -6587,7 +6587,7 @@
           <w:color w:val="1F4E79"/>
           <w:sz w:val="28"/>
         </w:rPr>
-        <w:t>5.2  Impact mesure de l'IA sur les performances publicitaires</w:t>
+        <w:t>5.2  Impact mesuré de l'IA sur les performances publicitaires</w:t>
       </w:r>
     </w:p>
     <w:p>
@@ -6603,7 +6603,7 @@
           <w:color w:val="1A1A1A"/>
           <w:sz w:val="24"/>
         </w:rPr>
-        <w:t>Parmi les repondants utilisant des outils d'IA dans leurs campagnes publicitaires, une majorite significative declare observer une amelioration des performances. Plus de 70% rapportent une reduction des couts de production de contenu, 64% notent une amelioration du taux d'engagement de leurs publications et 58% observent une augmentation du taux de clics sur leurs annonces payantes.</w:t>
+        <w:t>Parmi les répondants utilisant des outils d'IA dans leurs campagnes publicitaires, une majorite significative déclaré observer une amélioration des performances. Plus de 70% rapportent une réduction des coûts de production de contenu, 64% notent une amélioration du taux d'engagement de leurs publications et 58% observent une augmentation du taux de clics sur leurs annonces payantes.</w:t>
       </w:r>
     </w:p>
     <w:p>
@@ -6658,7 +6658,7 @@
           <w:color w:val="595959"/>
           <w:sz w:val="19"/>
         </w:rPr>
-        <w:t>Figure 4 - Impact percu de l'IA sur les performances publicitaires</w:t>
+        <w:t>Figure 4 - Impact perçu de l'IA sur les performances publicitaires</w:t>
       </w:r>
     </w:p>
     <w:p>
@@ -6674,7 +6674,7 @@
           <w:color w:val="1A1A1A"/>
           <w:sz w:val="24"/>
         </w:rPr>
-        <w:t>Ces resultats, bien que fondes sur des perceptions auto-declarees, sont coherents avec les conclusions des etudes internationales sur le sujet et avec les resultats concrets que nous avons observes lors de la campagne Varcadia. Ils suggerent que l'IA apporte une valeur ajoutee mesurable et percue dans la grande majorite des cas d'usage marketing.</w:t>
+        <w:t>Ces résultats, bien que fondés sur des perceptions auto-declarees, sont cohérents avec les conclusions des études internationales sur le sujet et avec les résultats concrets que nous avons observes lors de la campagne Varcadia. Ils suggerent que l'IA apporte une valeur ajoutee mesurable et perçue dans la grande majorite des cas d'usage marketing.</w:t>
       </w:r>
     </w:p>
     <w:p>
@@ -6689,7 +6689,7 @@
           <w:color w:val="1F4E79"/>
           <w:sz w:val="28"/>
         </w:rPr>
-        <w:t>5.3  Perception du contenu genere par IA par les professionnels</w:t>
+        <w:t>5.3  Perception du contenu généré par IA par les professionnels</w:t>
       </w:r>
     </w:p>
     <w:p>
@@ -6705,7 +6705,7 @@
           <w:color w:val="1A1A1A"/>
           <w:sz w:val="24"/>
         </w:rPr>
-        <w:t>L'une des questions les plus debattues dans notre enquete porte sur la qualite percue du contenu genere par IA. Les resultats sont nuances : 54% des professionnels interroges estiment que le contenu genere par IA peut atteindre un niveau de qualite comparable a celui produit par des equipes creatives humaines, sous reserve d'une supervision et d'un affinage adequats.</w:t>
+        <w:t>L'une des questions les plus débattues dans notre enquête porte sur la qualité perçue du contenu généré par IA. Les résultats sont nuances : 54% des professionnels interroges estiment que le contenu généré par IA peut atteindre un niveau de qualité comparable à celui produit par des équipes créatives humaines, sous reserve d'une supervision et d'un affinage adequats.</w:t>
       </w:r>
     </w:p>
     <w:p>
@@ -6721,7 +6721,7 @@
           <w:color w:val="1A1A1A"/>
           <w:sz w:val="24"/>
         </w:rPr>
-        <w:t>En revanche, 71% soulignent que le contenu genere par IA manque parfois d'authenticite et de singularite lorsqu'il est produit sans direction artistique claire. Ce constat renforce notre conviction que l'IA n'est pas un substitut a la creativite humaine, mais un amplificateur de celle-ci : son efficacite est maximale lorsqu'elle est guidee par une vision strategique et creative claire.</w:t>
+        <w:t>En revanche, 71% soulignent que le contenu généré par IA manque parfois d'authenticite et de singularite lorsqu'il est produit sans direction artistique claire. Ce constat renforce notre conviction que l'IA n'est pas un substitut à la créativité humaine, mais un amplificateur de celle-ci : son efficacité est maximale lorsqu'elle est guidee par une vision stratégique et créative claire.</w:t>
       </w:r>
     </w:p>
     <w:p>
@@ -6752,7 +6752,7 @@
           <w:color w:val="1A1A1A"/>
           <w:sz w:val="24"/>
         </w:rPr>
-        <w:t>Au terme de notre analyse, les trois hypotheses de recherche formulees en introduction peuvent etre validees avec les nuances suivantes.</w:t>
+        <w:t>Au terme de notre analysé, les trois hypotheses de recherche formulees en introduction peuvent être validees avec les nuances suivantes.</w:t>
       </w:r>
     </w:p>
     <w:p>
@@ -6778,7 +6778,7 @@
           <w:color w:val="1A1A1A"/>
           <w:sz w:val="24"/>
         </w:rPr>
-        <w:t xml:space="preserve"> L'utilisation de l'IA dans le ciblage publicitaire ameliore significativement le taux de conversion. Cette hypothese est </w:t>
+        <w:t xml:space="preserve"> L'utilisation de l'IA dans le ciblage publicitaire améliore significativement le taux de conversion. Cette hypothese est </w:t>
       </w:r>
       <w:r>
         <w:rPr>
@@ -6788,7 +6788,7 @@
           <w:color w:val="1A1A1A"/>
           <w:sz w:val="24"/>
         </w:rPr>
-        <w:t>confirmee</w:t>
+        <w:t>confirmée</w:t>
       </w:r>
       <w:r>
         <w:rPr>
@@ -6798,7 +6798,7 @@
           <w:color w:val="1A1A1A"/>
           <w:sz w:val="24"/>
         </w:rPr>
-        <w:t>. Les resultats de notre enquete et les performances de la campagne Varcadia montrent des ameliorations tangibles des indicateurs de conversion lorsque le ciblage est confie aux algorithmes des plateformes.</w:t>
+        <w:t>. Les résultats de notre enquête et les performances de la campagne Varcadia montrent des ameliorations tangibles des indicateurs de conversion lorsque le ciblage est confie aux algorithmes des plateformes.</w:t>
       </w:r>
     </w:p>
     <w:p>
@@ -6824,7 +6824,7 @@
           <w:color w:val="1A1A1A"/>
           <w:sz w:val="24"/>
         </w:rPr>
-        <w:t xml:space="preserve"> Le contenu genere par IA atteint un niveau d'engagement comparable a celui produit par des equipes humaines. Cette hypothese est </w:t>
+        <w:t xml:space="preserve"> Le contenu généré par IA atteint un niveau d'engagement comparable à celui produit par des équipes humaines. Cette hypothese est </w:t>
       </w:r>
       <w:r>
         <w:rPr>
@@ -6834,7 +6834,7 @@
           <w:color w:val="1A1A1A"/>
           <w:sz w:val="24"/>
         </w:rPr>
-        <w:t>partiellement validee</w:t>
+        <w:t>partiellement validée</w:t>
       </w:r>
       <w:r>
         <w:rPr>
@@ -6844,7 +6844,7 @@
           <w:color w:val="1A1A1A"/>
           <w:sz w:val="24"/>
         </w:rPr>
-        <w:t>. Elle se verifie clairement lorsque la production par IA s'inscrit dans une strategie creative definie et supervisee par des professionnels, comme ce fut le cas pour Varcadia, mais reste fragile en l'absence de direction artistique.</w:t>
+        <w:t>. Elle se verifie clairement lorsque la production par IA s'inscrit dans une stratégie créative définie et supervisee par des professionnels, comme ce fut le cas pour Varcadia, mais reste fragile en l'absence de direction artistique.</w:t>
       </w:r>
     </w:p>
     <w:p>
@@ -6880,7 +6880,7 @@
           <w:color w:val="1A1A1A"/>
           <w:sz w:val="24"/>
         </w:rPr>
-        <w:t>confirmee</w:t>
+        <w:t>confirmée</w:t>
       </w:r>
       <w:r>
         <w:rPr>
@@ -6890,7 +6890,7 @@
           <w:color w:val="1A1A1A"/>
           <w:sz w:val="24"/>
         </w:rPr>
-        <w:t>. La campagne Varcadia en est une illustration directe : avec des ressources limitees, les deux agences ont produit une campagne dont les resultats en termes de notoriete et d'affluence a l'ouverture rivalisent avec des lancements de marques disposant de budgets bien plus importants.</w:t>
+        <w:t>. La campagne Varcadia en est une illustration directe : avec des ressources limitees, les deux agences ont produit une campagne dont les résultats en termes de notoriété et d'affluence à l'ouverture rivalisent avec des lancements de marques disposant de budgets bien plus importants.</w:t>
       </w:r>
     </w:p>
     <w:p>
@@ -6962,7 +6962,7 @@
                 <w:color w:val="FFFFFF"/>
                 <w:sz w:val="21"/>
               </w:rPr>
-              <w:t>Enonce resume</w:t>
+              <w:t>Enonce résumé</w:t>
             </w:r>
           </w:p>
         </w:tc>
@@ -7049,7 +7049,7 @@
                 <w:color w:val="1A1A1A"/>
                 <w:sz w:val="21"/>
               </w:rPr>
-              <w:t>Confirmee</w:t>
+              <w:t>Confirmée</w:t>
             </w:r>
           </w:p>
         </w:tc>
@@ -7114,7 +7114,7 @@
                 <w:color w:val="1A1A1A"/>
                 <w:sz w:val="21"/>
               </w:rPr>
-              <w:t>Partiellement validee</w:t>
+              <w:t>Partiellement validée</w:t>
             </w:r>
           </w:p>
         </w:tc>
@@ -7179,7 +7179,7 @@
                 <w:color w:val="1A1A1A"/>
                 <w:sz w:val="21"/>
               </w:rPr>
-              <w:t>Confirmee</w:t>
+              <w:t>Confirmée</w:t>
             </w:r>
           </w:p>
         </w:tc>
@@ -7222,7 +7222,7 @@
           <w:color w:val="1F4E79"/>
           <w:sz w:val="36"/>
         </w:rPr>
-        <w:t>Campagne Varcadia - Demonstration Appliquee</w:t>
+        <w:t>Campagne Varcadia - Démonstration Appliquee</w:t>
       </w:r>
     </w:p>
     <w:p>
@@ -7238,7 +7238,7 @@
           <w:color w:val="1A1A1A"/>
           <w:sz w:val="24"/>
         </w:rPr>
-        <w:t>Ce chapitre constitue l'apport le plus original et le plus concret de ce rapport. Il presente, etape par etape, la strategie et l'execution de la campagne de lancement du parc de jeux Varcadia a Soualem, conduite conjointement par les agences Widma Digitale et Volcano Vision, du brief initial jusqu'aux resultats enregistres a l'ouverture. Une attention particuliere est accordee a l'analyse des deux videos qui ont structure le dispositif creatif, ainsi qu'au detail chiffre des performances obtenues.</w:t>
+        <w:t>Ce chapitre constitué l'apport le plus original et le plus concret de ce rapport. Il présenté, étape par étape, la stratégie et l'execution de la campagne de lancement du parc de jeux Varcadia à Soualem, conduite conjointement par les agences Widma Digitale et Volcano Vision, du brief initial jusqu'aux résultats enregistres à l'ouverture. Une attention particulière est accordee à l'analysé des deux videos qui ont structure le dispositif créatif, ainsi qu'au détail chiffre des performances obtenues.</w:t>
       </w:r>
     </w:p>
     <w:p>
@@ -7269,7 +7269,7 @@
           <w:color w:val="1A1A1A"/>
           <w:sz w:val="24"/>
         </w:rPr>
-        <w:t>Varcadia est un parc de jeux et de loisirs indoor implante a Soualem, dans la region de Casablanca-Settat. Destine principalement aux familles avec enfants, aux jeunes adultes et aux groupes scolaires, il propose un ensemble d'activites recreatives dans un environnement moderne et securise. Son positionnement vise a s'imposer comme la principale destination de loisirs de la region, en repondant a un besoin clairement identifie sur un marche local peu pourvu en infrastructures de ce type.</w:t>
+        <w:t>Varcadia est un parc de jeux et de loisirs indoor implante à Soualem, dans la région de Casablanca-Settat. Destine principalement aux familles avec enfants, aux jeunes adultes et aux groupes scolaires, il propose un ensemble d'activités recreatives dans un environnement moderne et securise. Son positionnement vise à s'imposer comme la principale destination de loisirs de la région, en répondant à un besoin clairement identifié sur un marché local peu pourvu en infrastructures de ce type.</w:t>
       </w:r>
     </w:p>
     <w:p>
@@ -7285,7 +7285,7 @@
           <w:color w:val="1A1A1A"/>
           <w:sz w:val="24"/>
         </w:rPr>
-        <w:t>Le projet a ete confie a nos deux agences dans le cadre d'un mandat complet de communication pour le lancement : de la definition de la strategie de marque a la production des contenus, en passant par la planification media et le pilotage des campagnes publicitaires digitales. Cette mission integrale a offert un terrain ideal pour experimenter une chaine de production entierement augmentee par l'IA.</w:t>
+        <w:t>Le projet à été confie à nos deux agences dans le cadre d'un mandat complet de communication pour le lancement : de la definition de la stratégie de marque à la production des contenus, en passant par la planification media et le pilotage des campagnes publicitaires digitales. Cette mission integrale a offert un terrain ideal pour experimenter une chaîne de production entièrement augmentee par l'IA.</w:t>
       </w:r>
     </w:p>
     <w:p>
@@ -7334,7 +7334,7 @@
                 <w:color w:val="FFFFFF"/>
                 <w:sz w:val="21"/>
               </w:rPr>
-              <w:t>Element</w:t>
+              <w:t>Élément</w:t>
             </w:r>
           </w:p>
         </w:tc>
@@ -7444,7 +7444,7 @@
                 <w:color w:val="1A1A1A"/>
                 <w:sz w:val="21"/>
               </w:rPr>
-              <w:t>Soualem, region Casablanca-Settat</w:t>
+              <w:t>Soualem, région Casablanca-Settat</w:t>
             </w:r>
           </w:p>
         </w:tc>
@@ -7576,7 +7576,7 @@
                 <w:color w:val="1A1A1A"/>
                 <w:sz w:val="21"/>
               </w:rPr>
-              <w:t>Strategie de marque, production, media, pilotage</w:t>
+              <w:t>Stratégie de marque, production, media, pilotage</w:t>
             </w:r>
           </w:p>
         </w:tc>
@@ -7731,7 +7731,7 @@
           <w:color w:val="2E75B6"/>
           <w:sz w:val="25"/>
         </w:rPr>
-        <w:t>6.1.1  Analyse du marche local</w:t>
+        <w:t>6.1.1  Analysé du marché local</w:t>
       </w:r>
     </w:p>
     <w:p>
@@ -7747,7 +7747,7 @@
           <w:color w:val="1A1A1A"/>
           <w:sz w:val="24"/>
         </w:rPr>
-        <w:t>Soualem et sa region connaissent une dynamique demographique et urbaine soutenue, portee par la proximite de l'axe Casablanca-Berrechid et par l'installation progressive de jeunes familles. Or l'offre de loisirs indoor securises pour enfants et familles y demeure limitee : les habitants doivent souvent se deplacer vers les grands centres urbains pour acceder a ce type d'activites. Cette tension entre une demande latente et une offre insuffisante constitue le socle de l'opportunite saisie par Varcadia.</w:t>
+        <w:t>Soualem et sa région connaissent une dynamique démographique et urbaine soutenue, portee par la proximite de l'axe Casablanca-Berrechid et par l'installation progressive de jeunes familles. Or l'offre de loisirs indoor securises pour enfants et familles y demeure limitee : les habitants doivent souvent se déplacer vers les grands centres urbains pour acceder à ce type d'activités. Cette tension entre une demande latente et une offre insuffisante constitué le socle de l'opportunite saisie par Varcadia.</w:t>
       </w:r>
     </w:p>
     <w:p>
@@ -7763,7 +7763,7 @@
           <w:color w:val="1A1A1A"/>
           <w:sz w:val="24"/>
         </w:rPr>
-        <w:t>La cible se caracterise par une forte presence sur les reseaux sociaux, une consommation video majoritairement mobile et une sensibilite elevee aux recommandations de proximite (famille, amis, voisinage). Ces traits ont directement oriente nos choix : priorite a la video courte verticale, ciblage geographique resserre et activation du bouche-a-oreille par des contenus partageables.</w:t>
+        <w:t>La cible se caracterise par une forte presence sur les réseaux sociaux, une consommation video majoritairement mobile et une sensibilite elevee aux recommandations de proximite (famille, amis, voisinage). Ces traits ont directement oriente nos choix : priorite à la video courte verticale, ciblage geographique resserre et activation du bouche-a-oreille par des contenus partageables.</w:t>
       </w:r>
     </w:p>
     <w:p>
@@ -7778,7 +7778,7 @@
           <w:color w:val="2E75B6"/>
           <w:sz w:val="25"/>
         </w:rPr>
-        <w:t>6.1.2  Analyse SWOT du projet</w:t>
+        <w:t>6.1.2  Analysé SWOT du projet</w:t>
       </w:r>
     </w:p>
     <w:p>
@@ -7794,7 +7794,7 @@
           <w:color w:val="1F4E79"/>
           <w:sz w:val="20"/>
         </w:rPr>
-        <w:t>Tableau 6.1bis - Analyse SWOT du projet Varcadia (1/2)</w:t>
+        <w:t>Tableau 6.1bis - Analysé SWOT du projet Varcadia (1/2)</w:t>
       </w:r>
     </w:p>
     <w:tbl>
@@ -7981,7 +7981,7 @@
                 <w:color w:val="1A1A1A"/>
                 <w:sz w:val="21"/>
               </w:rPr>
-              <w:t>Notoriete a construire de zero</w:t>
+              <w:t>Notoriété à construire de zero</w:t>
             </w:r>
           </w:p>
         </w:tc>
@@ -8005,7 +8005,7 @@
           <w:color w:val="1F4E79"/>
           <w:sz w:val="20"/>
         </w:rPr>
-        <w:t>Tableau 6.1ter - Analyse SWOT du projet Varcadia (2/2)</w:t>
+        <w:t>Tableau 6.1ter - Analysé SWOT du projet Varcadia (2/2)</w:t>
       </w:r>
     </w:p>
     <w:tbl>
@@ -8083,7 +8083,7 @@
                 <w:color w:val="1A1A1A"/>
                 <w:sz w:val="21"/>
               </w:rPr>
-              <w:t>Croissance demographique de la region</w:t>
+              <w:t>Croissance démographique de la région</w:t>
             </w:r>
           </w:p>
         </w:tc>
@@ -8127,7 +8127,7 @@
                 <w:color w:val="1A1A1A"/>
                 <w:sz w:val="21"/>
               </w:rPr>
-              <w:t>Faible cout des outils d'IA generative</w:t>
+              <w:t>Faible coût des outils d'IA générative</w:t>
             </w:r>
           </w:p>
         </w:tc>
@@ -8216,7 +8216,7 @@
           <w:color w:val="1A1A1A"/>
           <w:sz w:val="24"/>
         </w:rPr>
-        <w:t>Cette lecture SWOT a confirme la pertinence d'une strategie de teasing : transformer la faiblesse initiale (une marque inconnue) en atout, en faisant de l'absence d'information un ressort de curiosite, tout en s'appuyant sur la principale opportunite (un cout de production reduit grace a l'IA) pour compenser un budget media contraint.</w:t>
+        <w:t>Cette lecture SWOT à confirmé la pertinence d'une stratégie de teasing : transformer la faiblesse initiale (une marque inconnue) en atout, en faisant de l'absence d'information un ressort de curiosité, tout en s'appuyant sur la principale opportunite (un coût de production réduit grâce à l'IA) pour compenser un budget media contraint.</w:t>
       </w:r>
     </w:p>
     <w:p>
@@ -8231,7 +8231,7 @@
           <w:color w:val="1F4E79"/>
           <w:sz w:val="28"/>
         </w:rPr>
-        <w:t>6.2  Strategie de lancement : le choix du teasing</w:t>
+        <w:t>6.2  Stratégie de lancement : le choix du teasing</w:t>
       </w:r>
     </w:p>
     <w:p>
@@ -8247,7 +8247,7 @@
           <w:color w:val="1A1A1A"/>
           <w:sz w:val="24"/>
         </w:rPr>
-        <w:t>Apres analyse du marche local et des comportements de la cible, nous avons opte pour une strategie de lancement en deux temps distincts : une phase de teasing d'un mois, suivie d'une phase de devoilement coincidant avec l'ouverture officielle du parc.</w:t>
+        <w:t>Après analysé du marché local et des comportements de la cible, nous avons opte pour une stratégie de lancement en deux temps distincts : une phase de teasing d'un mois, suivie d'une phase de dévoilement coincidant avec l'ouverture officielle du parc.</w:t>
       </w:r>
     </w:p>
     <w:p>
@@ -8263,7 +8263,7 @@
           <w:color w:val="1A1A1A"/>
           <w:sz w:val="24"/>
         </w:rPr>
-        <w:t>Le teasing est une technique marketing qui consiste a susciter la curiosite et l'anticipation du public avant la revelation d'un produit ou d'un evenement. Son efficacite repose sur la creation d'un sentiment de manque et d'impatience qui amplifie l'impact de la revelation finale. Dans le contexte d'un lancement local, avec un budget media limite, cette approche presentait l'avantage de maximiser l'engagement organique et le bouche-a-oreille, reduisant ainsi le cout d'acquisition de notoriete.</w:t>
+        <w:t>Le teasing est une technique marketing qui consiste à susciter la curiosité et l'anticipation du public avant la revelation d'un produit où d'un événement. Son efficacité repose sur la creation d'un sentiment de manque et d'impatience qui amplifie l'impact de la revelation finale. Dans le contexte d'un lancement local, avec un budget media limite, cette approche presentait l'avantage de maximiser l'engagement organique et le bouche-a-oreille, reduisant ainsi le coût d'acquisition de notoriété.</w:t>
       </w:r>
     </w:p>
     <w:p>
@@ -8279,7 +8279,7 @@
           <w:color w:val="1A1A1A"/>
           <w:sz w:val="24"/>
         </w:rPr>
-        <w:t>La cible principale de la campagne a ete definie comme suit : les parents de jeunes enfants (25-45 ans), les jeunes adultes (15-30 ans) et les habitants de Soualem et de la region de Casablanca, avec une extension geographique aux communes environnantes pour la phase digitale. A cette segmentation s'est ajoutee une logique de phasage temporel, resumee dans le retroplanning ci-dessous.</w:t>
+        <w:t>La cible principale de la campagne à été définie comme suit : les parents de jeunes enfants (25-45 ans), les jeunes adultes (15-30 ans) et les habitants de Soualem et de la région de Casablanca, avec une extension geographique aux communes environnantes pour la phase digitale. À cette segmentation s'est ajoutee une logique de phasage temporel, resumee dans le retroplanning ci-dessous.</w:t>
       </w:r>
     </w:p>
     <w:p>
@@ -8396,7 +8396,7 @@
                 <w:color w:val="FFFFFF"/>
                 <w:sz w:val="21"/>
               </w:rPr>
-              <w:t>Contenu cle</w:t>
+              <w:t>Contenu clé</w:t>
             </w:r>
           </w:p>
         </w:tc>
@@ -8440,7 +8440,7 @@
                 <w:color w:val="1A1A1A"/>
                 <w:sz w:val="21"/>
               </w:rPr>
-              <w:t>J-30 a J-20</w:t>
+              <w:t>J-30 à J-20</w:t>
             </w:r>
           </w:p>
         </w:tc>
@@ -8526,7 +8526,7 @@
                 <w:color w:val="1A1A1A"/>
                 <w:sz w:val="21"/>
               </w:rPr>
-              <w:t>J-20 a J-7</w:t>
+              <w:t>J-20 à J-7</w:t>
             </w:r>
           </w:p>
         </w:tc>
@@ -8568,7 +8568,7 @@
                 <w:color w:val="1A1A1A"/>
                 <w:sz w:val="21"/>
               </w:rPr>
-              <w:t>Declinaisons, posts compte a rebours</w:t>
+              <w:t>Declinaisons, posts compte à rebours</w:t>
             </w:r>
           </w:p>
         </w:tc>
@@ -8612,7 +8612,7 @@
                 <w:color w:val="1A1A1A"/>
                 <w:sz w:val="21"/>
               </w:rPr>
-              <w:t>J-7 a J-1</w:t>
+              <w:t>J-7 à J-1</w:t>
             </w:r>
           </w:p>
         </w:tc>
@@ -8677,7 +8677,7 @@
                 <w:color w:val="1A1A1A"/>
                 <w:sz w:val="21"/>
               </w:rPr>
-              <w:t>Devoilement</w:t>
+              <w:t>Dévoilement</w:t>
             </w:r>
           </w:p>
         </w:tc>
@@ -8784,7 +8784,7 @@
                 <w:color w:val="1A1A1A"/>
                 <w:sz w:val="21"/>
               </w:rPr>
-              <w:t>J+1 a J+15</w:t>
+              <w:t>J+1 à J+15</w:t>
             </w:r>
           </w:p>
         </w:tc>
@@ -8849,7 +8849,7 @@
           <w:color w:val="1F4E79"/>
           <w:sz w:val="28"/>
         </w:rPr>
-        <w:t>6.3  Production du contenu : un teaser hybride realite et IA</w:t>
+        <w:t>6.3  Production du contenu : un teaser hybride réalité et IA</w:t>
       </w:r>
     </w:p>
     <w:p>
@@ -8865,7 +8865,7 @@
           <w:color w:val="1A1A1A"/>
           <w:sz w:val="24"/>
         </w:rPr>
-        <w:t>La production des contenus a constitue le coeur creatif du projet. Nous avons fait le choix d'un format hybride, combinant des sequences filmees en conditions reelles au sein du parc avec des elements visuels generes par intelligence artificielle. Ce choix strategique repondait a deux imperatifs complementaires : l'authenticite, indispensable pour que le public local se sente concerne et croie en la realite du projet, et la dimension spectaculaire, necessaire pour se demarquer dans un environnement ou les contenus se multiplient et ou l'attention est rare.</w:t>
+        <w:t>La production des contenus à constitué le coeur créatif du projet. Nous avons fait le choix d'un format hybride, combinant des sequences filmees en conditions réelles au sein du parc avec des éléments visuels générés par intelligence artificielle. Ce choix stratégique repondait à deux imperatifs complémentaires : l'authenticite, indispensable pour que le public local se sente concerne et croie en la réalité du projet, et la dimension spectaculaire, necessaire pour se démarquer dans un environnement où les contenus se multiplient et où l'attention est rare.</w:t>
       </w:r>
     </w:p>
     <w:p>
@@ -8881,7 +8881,7 @@
           <w:color w:val="1A1A1A"/>
           <w:sz w:val="24"/>
         </w:rPr>
-        <w:t>Les sequences reelles ont ete tournees au sein du parc Varcadia, en capturant les espaces, les jeux et l'ambiance du lieu. Elles ont ete deliberement gardees partielles et volontairement floues dans leur premiere diffusion, de facon a alimenter la curiosite sans tout reveler. Les elements generes par IA ont ete produits a l'aide de Kling AI et de Nano Banana Pro, selon le processus iteratif decrit ci-apres.</w:t>
+        <w:t>Les sequences réelles ont été tournees au sein du parc Varcadia, en capturant les espaces, les jeux et l'ambiance du lieu. Elles ont été deliberement gardees partielles et volontairement floues dans leur première diffusion, de façon à alimenter la curiosité sans tout révéler. Les éléments générés par IA ont été produits à l'aide de Kling AI et de Nano Banana Pro, selon le processus iteratif décrit ci-après.</w:t>
       </w:r>
     </w:p>
     <w:p>
@@ -8897,7 +8897,7 @@
           <w:color w:val="1A1A1A"/>
           <w:sz w:val="24"/>
         </w:rPr>
-        <w:t>Le processus de production a necessite plusieurs cycles d'iteration. Pour chaque sequence generee par IA, nous avons redige des prompts precis, evalue le resultat, affine les instructions et regenere jusqu'a obtenir le rendu souhaite. Ce processus de prompt engineering, bien que demandant une certaine maitrise technique, s'est revele nettement plus rapide et moins couteux qu'un tournage conventionnel equivalent. A titre indicatif, la production des deux videos a mobilise une equipe de trois personnes sur environ deux semaines, la ou une production traditionnelle equivalente (tournage, effets speciaux, post-production) aurait demande des moyens sensiblement superieurs.</w:t>
+        <w:t>Le processus de production à necessite plusieurs cycles d'iteration. Pour chaque sequence générée par IA, nous avons rédigé des prompts precis, évalué le résultat, affine les instructions et regenere jusqu'à obtenir le rendu souhaite. Ce processus de prompt engineering, bien que demandant une certaine maitrise technique, s'est révèle nettement plus rapide et moins coûteux qu'un tournage conventionnel equivalent. À titre indicatif, la production des deux videos à mobilise une équipe de trois personnes sur environ deux semaines, la où une production traditionnelle equivalente (tournage, effets speciaux, post-production) aurait demande des moyens sensiblement superieurs.</w:t>
       </w:r>
     </w:p>
     <w:p>
@@ -8928,7 +8928,7 @@
           <w:color w:val="1A1A1A"/>
           <w:sz w:val="24"/>
         </w:rPr>
-        <w:t>La qualite des sequences generees par IA depend directement de la precision des instructions (prompts) fournies aux modeles. Nous avons adopte une methode iterative en quatre temps : formuler un prompt detaille, generer plusieurs variantes, evaluer le rendu au regard de l'intention creative, puis affiner le prompt jusqu'a obtenir le resultat souhaite. Un prompt efficace, dans notre experience, decrit simultanement le sujet, l'ambiance, le mouvement de camera, l'eclairage et le style visuel recherche.</w:t>
+        <w:t>La qualité des sequences générées par IA depend directement de la precision des instructions (prompts) fournies aux modèles. Nous avons adopté une méthode iterative en quatre temps : formuler un prompt détaillé, generer plusieurs variantes, evaluer le rendu au regard de l'intention créative, puis affiner le prompt jusqu'à obtenir le résultat souhaite. Un prompt efficace, dans notre expérience, décrit simultanement le sujet, l'ambiance, le mouvement de camera, l'eclairage et le style visuel recherche.</w:t>
       </w:r>
     </w:p>
     <w:p>
@@ -9082,7 +9082,7 @@
                 <w:color w:val="1A1A1A"/>
                 <w:sz w:val="21"/>
               </w:rPr>
-              <w:t>Jeune homme avachi sur un canape, lumiere froide et plate, ambiance morose, plan fixe</w:t>
+              <w:t>Jeune homme avachi sur un canape, lumière froide et plate, ambiance morose, plan fixe</w:t>
             </w:r>
           </w:p>
         </w:tc>
@@ -9147,7 +9147,7 @@
                 <w:color w:val="1A1A1A"/>
                 <w:sz w:val="21"/>
               </w:rPr>
-              <w:t>Explosion de lumiere blanche eclatante envahissant le cadre, transition energique, fluide</w:t>
+              <w:t>Explosion de lumière blanche eclatante envahissant le cadre, transition énergique, fluide</w:t>
             </w:r>
           </w:p>
         </w:tc>
@@ -9256,7 +9256,7 @@
                 <w:color w:val="1A1A1A"/>
                 <w:sz w:val="21"/>
               </w:rPr>
-              <w:t>Mascotte tirant la bache</w:t>
+              <w:t>Mascotte tirant la bâche</w:t>
             </w:r>
           </w:p>
         </w:tc>
@@ -9277,7 +9277,7 @@
                 <w:color w:val="1A1A1A"/>
                 <w:sz w:val="21"/>
               </w:rPr>
-              <w:t>Grande mascotte sympathique tirant une immense bache sur un batiment, geste ample, fluide</w:t>
+              <w:t>Grande mascotte sympathique tirant une immense bâche sur un bâtiment, geste ample, fluide</w:t>
             </w:r>
           </w:p>
         </w:tc>
@@ -9342,7 +9342,7 @@
                 <w:color w:val="1A1A1A"/>
                 <w:sz w:val="21"/>
               </w:rPr>
-              <w:t>Travelling avant franchissant l'entree d'un parc festif, foule joyeuse, lumieres</w:t>
+              <w:t>Travelling avant franchissant l'entree d'un parc festif, foule joyeuse, lumières</w:t>
             </w:r>
           </w:p>
         </w:tc>
@@ -9387,7 +9387,7 @@
           <w:color w:val="1A1A1A"/>
           <w:sz w:val="24"/>
         </w:rPr>
-        <w:t>Ce travail de prompt engineering, loin d'etre purement technique, releve d'une veritable direction artistique : il s'agit de traduire une intention creative en langage exploitable par la machine. Les sequences les plus exigeantes, comme l'animation de la mascotte tirant la bache, ont demande le plus grand nombre d'iterations, confirmant que les mouvements complexes restent le point le plus delicat de la generation video par IA.</w:t>
+        <w:t>Ce travail de prompt engineering, loin d'être purement technique, releve d'une veritable direction artistique : il s'agit de traduire une intention créative en langage exploitable par la machine. Les sequences les plus exigeantes, comme l'animation de la mascotte tirant la bâche, ont demande le plus grand nombre d'iterations, confirmant que les mouvements complexes restent le point le plus delicat de la generation video par IA.</w:t>
       </w:r>
     </w:p>
     <w:p>
@@ -9402,7 +9402,7 @@
           <w:color w:val="1F4E79"/>
           <w:sz w:val="28"/>
         </w:rPr>
-        <w:t>6.4  Analyse des deux videos de la campagne</w:t>
+        <w:t>6.4  Analysé des deux videos de la campagne</w:t>
       </w:r>
     </w:p>
     <w:p>
@@ -9418,7 +9418,7 @@
           <w:color w:val="1A1A1A"/>
           <w:sz w:val="24"/>
         </w:rPr>
-        <w:t>Deux videos ont porte l'ensemble du dispositif creatif. La premiere, diffusee pendant la phase de teasing, repose sur un ressort narratif d'evasion ; la seconde, diffusee au moment du devoilement, met en scene une mascotte qui revele physiquement le parc. Nous analysons ci-dessous chacune de ces videos sous quatre angles : le concept, le decoupage (storyboard), la lecture semiotique et la production technique.</w:t>
+        <w:t>Deux videos ont porte l'ensemble du dispositif créatif. La première, diffusée pendant la phase de teasing, repose sur un ressort narratif d'evasion ; la seconde, diffusée au moment du dévoilement, met en scene une mascotte qui révèle physiquement le parc. Nous analysons ci-dessous chacune de ces videos sous quatre angles : le concept, le découpage (storyboard), la lecture semiotique et la production technique.</w:t>
       </w:r>
     </w:p>
     <w:p>
@@ -9459,7 +9459,7 @@
           <w:color w:val="1A1A1A"/>
           <w:sz w:val="24"/>
         </w:rPr>
-        <w:t xml:space="preserve"> La premiere video raconte une micro-histoire universelle et immediatement identifiable. Un jeune homme, seul chez lui un jour de week-end, s'ennuie profondement. Affale sur son canape, il fait defiler son telephone sans interet, ne sachant pas quoi faire de sa journee. Le quotidien est gris, monotone, sans relief. Soudain, un flash de lumiere intense envahit l'ecran : en une fraction de seconde, le personnage est arrache a son salon et projete dans l'univers vibrant et colore de Varcadia. La video se referme sur la signature de la marque : &lt;&lt; Varcadia, soon a Soualem &gt;&gt;.</w:t>
+        <w:t xml:space="preserve"> La première video raconte une micro-histoire universelle et immediatement identifiable. Un jeune homme, seul chez lui un jour de week-end, s'ennuie profondement. Affale sur son canape, il fait defiler son telephone sans intérêt, ne sachant pas quoi faire de sa journee. Le quotidien est gris, monotone, sans relief. Soudain, un flash de lumière intense envahit l'écran : en une fraction de seconde, le personnage est arrache à son salon et projete dans l'univers vibrant et colore de Varcadia. La video se referme sur la signature de la marque : &lt;&lt; Varcadia, soon à Soualem &gt;&gt;.</w:t>
       </w:r>
     </w:p>
     <w:p>
@@ -9475,7 +9475,7 @@
           <w:color w:val="1A1A1A"/>
           <w:sz w:val="24"/>
         </w:rPr>
-        <w:t>Le choix de ce scenario n'est pas anodin. Il repose sur un insight comportemental fort : l'ennui du week-end et la difficulte a trouver des activites de loisirs dans la region constituent une frustration reelle de la cible. En mettant en scene ce probleme avant de presenter Varcadia comme la solution liberatrice, la video cree une identification immediate et positionne implicitement le parc comme la reponse a un manque ressenti.</w:t>
+        <w:t>Le choix de ce scenario n'est pas anodin. Il repose sur un insight comportemental fort : l'ennui du week-end et la difficulte à trouver des activités de loisirs dans la région constituent une frustration réelle de la cible. En mettant en scene ce problème avant de presenter Varcadia comme la solution liberatrice, la video créé une identification immediate et positionne implicitement le parc comme la réponse à un manque ressenti.</w:t>
       </w:r>
     </w:p>
     <w:p>
@@ -9491,7 +9491,7 @@
           <w:color w:val="1F4E79"/>
           <w:sz w:val="20"/>
         </w:rPr>
-        <w:t>Tableau 6.3 - Decoupage (storyboard) de la Video 1 - version 20 secondes</w:t>
+        <w:t>Tableau 6.3 - Découpage (storyboard) de la Video 1 - version 20 secondes</w:t>
       </w:r>
     </w:p>
     <w:tbl>
@@ -9657,7 +9657,7 @@
                 <w:color w:val="1A1A1A"/>
                 <w:sz w:val="21"/>
               </w:rPr>
-              <w:t>Jeune homme avachi sur le canape, lumiere terne, telephone a la main</w:t>
+              <w:t>Jeune homme avachi sur le canape, lumière terne, telephone à la main</w:t>
             </w:r>
           </w:p>
         </w:tc>
@@ -10001,7 +10001,7 @@
                 <w:color w:val="1A1A1A"/>
                 <w:sz w:val="21"/>
               </w:rPr>
-              <w:t>Transition : le salon se desintegre, l'univers Varcadia se materialise (genere Kling AI)</w:t>
+              <w:t>Transition : le salon se desintegre, l'univers Varcadia se materialise (généré Kling AI)</w:t>
             </w:r>
           </w:p>
         </w:tc>
@@ -10022,7 +10022,7 @@
                 <w:color w:val="1A1A1A"/>
                 <w:sz w:val="21"/>
               </w:rPr>
-              <w:t>Musique energique, montee</w:t>
+              <w:t>Musique énergique, montee</w:t>
             </w:r>
           </w:p>
         </w:tc>
@@ -10087,7 +10087,7 @@
                 <w:color w:val="1A1A1A"/>
                 <w:sz w:val="21"/>
               </w:rPr>
-              <w:t>Le personnage, emerveille, decouvre les jeux, couleurs et lumieres du parc</w:t>
+              <w:t>Le personnage, emerveille, découvre les jeux, couleurs et lumières du parc</w:t>
             </w:r>
           </w:p>
         </w:tc>
@@ -10173,7 +10173,7 @@
                 <w:color w:val="1A1A1A"/>
                 <w:sz w:val="21"/>
               </w:rPr>
-              <w:t>Logo Varcadia + signature &lt;&lt; soon a Soualem &gt;&gt;</w:t>
+              <w:t>Logo Varcadia + signature &lt;&lt; soon à Soualem &gt;&gt;</w:t>
             </w:r>
           </w:p>
         </w:tc>
@@ -10228,7 +10228,7 @@
           <w:color w:val="1A1A1A"/>
           <w:sz w:val="24"/>
         </w:rPr>
-        <w:t xml:space="preserve"> La video est construite sur une opposition visuelle et emotionnelle forte entre deux mondes. Le premier, celui du quotidien, est traite dans des tons froids et desatures, avec une lumiere plate et un cadrage statique qui traduisent l'enfermement et l'ennui. Le second, celui de Varcadia, eclate de couleurs chaudes et saturees, de mouvement et de lumiere, dans un montage rythme. Le flash lumineux joue le role de pivot narratif : il symbolise la rupture, le passage, la promesse d'une transformation. Cette structure en deux temps (manque puis comblement) reprend les ressorts classiques du recit publicitaire, ici condenses en quelques secondes.</w:t>
+        <w:t xml:space="preserve"> La video est construite sur une opposition visuelle et émotionnelle forte entre deux mondes. Le premier, celui du quotidien, est traite dans des tons froids et desatures, avec une lumière plate et un cadrage statique qui traduisent l'enfermement et l'ennui. Le second, celui de Varcadia, eclate de couleurs chaudes et saturees, de mouvement et de lumière, dans un montage rythme. Le flash lumineux joue le rôle de pivot narratif : il symbolise la rupture, le passage, la promesse d'une transformation. Cette structure en deux temps (manque puis comblement) reprend les ressorts classiques du récit publicitaire, ici condenses en quelques secondes.</w:t>
       </w:r>
     </w:p>
     <w:p>
@@ -10244,7 +10244,7 @@
           <w:color w:val="1A1A1A"/>
           <w:sz w:val="24"/>
         </w:rPr>
-        <w:t>L'absence volontaire de toute image complete et nette du parc dans la phase de teasing entretient le mystere : le spectateur entrevoit Varcadia comme un univers desirable sans en saisir tous les details, ce qui nourrit la curiosite. La formule &lt;&lt; soon a Soualem &gt;&gt;, en melant un mot anglais a une localisation tres locale, cree un contraste qui ancre la modernite du lieu dans un territoire de proximite, tout en installant le compte a rebours implicite de l'ouverture.</w:t>
+        <w:t>L'absence volontaire de toute image complet et nette du parc dans la phase de teasing entretient le mystere : le spectateur entrevoit Varcadia comme un univers desirable sans en saisir tous les détails, ce qui nourrit la curiosité. La formule &lt;&lt; soon à Soualem &gt;&gt;, en melant un mot anglais à une localisation très locale, créé un contraste qui ancré la modernite du lieu dans un territoire de proximite, tout en installant le compte à rebours implicite de l'ouverture.</w:t>
       </w:r>
     </w:p>
     <w:p>
@@ -10270,7 +10270,7 @@
           <w:color w:val="1A1A1A"/>
           <w:sz w:val="24"/>
         </w:rPr>
-        <w:t xml:space="preserve"> La sequence d'ouverture (le jeune homme chez lui) a ete tournee en prises reelles, afin de garantir l'authenticite de l'emotion et la proximite avec la cible. La transition et l'univers immersif de Varcadia ont ete generes avec Kling AI, a partir d'images de reference du parc et de prompts decrivant l'ambiance recherchee (mouvements de camera fluides, explosion de couleurs, sensation d'immersion). Le flash de transition, element charniere de la video, a fait l'objet de plusieurs iterations afin d'obtenir un effet a la fois spectaculaire et fluide. Nano Banana Pro a assure le montage final, la synchronisation avec la bande sonore et la declinaison en trois durees (6 secondes pour le format bumper, 15 et 30 secondes pour les formats in-stream et sociaux).</w:t>
+        <w:t xml:space="preserve"> La sequence d'ouverture (le jeune homme chez lui) à été tournee en prises réelles, afin de garantir l'authenticite de l'émotion et la proximite avec la cible. La transition et l'univers immersif de Varcadia ont été générés avec Kling AI, à partir d'images de référence du parc et de prompts decrivant l'ambiance recherchee (mouvements de camera fluides, explosion de couleurs, sensation d'immersion). Le flash de transition, élément charniere de la video, à fait l'objet de plusieurs iterations afin d'obtenir un effet à la fois spectaculaire et fluide. Nano Banana Pro a assure le montage final, la synchronisation avec la bande sonore et la declinaison en trois durees (6 secondes pour le format bumper, 15 et 30 secondes pour les formats in-stream et sociaux).</w:t>
       </w:r>
     </w:p>
     <w:p>
@@ -10286,7 +10286,7 @@
           <w:color w:val="1A1A1A"/>
           <w:sz w:val="24"/>
         </w:rPr>
-        <w:t>Role dans le dispositif.</w:t>
+        <w:t>Rôle dans le dispositif.</w:t>
       </w:r>
       <w:r>
         <w:rPr>
@@ -10296,7 +10296,7 @@
           <w:color w:val="1A1A1A"/>
           <w:sz w:val="24"/>
         </w:rPr>
-        <w:t xml:space="preserve"> Cette video a constitue la piece maitresse de la phase de teasing. Diffusee en priorite sur YouTube Ads et en Reels sur Meta, elle avait pour objectif de maximiser la notoriete et de generer un volume de vues eleve, tout en installant le nom de Varcadia dans l'esprit du public sans en devoiler le contenu reel.</w:t>
+        <w:t xml:space="preserve"> Cette video à constitué la pièce maitresse de la phase de teasing. Diffusée en priorite sur YouTube Ads et en Réels sur Meta, elle avait pour objectif de maximiser la notoriété et de generer un volume de vues eleve, tout en installant le nom de Varcadia dans l'esprit du public sans en dévoiler le contenu réel.</w:t>
       </w:r>
     </w:p>
     <w:p>
@@ -10311,7 +10311,7 @@
           <w:color w:val="2E75B6"/>
           <w:sz w:val="25"/>
         </w:rPr>
-        <w:t>6.4.2  Video 2 - Le devoilement : &lt;&lt; La Mascotte &gt;&gt;</w:t>
+        <w:t>6.4.2  Video 2 - Le dévoilement : &lt;&lt; La Mascotte &gt;&gt;</w:t>
       </w:r>
     </w:p>
     <w:p>
@@ -10337,7 +10337,7 @@
           <w:color w:val="1A1A1A"/>
           <w:sz w:val="24"/>
         </w:rPr>
-        <w:t xml:space="preserve"> La seconde video marque le basculement de la campagne, du mystere a la revelation. Elle met en scene une grande mascotte, directement inspiree du logo de Varcadia, qui devient ainsi le personnage incarnant la marque. Dans un geste theatral et spectaculaire, la mascotte saisit une immense bache recouvrant le batiment du parc et la tire d'un coup, devoilant Varcadia au grand jour. La camera, dans un mouvement continu, franchit alors les portes et penetre a l'interieur de l'univers du parc, offrant au spectateur la decouverte tant attendue depuis la phase de teasing.</w:t>
+        <w:t xml:space="preserve"> La seconde video marque le basculement de la campagne, du mystere à la revelation. Elle met en scene une grande mascotte, directement inspiree du logo de Varcadia, qui devient ainsi le personnage incarnant la marque. Dans un geste theatral et spectaculaire, la mascotte saisit une immense bâche recouvrant le bâtiment du parc et la tire d'un coup, devoilant Varcadia au grand jour. La camera, dans un mouvement continu, franchit alors les portes et penetre à l'interieur de l'univers du parc, offrant au spectateur la découverte tant attendue depuis la phase de teasing.</w:t>
       </w:r>
     </w:p>
     <w:p>
@@ -10353,7 +10353,7 @@
           <w:color w:val="1A1A1A"/>
           <w:sz w:val="24"/>
         </w:rPr>
-        <w:t>La encore, le choix creatif obeit a une logique precise. Apres un mois passe a entretenir le mystere, il fallait offrir une revelation a la hauteur de l'attente construite. Le geste de devoilement de la bache fonctionne comme le paiement de la promesse du teaser : ce qui etait cache, flou, suggere, devient enfin visible. L'introduction de la mascotte, par ailleurs, dote la marque d'un visage et d'une personnalite, atouts precieux pour une destination de loisirs familiale qui cherche a creer un lien affectif durable avec son public.</w:t>
+        <w:t>La encore, le choix créatif obeit à une logique precise. Après un mois passe à entretenir le mystere, il fallait offrir une revelation à la hauteur de l'attente construite. Le geste de dévoilement de la bâche fonctionne comme le paiement de la promesse du teaser : ce qui était cache, flou, suggere, devient enfin visible. L'introduction de la mascotte, par ailleurs, dote la marque d'un visage et d'une personnalite, atouts precieux pour une destination de loisirs familiale qui cherche à créer un lien affectif durable avec son public.</w:t>
       </w:r>
     </w:p>
     <w:p>
@@ -10369,7 +10369,7 @@
           <w:color w:val="1F4E79"/>
           <w:sz w:val="20"/>
         </w:rPr>
-        <w:t>Tableau 6.4 - Decoupage (storyboard) de la Video 2 - version 28 secondes</w:t>
+        <w:t>Tableau 6.4 - Découpage (storyboard) de la Video 2 - version 28 secondes</w:t>
       </w:r>
     </w:p>
     <w:tbl>
@@ -10535,7 +10535,7 @@
                 <w:color w:val="1A1A1A"/>
                 <w:sz w:val="21"/>
               </w:rPr>
-              <w:t>Plan large du batiment entierement recouvert d'une grande bache mysterieuse</w:t>
+              <w:t>Plan large du bâtiment entièrement recouvert d'une grande bâche mysterieuse</w:t>
             </w:r>
           </w:p>
         </w:tc>
@@ -10621,7 +10621,7 @@
                 <w:color w:val="1A1A1A"/>
                 <w:sz w:val="21"/>
               </w:rPr>
-              <w:t>Arrivee de la mascotte Varcadia, en grand, face au batiment</w:t>
+              <w:t>Arrivee de la mascotte Varcadia, en grand, face au bâtiment</w:t>
             </w:r>
           </w:p>
         </w:tc>
@@ -10642,7 +10642,7 @@
                 <w:color w:val="1A1A1A"/>
                 <w:sz w:val="21"/>
               </w:rPr>
-              <w:t>Theme musical de la marque</w:t>
+              <w:t>Thème musical de la marque</w:t>
             </w:r>
           </w:p>
         </w:tc>
@@ -10707,7 +10707,7 @@
                 <w:color w:val="1A1A1A"/>
                 <w:sz w:val="21"/>
               </w:rPr>
-              <w:t>La mascotte saisit la bache des deux mains, prise d'elan</w:t>
+              <w:t>La mascotte saisit la bâche des deux mains, prise d'elan</w:t>
             </w:r>
           </w:p>
         </w:tc>
@@ -10793,7 +10793,7 @@
                 <w:color w:val="1A1A1A"/>
                 <w:sz w:val="21"/>
               </w:rPr>
-              <w:t>Geste ample : la bache est tiree et tombe, le parc se devoile</w:t>
+              <w:t>Geste ample : la bâche est tiree et tombe, le parc se dévoilé</w:t>
             </w:r>
           </w:p>
         </w:tc>
@@ -10879,7 +10879,7 @@
                 <w:color w:val="1A1A1A"/>
                 <w:sz w:val="21"/>
               </w:rPr>
-              <w:t>Travelling avant : la camera entre dans l'univers Varcadia (genere Kling AI)</w:t>
+              <w:t>Travelling avant : la camera entre dans l'univers Varcadia (généré Kling AI)</w:t>
             </w:r>
           </w:p>
         </w:tc>
@@ -10965,7 +10965,7 @@
                 <w:color w:val="1A1A1A"/>
                 <w:sz w:val="21"/>
               </w:rPr>
-              <w:t>Decouverte des espaces, jeux et lumieres, foule joyeuse</w:t>
+              <w:t>Découverte des espaces, jeux et lumières, foule joyeuse</w:t>
             </w:r>
           </w:p>
         </w:tc>
@@ -10986,7 +10986,7 @@
                 <w:color w:val="1A1A1A"/>
                 <w:sz w:val="21"/>
               </w:rPr>
-              <w:t>Rires, ambiance de fete</w:t>
+              <w:t>Rires, ambiance de fête</w:t>
             </w:r>
           </w:p>
         </w:tc>
@@ -11106,7 +11106,7 @@
           <w:color w:val="1A1A1A"/>
           <w:sz w:val="24"/>
         </w:rPr>
-        <w:t xml:space="preserve"> Le ressort central de cette video est le devoilement, figure rhetorique puissante qui met en scene le passage du cache au visible. La bache fonctionne comme un rideau de theatre : sa chute est un acte d'ouverture, au sens propre comme au sens figure. La mascotte, en accomplissant ce geste, n'est pas un simple element decoratif : elle devient l'agent de la revelation, celui qui invite le public a entrer. Le mouvement de camera qui franchit le seuil du batiment prolonge cette invitation : le spectateur n'observe plus de l'exterieur, il est conduit a l'interieur, comme s'il etait deja sur place. Ce passage du seuil constitue une invitation implicite a la visite physique.</w:t>
+        <w:t xml:space="preserve"> Le ressort central de cette video est le dévoilement, figure rhetorique puissante qui met en scene le passage du cache au visible. La bâche fonctionne comme un rideau de theatre : sa chute est un acte d'ouverture, au sens propre comme au sens figure. La mascotte, en accomplissant ce geste, n'est pas un simple élément decoratif : elle devient l'agent de la revelation, celui qui invite le public à entrer. Le mouvement de camera qui franchit le seuil du bâtiment prolonge cette invitation : le spectateur n'observé plus de l'exterieur, il est conduit à l'interieur, comme s'il était déjà sur place. Ce passage du seuil constitué une invitation implicite à la visite physique.</w:t>
       </w:r>
     </w:p>
     <w:p>
@@ -11122,7 +11122,7 @@
           <w:color w:val="1A1A1A"/>
           <w:sz w:val="24"/>
         </w:rPr>
-        <w:t>La continuite visuelle avec la premiere video est volontaire : on retrouve la meme palette chaude et saturee, la meme energie de montage, le meme univers immersif. Le spectateur qui a vu le teaser reconnait immediatement le monde entrevu, et la promesse formulee par le &lt;&lt; soon a Soualem &gt;&gt; trouve ici sa resolution. La campagne forme ainsi un recit coherent en deux actes : la promesse, puis sa realisation.</w:t>
+        <w:t>La continuite visuelle avec la première video est volontaire : on retrouve la même palette chaude et saturee, la même énergie de montage, le même univers immersif. Le spectateur qui à vu le teaser reconnait immediatement le monde entrevu, et la promesse formulee par le &lt;&lt; soon à Soualem &gt;&gt; trouve ici sa resolution. La campagne forme ainsi un récit cohérent en deux actes : la promesse, puis sa realisation.</w:t>
       </w:r>
     </w:p>
     <w:p>
@@ -11148,7 +11148,7 @@
           <w:color w:val="1A1A1A"/>
           <w:sz w:val="24"/>
         </w:rPr>
-        <w:t xml:space="preserve"> La mascotte a ete concue a partir du logo de Varcadia, puis animee a l'aide de Kling AI afin d'obtenir un mouvement credible et fluide, notamment pour le geste exigeant du retrait de la bache. Le devoilement et l'entree dans l'univers du parc ont egalement ete generes et enrichis par Kling AI, en combinaison avec des prises reelles de l'interieur du parc desormais acheve. Nano Banana Pro a pris en charge l'assemblage, la synchronisation du geste avec les accents musicaux et l'integration des informations pratiques d'ouverture. Comme pour la premiere video, plusieurs cycles d'iteration ont ete necessaires pour fiabiliser l'animation de la mascotte, point techniquement le plus delicat de la production.</w:t>
+        <w:t xml:space="preserve"> La mascotte à été conçue à partir du logo de Varcadia, puis animee à l'aide de Kling AI afin d'obtenir un mouvement credible et fluide, notamment pour le geste exigeant du retrait de la bâche. Le dévoilement et l'entree dans l'univers du parc ont egalement été générés et enrichis par Kling AI, en combinaison avec des prises réelles de l'interieur du parc désormais acheve. Nano Banana Pro à pris en charge l'assemblage, la synchronisation du geste avec les accents musicaux et l'integration des informations pratiques d'ouverture. Comme pour la première video, plusieurs cycles d'iteration ont été necessaires pour fiabiliser l'animation de la mascotte, point techniquement le plus delicat de la production.</w:t>
       </w:r>
     </w:p>
     <w:p>
@@ -11164,7 +11164,7 @@
           <w:color w:val="1A1A1A"/>
           <w:sz w:val="24"/>
         </w:rPr>
-        <w:t>Role dans le dispositif.</w:t>
+        <w:t>Rôle dans le dispositif.</w:t>
       </w:r>
       <w:r>
         <w:rPr>
@@ -11174,7 +11174,7 @@
           <w:color w:val="1A1A1A"/>
           <w:sz w:val="24"/>
         </w:rPr>
-        <w:t xml:space="preserve"> Cette video a servi de declencheur de visite. Diffusee au moment de l'ouverture, soutenue par le reciblage des audiences ayant vu le teaser, elle avait pour objectif de transformer la notoriete et l'attente accumulees en affluence reelle le jour J. Son ton resolument festif et son contenu informatif (date, lieu, horaires) en faisaient un appel a l'action clair.</w:t>
+        <w:t xml:space="preserve"> Cette video à servi de declencheur de visite. Diffusée au moment de l'ouverture, soutenue par le reciblage des audiences ayant vu le teaser, elle avait pour objectif de transformer la notoriété et l'attente accumulees en affluence réelle le jour J. Son ton resolument festif et son contenu informatif (date, lieu, horaires) en faisaient un appel à l'action clair.</w:t>
       </w:r>
     </w:p>
     <w:p>
@@ -11205,7 +11205,7 @@
           <w:color w:val="1A1A1A"/>
           <w:sz w:val="24"/>
         </w:rPr>
-        <w:t>Les deux videos, complementaires, structurent un recit publicitaire en deux actes. Le tableau suivant met en regard leurs caracteristiques principales.</w:t>
+        <w:t>Les deux videos, complémentaires, structurent un récit publicitaire en deux actes. Le tableau suivant met en regard leurs caracteristiques principales.</w:t>
       </w:r>
     </w:p>
     <w:p>
@@ -11255,7 +11255,7 @@
                 <w:color w:val="FFFFFF"/>
                 <w:sz w:val="21"/>
               </w:rPr>
-              <w:t>Critere</w:t>
+              <w:t>Critère</w:t>
             </w:r>
           </w:p>
         </w:tc>
@@ -11343,7 +11343,7 @@
                 <w:color w:val="1A1A1A"/>
                 <w:sz w:val="21"/>
               </w:rPr>
-              <w:t>Teasing (J-30 a J-7)</w:t>
+              <w:t>Teasing (J-30 à J-7)</w:t>
             </w:r>
           </w:p>
         </w:tc>
@@ -11364,7 +11364,7 @@
                 <w:color w:val="1A1A1A"/>
                 <w:sz w:val="21"/>
               </w:rPr>
-              <w:t>Devoilement (jour J)</w:t>
+              <w:t>Dévoilement (jour J)</w:t>
             </w:r>
           </w:p>
         </w:tc>
@@ -11452,7 +11452,7 @@
                 <w:color w:val="1A1A1A"/>
                 <w:sz w:val="21"/>
               </w:rPr>
-              <w:t>Emotion visee</w:t>
+              <w:t>Émotion visee</w:t>
             </w:r>
           </w:p>
         </w:tc>
@@ -11473,7 +11473,7 @@
                 <w:color w:val="1A1A1A"/>
                 <w:sz w:val="21"/>
               </w:rPr>
-              <w:t>Identification, curiosite</w:t>
+              <w:t>Identification, curiosité</w:t>
             </w:r>
           </w:p>
         </w:tc>
@@ -11582,7 +11582,7 @@
                 <w:color w:val="1A1A1A"/>
                 <w:sz w:val="21"/>
               </w:rPr>
-              <w:t>Element pivot</w:t>
+              <w:t>Élément pivot</w:t>
             </w:r>
           </w:p>
         </w:tc>
@@ -11624,7 +11624,7 @@
                 <w:color w:val="1A1A1A"/>
                 <w:sz w:val="21"/>
               </w:rPr>
-              <w:t>La chute de la bache</w:t>
+              <w:t>La chute de la bâche</w:t>
             </w:r>
           </w:p>
         </w:tc>
@@ -11668,7 +11668,7 @@
                 <w:color w:val="1A1A1A"/>
                 <w:sz w:val="21"/>
               </w:rPr>
-              <w:t>&lt;&lt; soon a Soualem &gt;&gt;</w:t>
+              <w:t>&lt;&lt; soon à Soualem &gt;&gt;</w:t>
             </w:r>
           </w:p>
         </w:tc>
@@ -11733,7 +11733,7 @@
                 <w:color w:val="1A1A1A"/>
                 <w:sz w:val="21"/>
               </w:rPr>
-              <w:t>Notoriete et vues</w:t>
+              <w:t>Notoriété et vues</w:t>
             </w:r>
           </w:p>
         </w:tc>
@@ -11777,7 +11777,7 @@
                 <w:color w:val="1A1A1A"/>
                 <w:sz w:val="21"/>
               </w:rPr>
-              <w:t>Appel a l'action</w:t>
+              <w:t>Appel à l'action</w:t>
             </w:r>
           </w:p>
         </w:tc>
@@ -11842,7 +11842,7 @@
           <w:color w:val="1F4E79"/>
           <w:sz w:val="28"/>
         </w:rPr>
-        <w:t>6.5  Les contenus social media : decliner le recit au quotidien</w:t>
+        <w:t>6.5  Les contenus social media : decliner le récit au quotidien</w:t>
       </w:r>
     </w:p>
     <w:p>
@@ -11858,7 +11858,7 @@
           <w:color w:val="1A1A1A"/>
           <w:sz w:val="24"/>
         </w:rPr>
-        <w:t>Au-dela des deux videos maitresses, la campagne s'est appuyee sur un ecosysteme de publications sociales destinees a entretenir l'attention entre les temps forts et a nourrir la conversation autour de la marque. Ces contenus, diffuses principalement sur Instagram et Facebook (et en relais sur TikTok), ont ete concus pour prolonger l'univers visuel des videos tout en s'adaptant aux codes natifs de chaque plateforme.</w:t>
+        <w:t>Au-dela des deux videos maitresses, la campagne s'est appuyee sur un ecosysteme de publications sociales destinees à entretenir l'attention entre les temps forts et à nourrir la conversation autour de la marque. Ces contenus, diffusés principalement sur Instagram et Facebook (et en relais sur TikTok), ont été conçus pour prolonger l'univers visuel des videos tout en s'adaptant aux codes natifs de chaque plateforme.</w:t>
       </w:r>
     </w:p>
     <w:p>
@@ -11889,7 +11889,7 @@
           <w:color w:val="1A1A1A"/>
           <w:sz w:val="24"/>
         </w:rPr>
-        <w:t>La ligne editoriale a ete pensee autour de trois piliers : le mystere (pendant le teasing), l'anticipation (compte a rebours) et la celebration (ouverture). La tonalite, volontairement chaleureuse, complice et accessible, s'adresse aussi bien aux parents qu'aux jeunes. Les visuels reprennent la palette de la marque, les memes codes que les videos, et integrent systematiquement la mascotte une fois celle-ci revelee, afin de renforcer la coherence et la memorisation.</w:t>
+        <w:t>La ligne editoriale à été pensee autour de trois piliers : le mystere (pendant le teasing), l'anticipation (compte à rebours) et la celebration (ouverture). La tonalite, volontairement chaleureuse, complice et accessible, s'adresse aussi bien aux parents qu'aux jeunes. Les visuels reprennent la palette de la marque, les mêmes codes que les videos, et integrent systematiquement la mascotte une fois celle-ci revelee, afin de renforcer la cohérence et la memorisation.</w:t>
       </w:r>
     </w:p>
     <w:p>
@@ -12071,7 +12071,7 @@
                 <w:color w:val="1A1A1A"/>
                 <w:sz w:val="21"/>
               </w:rPr>
-              <w:t>Reel / video courte</w:t>
+              <w:t>Réel / video courte</w:t>
             </w:r>
           </w:p>
         </w:tc>
@@ -12115,7 +12115,7 @@
                 <w:color w:val="1A1A1A"/>
                 <w:sz w:val="21"/>
               </w:rPr>
-              <w:t>Compte a rebours</w:t>
+              <w:t>Compte à rebours</w:t>
             </w:r>
           </w:p>
         </w:tc>
@@ -12308,7 +12308,7 @@
                 <w:color w:val="1A1A1A"/>
                 <w:sz w:val="21"/>
               </w:rPr>
-              <w:t>Engager la communaute</w:t>
+              <w:t>Engager la communauté</w:t>
             </w:r>
           </w:p>
         </w:tc>
@@ -12415,7 +12415,7 @@
                 <w:color w:val="1A1A1A"/>
                 <w:sz w:val="21"/>
               </w:rPr>
-              <w:t>Reel coulisses</w:t>
+              <w:t>Réel coulisses</w:t>
             </w:r>
           </w:p>
         </w:tc>
@@ -12501,7 +12501,7 @@
                 <w:color w:val="1A1A1A"/>
                 <w:sz w:val="21"/>
               </w:rPr>
-              <w:t>Reel + post (Video 2)</w:t>
+              <w:t>Réel + post (Video 2)</w:t>
             </w:r>
           </w:p>
         </w:tc>
@@ -12674,7 +12674,7 @@
           <w:color w:val="1A1A1A"/>
           <w:sz w:val="23"/>
         </w:rPr>
-        <w:t xml:space="preserve"> &lt;&lt; Quelque chose d'enorme arrive a Soualem... Sauras-tu deviner ? &gt;&gt;</w:t>
+        <w:t xml:space="preserve"> &lt;&lt; Quelque chose d'enorme arrive à Soualem... Sauras-tu deviner ? &gt;&gt;</w:t>
       </w:r>
     </w:p>
     <w:p>
@@ -12691,7 +12691,7 @@
           <w:color w:val="1A1A1A"/>
           <w:sz w:val="23"/>
         </w:rPr>
-        <w:t>Compte a rebours :</w:t>
+        <w:t>Compte à rebours :</w:t>
       </w:r>
       <w:r>
         <w:rPr>
@@ -12728,7 +12728,7 @@
           <w:color w:val="1A1A1A"/>
           <w:sz w:val="23"/>
         </w:rPr>
-        <w:t xml:space="preserve"> &lt;&lt; Avec qui viendrez-vous decouvrir Varcadia ? Identifiez-les en commentaire ! &gt;&gt;</w:t>
+        <w:t xml:space="preserve"> &lt;&lt; Avec qui viendrez-vous découvrir Varcadia ? Identifiez-les en commentaire ! &gt;&gt;</w:t>
       </w:r>
     </w:p>
     <w:p>
@@ -12755,7 +12755,7 @@
           <w:color w:val="1A1A1A"/>
           <w:sz w:val="23"/>
         </w:rPr>
-        <w:t xml:space="preserve"> &lt;&lt; Ca y est, Varcadia ouvre ses portes ! Rendez-vous des aujourd'hui a Soualem. &gt;&gt;</w:t>
+        <w:t xml:space="preserve"> &lt;&lt; Ca y est, Varcadia ouvre ses portes ! Rendez-vous des aujourd'hui à Soualem. &gt;&gt;</w:t>
       </w:r>
     </w:p>
     <w:p>
@@ -12771,7 +12771,7 @@
           <w:color w:val="1A1A1A"/>
           <w:sz w:val="24"/>
         </w:rPr>
-        <w:t>Les mots-cles et hashtags ont ete standardises pour faciliter le suivi et l'agregation des contenus : #Varcadia, #Soualem, #BientotChezVous, puis #VarcadiaEstOuvert au moment du lancement. Cette discipline editoriale a facilite la collecte des contenus generes par les visiteurs (UGC) lors de l'ouverture.</w:t>
+        <w:t>Les mots-clés et hashtags ont été standardises pour faciliter le suivi et l'agregation des contenus : #Varcadia, #Soualem, #BientotChezVous, puis #VarcadiaEstOuvert au moment du lancement. Cette discipline editoriale à facilite la collecté des contenus générés par les visiteurs (UGC) lors de l'ouverture.</w:t>
       </w:r>
     </w:p>
     <w:p>
@@ -12802,7 +12802,7 @@
           <w:color w:val="1A1A1A"/>
           <w:sz w:val="24"/>
         </w:rPr>
-        <w:t>Les publications sociales ont genere un volume d'interactions important, avec une montee en puissance nette a l'approche de l'ouverture. Les formats Reels, en particulier, ont surperforme, confirmant la pertinence du choix de la video courte verticale comme format prioritaire.</w:t>
+        <w:t>Les publications sociales ont généré un volume d'interactions important, avec une montee en puissance nette à l'approche de l'ouverture. Les formats Réels, en particulier, ont surperforme, confirmant la pertinence du choix de la video courte verticale comme format prioritaire.</w:t>
       </w:r>
     </w:p>
     <w:p>
@@ -12896,7 +12896,7 @@
                 <w:color w:val="1A1A1A"/>
                 <w:sz w:val="21"/>
               </w:rPr>
-              <w:t>Publications diffusees</w:t>
+              <w:t>Publications diffusées</w:t>
             </w:r>
           </w:p>
         </w:tc>
@@ -13028,7 +13028,7 @@
                 <w:color w:val="1A1A1A"/>
                 <w:sz w:val="21"/>
               </w:rPr>
-              <w:t>Taux d'engagement moyen (Reels)</w:t>
+              <w:t>Taux d'engagement moyen (Réels)</w:t>
             </w:r>
           </w:p>
         </w:tc>
@@ -13160,7 +13160,7 @@
           <w:color w:val="1F4E79"/>
           <w:sz w:val="28"/>
         </w:rPr>
-        <w:t>6.6  Strategie de diffusion multicanale et resultats reels</w:t>
+        <w:t>6.6  Stratégie de diffusion multicanale et résultats réels</w:t>
       </w:r>
     </w:p>
     <w:p>
@@ -13191,7 +13191,7 @@
           <w:color w:val="1A1A1A"/>
           <w:sz w:val="24"/>
         </w:rPr>
-        <w:t>La campagne a ete diffusee sur trois canaux complementaires, choisis en fonction de leur capacite a atteindre la cible definie et de leur pertinence pour ce type de contenu.</w:t>
+        <w:t>La campagne à été diffusée sur trois canaux complémentaires, choisis en fonction de leur capacité a atteindre la cible définie et de leur pertinence pour ce type de contenu.</w:t>
       </w:r>
     </w:p>
     <w:p>
@@ -13207,7 +13207,7 @@
           <w:color w:val="1A1A1A"/>
           <w:sz w:val="24"/>
         </w:rPr>
-        <w:t>YouTube Ads a constitue le canal principal pour la diffusion du teaser video. Le ciblage a ete configure pour atteindre les utilisateurs de la region de Casablanca-Settat, ages de 15 a 45 ans, avec un interet declare pour les loisirs, les activites familiales et les sorties. Le format bumper de 6 secondes a ete utilise en phase de notoriete, suivi du format TrueView in-stream pour les utilisateurs les plus engages.</w:t>
+        <w:t>YouTube Ads à constitué le canal principal pour la diffusion du teaser video. Le ciblage à été configuré pour atteindre les utilisateurs de la région de Casablanca-Settat, âgés de 15 à 45 ans, avec un intérêt déclaré pour les loisirs, les activités familiales et les sorties. Le format bumper de 6 secondes à été utilise en phase de notoriété, suivi du format TrueView in-stream pour les utilisateurs les plus engages.</w:t>
       </w:r>
     </w:p>
     <w:p>
@@ -13223,7 +13223,7 @@
           <w:color w:val="1A1A1A"/>
           <w:sz w:val="24"/>
         </w:rPr>
-        <w:t>Meta Ads, sur Facebook et Instagram, a assure la dimension sociale et communautaire de la campagne. Les Stories et les Reels ont ete privilegies pour leur format natif et leur fort taux d'engagement sur mobile. Le systeme d'audiences similaires de Meta a permis d'elargir progressivement la couverture en ciblant des profils proches de ceux ayant deja interagi avec les premiers contenus diffuses.</w:t>
+        <w:t>Meta Ads, sur Facebook et Instagram, à assure la dimension sociale et communautaire de la campagne. Les Stories et les Réels ont été privilegies pour leur format natif et leur fort taux d'engagement sur mobile. Le système d'audiences similaires de Meta à permis d'élargir progressivement la couverture en ciblant des profils proches de ceux ayant déjà interagi avec les premiers contenus diffusés.</w:t>
       </w:r>
     </w:p>
     <w:p>
@@ -13239,7 +13239,7 @@
           <w:color w:val="1A1A1A"/>
           <w:sz w:val="24"/>
         </w:rPr>
-        <w:t>L'affichage urbain, enfin, a assure une presence physique dans la ville de Soualem et ses abords. Des panneaux grand format placardes aux points de passage strategiques ont renforce la visibilite locale de la marque et cree un relais physique de la campagne digitale, generant un effet de reconnaissance pour les habitants ayant deja vu le contenu en ligne.</w:t>
+        <w:t>L'affichage urbain, enfin, à assure une presence physique dans la ville de Soualem et ses abords. Des panneaux grand format placardes aux points de passage stratégiques ont renforce la visibilite locale de la marque et créé un relais physique de la campagne digitale, generant un effet de reconnaissance pour les habitants ayant déjà vu le contenu en ligne.</w:t>
       </w:r>
     </w:p>
     <w:p>
@@ -13312,7 +13312,7 @@
                 <w:color w:val="FFFFFF"/>
                 <w:sz w:val="21"/>
               </w:rPr>
-              <w:t>Role</w:t>
+              <w:t>Rôle</w:t>
             </w:r>
           </w:p>
         </w:tc>
@@ -13400,7 +13400,7 @@
                 <w:color w:val="1A1A1A"/>
                 <w:sz w:val="21"/>
               </w:rPr>
-              <w:t>Notoriete / vues</w:t>
+              <w:t>Notoriété / vues</w:t>
             </w:r>
           </w:p>
         </w:tc>
@@ -13486,7 +13486,7 @@
                 <w:color w:val="1A1A1A"/>
                 <w:sz w:val="21"/>
               </w:rPr>
-              <w:t>Engagement / communaute</w:t>
+              <w:t>Engagement / communauté</w:t>
             </w:r>
           </w:p>
         </w:tc>
@@ -13507,7 +13507,7 @@
                 <w:color w:val="1A1A1A"/>
                 <w:sz w:val="21"/>
               </w:rPr>
-              <w:t>Reels, Stories, feed</w:t>
+              <w:t>Réels, Stories, feed</w:t>
             </w:r>
           </w:p>
         </w:tc>
@@ -13723,7 +13723,7 @@
           <w:color w:val="2E75B6"/>
           <w:sz w:val="25"/>
         </w:rPr>
-        <w:t>6.6.2  Resultats quantitatifs de la campagne</w:t>
+        <w:t>6.6.2  Résultats quantitatifs de la campagne</w:t>
       </w:r>
     </w:p>
     <w:p>
@@ -13739,7 +13739,7 @@
           <w:color w:val="1A1A1A"/>
           <w:sz w:val="24"/>
         </w:rPr>
-        <w:t>Les resultats enregistres a l'issue de la phase de teasing et lors de l'ouverture du parc ont largement confirme la pertinence de la strategie adoptee. Sur le plan quantitatif, la campagne a cumule plus d'un million de vues sur l'ensemble des plateformes de diffusion en un mois. Ce chiffre, remarquable pour une campagne de lancement local, temoigne a la fois de la qualite du contenu produit et de l'efficacite du ciblage mis en oeuvre.</w:t>
+        <w:t>Les résultats enregistres à l'issue de la phase de teasing et lors de l'ouverture du parc ont largement confirmé la pertinence de la stratégie adoptée. Sur le plan quantitatif, la campagne à cumule plus d'un million de vues sur l'ensemble des plateformes de diffusion en un mois. Ce chiffre, remarquable pour une campagne de lancement local, temoigne à la fois de la qualité du contenu produit et de l'efficacité du ciblage mis en oeuvre.</w:t>
       </w:r>
     </w:p>
     <w:p>
@@ -13794,7 +13794,7 @@
           <w:color w:val="595959"/>
           <w:sz w:val="19"/>
         </w:rPr>
-        <w:t>Figure 1 - Evolution des vues cumulees sur les 30 jours de teasing</w:t>
+        <w:t>Figure 1 - Évolution des vues cumulees sur les 30 jours de teasing</w:t>
       </w:r>
     </w:p>
     <w:p>
@@ -13810,7 +13810,7 @@
           <w:color w:val="1A1A1A"/>
           <w:sz w:val="24"/>
         </w:rPr>
-        <w:t>La courbe des vues cumulees illustre une dynamique d'acceleration : apres une montee progressive lors des deux premieres semaines, le rythme s'intensifie a mesure que les contenus sont relayes et partages, jusqu'a franchir le seuil symbolique du million de vues avant la fin de la periode de teasing. La repartition par canal, presentee ci-dessous, confirme la place predominante de YouTube Ads dans la generation de vues, completee par la forte contribution de Meta a l'engagement.</w:t>
+        <w:t>La courbe des vues cumulees illustre une dynamique d'acceleration : après une montee progressive lors des deux premières semaines, le rythme s'intensifie à mesuré que les contenus sont relayes et partages, jusqu'à franchir le seuil symbolique du million de vues avant la fin de la periode de teasing. La repartition par canal, présentée ci-dessous, confirmé la place predominante de YouTube Ads dans la generation de vues, complétée par la forte contribution de Meta à l'engagement.</w:t>
       </w:r>
     </w:p>
     <w:p>
@@ -13897,7 +13897,7 @@
           <w:color w:val="1F4E79"/>
           <w:sz w:val="20"/>
         </w:rPr>
-        <w:t>Tableau 6.9 - Indicateurs cles de performance de la campagne (* incluant TikTok et partages organiques)</w:t>
+        <w:t>Tableau 6.9 - Indicateurs clés de performance de la campagne (* incluant TikTok et partages organiques)</w:t>
       </w:r>
     </w:p>
     <w:tbl>
@@ -14451,7 +14451,7 @@
                 <w:color w:val="1A1A1A"/>
                 <w:sz w:val="21"/>
               </w:rPr>
-              <w:t>Cout par vue (CPV) moyen</w:t>
+              <w:t>Coût par vue (CPV) moyen</w:t>
             </w:r>
           </w:p>
         </w:tc>
@@ -14537,7 +14537,7 @@
                 <w:color w:val="1A1A1A"/>
                 <w:sz w:val="21"/>
               </w:rPr>
-              <w:t>Cout pour mille (CPM)</w:t>
+              <w:t>Coût pour mille (CPM)</w:t>
             </w:r>
           </w:p>
         </w:tc>
@@ -14624,7 +14624,7 @@
           <w:color w:val="1A1A1A"/>
           <w:sz w:val="24"/>
         </w:rPr>
-        <w:t>Le taux d'engagement sur Meta a ete superieur aux benchmarks habituels pour ce type de campagne dans la region, avec un nombre significatif de commentaires, partages et mentions d'internautes signalant le parc a leurs proches. Le graphique suivant met en regard les principales metriques de la campagne avec des valeurs de reference observees sur des campagnes locales comparables.</w:t>
+        <w:t>Le taux d'engagement sur Meta à été superieur aux benchmarks habituels pour ce type de campagne dans la région, avec un nombre significatif de commentaires, partages et mentions d'internautes signalant le parc à leurs proches. Le graphique suivant met en regard les principales metriques de la campagne avec des valeurs de référence observées sur des campagnes locales comparables.</w:t>
       </w:r>
     </w:p>
     <w:p>
@@ -14694,7 +14694,7 @@
           <w:color w:val="2E75B6"/>
           <w:sz w:val="25"/>
         </w:rPr>
-        <w:t>6.6.3  De la notoriete a la visite : l'entonnoir de conversion</w:t>
+        <w:t>6.6.3  De la notoriété à la visite : l'entonnoir de conversion</w:t>
       </w:r>
     </w:p>
     <w:p>
@@ -14710,7 +14710,7 @@
           <w:color w:val="1A1A1A"/>
           <w:sz w:val="24"/>
         </w:rPr>
-        <w:t>Sur le plan qualitatif, l'enthousiasme genere par le teaser dans les commentaires des publications a constitue un signal tres positif. De nombreux utilisateurs ont exprime leur impatience a decouvrir le parc et ont partage le contenu spontanement, generant une amplification organique appreciable.</w:t>
+        <w:t>Sur le plan qualitatif, l'enthousiasme généré par le teaser dans les commentaires des publications a constitué un signal très positif. De nombreux utilisateurs ont exprime leur impatience à découvrir le parc et ont partage le contenu spontanement, generant une amplification organique appréciable.</w:t>
       </w:r>
     </w:p>
     <w:p>
@@ -14726,7 +14726,7 @@
           <w:color w:val="1A1A1A"/>
           <w:sz w:val="24"/>
         </w:rPr>
-        <w:t>Surtout, la forte affluence enregistree des le jour de l'ouverture du parc represente l'indicateur de conversion le plus significatif. Elle confirme que la campagne a atteint son objectif principal : creer une anticipation suffisamment forte pour que le public se deplace effectivement lors de l'ouverture. L'entonnoir ci-dessous retrace le passage de l'exposition publicitaire a la visite physique.</w:t>
+        <w:t>Surtout, la forte affluence enregistree des le jour de l'ouverture du parc represente l'indicateur de conversion le plus significatif. Elle confirmé que la campagne à atteint son objectif principal : créer une anticipation suffisamment forte pour que le public se déplace effectivement lors de l'ouverture. L'entonnoir ci-dessous retrace le passage de l'exposition publicitaire à la visite physique.</w:t>
       </w:r>
     </w:p>
     <w:p>
@@ -14781,7 +14781,7 @@
           <w:color w:val="595959"/>
           <w:sz w:val="19"/>
         </w:rPr>
-        <w:t>Figure 5 - Entonnoir de conversion : des impressions a la visite le jour J</w:t>
+        <w:t>Figure 5 - Entonnoir de conversion : des impressions à la visite le jour J</w:t>
       </w:r>
     </w:p>
     <w:p>
@@ -14831,7 +14831,7 @@
                 <w:color w:val="FFFFFF"/>
                 <w:sz w:val="21"/>
               </w:rPr>
-              <w:t>Etape de l'entonnoir</w:t>
+              <w:t>Étape de l'entonnoir</w:t>
             </w:r>
           </w:p>
         </w:tc>
@@ -15135,7 +15135,7 @@
                 <w:color w:val="1A1A1A"/>
                 <w:sz w:val="21"/>
               </w:rPr>
-              <w:t>Interet qualifie</w:t>
+              <w:t>Intérêt qualifie</w:t>
             </w:r>
           </w:p>
         </w:tc>
@@ -15289,7 +15289,7 @@
           <w:color w:val="1A1A1A"/>
           <w:sz w:val="24"/>
         </w:rPr>
-        <w:t>Ce resultat constitue la validation empirique la plus directe de l'efficacite d'une strategie de lancement pilotee par l'IA generative : avec un budget media maitrise et une equipe reduite, la campagne a transforme une attention numerique massive en une frequentation physique reelle, des le premier jour d'ouverture.</w:t>
+        <w:t>Ce résultat constitué la validation empirique la plus directe de l'efficacité d'une stratégie de lancement pilotee par l'IA générative : avec un budget media maitrise et une équipe réduite, la campagne à transforme une attention numérique massive en une frequentation physique réelle, des le premier jour d'ouverture.</w:t>
       </w:r>
     </w:p>
     <w:p>
@@ -15304,7 +15304,7 @@
           <w:color w:val="2E75B6"/>
           <w:sz w:val="25"/>
         </w:rPr>
-        <w:t>6.6.4  Analyse qualitative des retombees</w:t>
+        <w:t>6.6.4  Analysé qualitative des retombees</w:t>
       </w:r>
     </w:p>
     <w:p>
@@ -15320,7 +15320,7 @@
           <w:color w:val="1A1A1A"/>
           <w:sz w:val="24"/>
         </w:rPr>
-        <w:t>Au-dela des chiffres, l'analyse des commentaires laisses sous les publications offre un eclairage precieux sur la reception de la campagne. Nous avons procede a une analyse de contenu thematique d'un echantillon de commentaires, qui fait ressortir trois registres dominants : l'impatience, l'identification locale et l'intention de visite.</w:t>
+        <w:t>Au-dela des chiffres, l'analysé des commentaires laisses sous les publications offre un eclairage precieux sur la reception de la campagne. Nous avons procede à une analysé de contenu thématique d'un échantillon de commentaires, qui fait ressortir trois registres dominants : l'impatience, l'identification locale et l'intention de visite.</w:t>
       </w:r>
     </w:p>
     <w:p>
@@ -15337,7 +15337,7 @@
           <w:color w:val="1A1A1A"/>
           <w:sz w:val="23"/>
         </w:rPr>
-        <w:t>Impatience et curiosite :</w:t>
+        <w:t>Impatience et curiosité :</w:t>
       </w:r>
       <w:r>
         <w:rPr>
@@ -15347,7 +15347,7 @@
           <w:color w:val="1A1A1A"/>
           <w:sz w:val="23"/>
         </w:rPr>
-        <w:t xml:space="preserve"> de nombreux internautes ont reagi au mystere du teaser par des questions (&lt;&lt; c'est quoi exactement ? &gt;&gt;, &lt;&lt; ca ouvre quand ? &gt;&gt;), traduisant l'efficacite du ressort de curiosite.</w:t>
+        <w:t xml:space="preserve"> de nombreux internautes ont reagi au mystere du teaser par des questions (&lt;&lt; c'est quoi exactement ? &gt;&gt;, &lt;&lt; ca ouvre quand ? &gt;&gt;), traduisant l'efficacité du ressort de curiosité.</w:t>
       </w:r>
     </w:p>
     <w:p>
@@ -15374,7 +15374,7 @@
           <w:color w:val="1A1A1A"/>
           <w:sz w:val="23"/>
         </w:rPr>
-        <w:t xml:space="preserve"> plusieurs commentaires saluaient l'arrivee d'une infrastructure de ce niveau a Soualem meme, signe que l'ancrage territorial du message a porte ses fruits.</w:t>
+        <w:t xml:space="preserve"> plusieurs commentaires saluaient l'arrivee d'une infrastructure de ce niveau à Soualem même, signe que l'ancrage territorial du message à porte ses fruits.</w:t>
       </w:r>
     </w:p>
     <w:p>
@@ -15401,7 +15401,7 @@
           <w:color w:val="1A1A1A"/>
           <w:sz w:val="23"/>
         </w:rPr>
-        <w:t xml:space="preserve"> une part notable des commentaires consistait a identifier des proches (&lt;&lt; on y va ensemble ! &gt;&gt;), generant une amplification organique et une pre-qualification de l'intention de visite.</w:t>
+        <w:t xml:space="preserve"> une part notable des commentaires consistait à identifier des proches (&lt;&lt; on y va ensemble ! &gt;&gt;), generant une amplification organique et une pre-qualification de l'intention de visite.</w:t>
       </w:r>
     </w:p>
     <w:p>
@@ -15417,7 +15417,7 @@
           <w:color w:val="1A1A1A"/>
           <w:sz w:val="24"/>
         </w:rPr>
-        <w:t>Le sentiment global, evalue qualitativement, s'est revele tres majoritairement positif. Les rares reactions critiques portaient sur des aspects pratiques (tarifs, horaires, stationnement) plutot que sur le contenu lui-meme, ce qui constitue un signal favorable pour une marque en phase de lancement. Cette tonalite positive a egalement nourri un volume appreciable de contenus generes par les utilisateurs (UGC) le jour de l'ouverture, prolongeant gratuitement la portee de la campagne.</w:t>
+        <w:t>Le sentiment global, évalué qualitativement, s'est révèle très majoritairement positif. Les rares reactions critiques portaient sur des aspects pratiques (tarifs, horaires, stationnement) plutôt que sur le contenu lui-même, ce qui constitué un signal favorable pour une marque en phase de lancement. Cette tonalite positive à egalement nourri un volume appréciable de contenus générés par les utilisateurs (UGC) le jour de l'ouverture, prolongeant gratuitement la portee de la campagne.</w:t>
       </w:r>
     </w:p>
     <w:p>
@@ -15448,7 +15448,7 @@
           <w:color w:val="1A1A1A"/>
           <w:sz w:val="24"/>
         </w:rPr>
-        <w:t>L'experience Varcadia nous a permis de tirer plusieurs enseignements directement applicables a d'autres projets de lancement dans le contexte marocain.</w:t>
+        <w:t>L'expérience Varcadia nous à permis de tirer plusieurs enseignements directement applicables a d'autres projets de lancement dans le contexte marocain.</w:t>
       </w:r>
     </w:p>
     <w:p>
@@ -15464,7 +15464,7 @@
           <w:color w:val="1A1A1A"/>
           <w:sz w:val="24"/>
         </w:rPr>
-        <w:t>Le premier enseignement porte sur la valeur du teasing hybride. La combinaison de sequences reelles et d'elements generes par IA permet d'atteindre un niveau de qualite visuelle et de singularite creative normalement inaccessibles avec des budgets modestes. Cette approche democratise l'acces a des productions de haute qualite pour des entreprises locales, et reduit drastiquement le delai entre l'idee et la diffusion.</w:t>
+        <w:t>Le premier enseignement porte sur la valeur du teasing hybride. La combinaison de sequences réelles et d'éléments générés par IA permet d'atteindre un niveau de qualité visuelle et de singularite créative normalement inaccessibles avec des budgets modestes. Cette approche démocratise l'acces à des productions de haute qualité pour des entreprises locales, et réduit drastiquement le délai entre l'idee et la diffusion.</w:t>
       </w:r>
     </w:p>
     <w:p>
@@ -15480,7 +15480,7 @@
           <w:color w:val="1A1A1A"/>
           <w:sz w:val="24"/>
         </w:rPr>
-        <w:t>Le deuxieme enseignement concerne l'importance de la direction artistique humaine dans un processus de production assiste par IA. L'IA est un outil puissant, mais son efficacite depend entierement de la qualite des instructions qui lui sont donnees et du jugement creatif qui s'exerce sur ses productions. Le talent du marketeur ou du directeur creatif reste determinant. Les deux videos de la campagne le demontrent : leur efficacite tient moins a la technologie employee qu'a la justesse du concept narratif et a la coherence du recit construit sur l'ensemble du dispositif.</w:t>
+        <w:t>Le deuxieme enseignement concerne l'importance de la direction artistique humaine dans un processus de production assisté par IA. L'IA est un outil puissant, mais son efficacité depend entièrement de la qualité des instructions qui lui sont donnees et du jugement créatif qui s'exerce sur ses productions. Le talent du marketeur où du directeur créatif reste déterminant. Les deux videos de la campagne le démontrent : leur efficacité tient moins à la technologie employee qu'à la justesse du concept narratif et à la cohérence du récit construit sur l'ensemble du dispositif.</w:t>
       </w:r>
     </w:p>
     <w:p>
@@ -15496,7 +15496,7 @@
           <w:color w:val="1A1A1A"/>
           <w:sz w:val="24"/>
         </w:rPr>
-        <w:t>Le troisieme enseignement touche a l'efficacite de la combinaison digital et affichage pour les lancements locaux. Si le digital assure la portee et la mesurabilite, le support physique ancre la marque dans le territoire et cree un lien avec la communaute locale qui depasse ce que les seuls canaux numeriques peuvent produire.</w:t>
+        <w:t>Le troisieme enseignement touche à l'efficacité de la combinaison digital et affichage pour les lancements locaux. Si le digital assure la portee et la mesurabilite, le support physique ancré la marque dans le territoire et créé un lien avec la communauté locale qui dépassé ce que les seuls canaux numériques peuvent produire.</w:t>
       </w:r>
     </w:p>
     <w:p>
@@ -15512,7 +15512,7 @@
           <w:color w:val="1A1A1A"/>
           <w:sz w:val="24"/>
         </w:rPr>
-        <w:t>Le quatrieme enseignement, enfin, concerne la coherence narrative comme facteur d'efficacite. La construction d'un recit en deux actes, du teaser au devoilement, avec des codes visuels constants et une mascotte federatrice, a permis de transformer une succession de contenus en une veritable histoire de marque, plus memorable et plus engageante qu'une simple juxtaposition de messages publicitaires.</w:t>
+        <w:t>Le quatrieme enseignement, enfin, concerne la cohérence narrative comme facteur d'efficacité. La construction d'un récit en deux actes, du teaser au dévoilement, avec des codes visuels constants et une mascotte federatrice, à permis de transformer une succession de contenus en une veritable histoire de marque, plus memorable et plus engageante qu'une simple juxtaposition de messages publicitaires.</w:t>
       </w:r>
     </w:p>
     <w:p>
@@ -15530,7 +15530,7 @@
           <w:color w:val="595959"/>
           <w:sz w:val="18"/>
         </w:rPr>
-        <w:t>Notes et references</w:t>
+        <w:t>Notes et références</w:t>
       </w:r>
     </w:p>
     <w:p>
@@ -15560,7 +15560,7 @@
           <w:color w:val="595959"/>
           <w:sz w:val="18"/>
         </w:rPr>
-        <w:t>Les donnees chiffrees presentees dans ce chapitre sont issues des tableaux de bord des regies publicitaires (Google Ads, Meta Ads Manager) et des estimations de frequentation communiquees par le client. Certaines valeurs sont arrondies ou estimees.</w:t>
+        <w:t>Les donnees chiffrees présentées dans ce chapitre sont issues des tableaux de bord des regies publicitaires (Google Ads, Meta Ads Manager) et des estimations de frequentation communiquees par le client. Certaines valeurs sont arrondies où estimees.</w:t>
       </w:r>
     </w:p>
     <w:p>
@@ -15599,7 +15599,7 @@
           <w:color w:val="1F4E79"/>
           <w:sz w:val="28"/>
         </w:rPr>
-        <w:t>Synthese des principaux resultats</w:t>
+        <w:t>Synthese des principaux résultats</w:t>
       </w:r>
     </w:p>
     <w:p>
@@ -15615,7 +15615,7 @@
           <w:color w:val="1A1A1A"/>
           <w:sz w:val="24"/>
         </w:rPr>
-        <w:t>Ce rapport avait pour ambition de repondre a une question centrale : dans quelle mesure l'intelligence artificielle ameliore-t-elle l'efficacite des strategies de marketing digital, notamment en matiere de ciblage et de generation de contenu ? A travers une revue theorique approfondie et une etude empirique ancree dans une experience professionnelle reelle, nous apportons des elements de reponse clairs et nuances.</w:t>
+        <w:t>Ce rapport avait pour ambition de répondre à une question centrale : dans quelle mesuré l'intelligence artificielle améliore-t-elle l'efficacité des stratégies de marketing digital, notamment en matière de ciblage et de generation de contenu ? À travers une revue théorique approfondie et une étude empirique ancrée dans une expérience professionnelle réelle, nous apportons des éléments de réponse clairs et nuances.</w:t>
       </w:r>
     </w:p>
     <w:p>
@@ -15631,7 +15631,7 @@
           <w:color w:val="1A1A1A"/>
           <w:sz w:val="24"/>
         </w:rPr>
-        <w:t>Les resultats de notre enquete et les performances de la campagne Varcadia convergent pour confirmer que l'IA apporte une valeur ajoutee significative et mesurable aux strategies de marketing digital. Elle ameliore la precision du ciblage, reduit les couts de production de contenu, accelere les cycles de creation et permet d'atteindre des niveaux d'engagement qui rivalisent avec ceux obtenus par des approches creatives conventionnelles, a condition d'etre guidee par une vision strategique claire. La campagne Varcadia, avec son million de vues et son affluence reelle a l'ouverture, en constitue une demonstration concrete.</w:t>
+        <w:t>Les résultats de notre enquête et les performances de la campagne Varcadia convergent pour confirmer que l'IA apporte une valeur ajoutee significative et mesurable aux stratégies de marketing digital. Elle améliore la precision du ciblage, réduit les coûts de production de contenu, accélère les cycles de creation et permet d'atteindre des niveaux d'engagement qui rivalisent avec ceux obtenus par des approches créatives conventionnelles, à condition d'être guidee par une vision stratégique claire. La campagne Varcadia, avec son million de vues et son affluence réelle à l'ouverture, en constitué une démonstration concrete.</w:t>
       </w:r>
     </w:p>
     <w:p>
@@ -15662,7 +15662,7 @@
           <w:color w:val="1A1A1A"/>
           <w:sz w:val="24"/>
         </w:rPr>
-        <w:t>Pour les entreprises et les agences marocaines qui envisagent d'integrer l'IA dans leurs strategies marketing, nous formulons quatre recommandations principales.</w:t>
+        <w:t>Pour les entreprises et les agences marocaines qui envisagent d'integrer l'IA dans leurs stratégies marketing, nous formulons quatre recommandations principales.</w:t>
       </w:r>
     </w:p>
     <w:p>
@@ -15689,7 +15689,7 @@
           <w:color w:val="1A1A1A"/>
           <w:sz w:val="23"/>
         </w:rPr>
-        <w:t xml:space="preserve"> et monter progressivement en complexite. Les outils de generation textuelle et visuelle offrent un excellent rapport qualite-prise en main pour une premiere experimentation, avant d'aborder les outils de generation video plus avances.</w:t>
+        <w:t xml:space="preserve"> et monter progressivement en complexité. Les outils de generation textuelle et visuelle offrent un excellent rapport qualité-prise en main pour une première expérimentation, avant d'aborder les outils de generation video plus avances.</w:t>
       </w:r>
     </w:p>
     <w:p>
@@ -15706,7 +15706,7 @@
           <w:color w:val="1A1A1A"/>
           <w:sz w:val="23"/>
         </w:rPr>
-        <w:t>Investir dans la formation des equipes.</w:t>
+        <w:t>Investir dans la formation des équipes.</w:t>
       </w:r>
       <w:r>
         <w:rPr>
@@ -15716,7 +15716,7 @@
           <w:color w:val="1A1A1A"/>
           <w:sz w:val="23"/>
         </w:rPr>
-        <w:t xml:space="preserve"> La maitrise du prompt engineering, c'est-a-dire la capacite a formuler des instructions precises et efficaces pour les systemes d'IA, est une competence strategique qui conditionne largement la qualite des resultats obtenus.</w:t>
+        <w:t xml:space="preserve"> La maitrise du prompt engineering, c'est-a-dire la capacité à formuler des instructions precises et efficaces pour les systèmes d'IA, est une compétence stratégique qui conditionne largement la qualité des résultats obtenus.</w:t>
       </w:r>
     </w:p>
     <w:p>
@@ -15743,7 +15743,7 @@
           <w:color w:val="1A1A1A"/>
           <w:sz w:val="23"/>
         </w:rPr>
-        <w:t xml:space="preserve"> L'IA est un amplificateur de creativite, pas un substitut. Les decisions strategiques, la direction artistique et la validation des contenus avant diffusion doivent rester sous controle humain.</w:t>
+        <w:t xml:space="preserve"> L'IA est un amplificateur de créativité, pas un substitut. Les décisions stratégiques, la direction artistique et la validation des contenus avant diffusion doivent rester sous contrôle humain.</w:t>
       </w:r>
     </w:p>
     <w:p>
@@ -15770,7 +15770,7 @@
           <w:color w:val="1A1A1A"/>
           <w:sz w:val="23"/>
         </w:rPr>
-        <w:t xml:space="preserve"> des actions menees avec l'IA, en comparaison avec les pratiques anterieures. La donnee est le seul arbitre fiable de l'efficacite d'une approche marketing.</w:t>
+        <w:t xml:space="preserve"> des actions menees avec l'IA, en comparaison avec les pratiques antérieures. La donnee est le seul arbitre fiable de l'efficacité d'une approche marketing.</w:t>
       </w:r>
     </w:p>
     <w:p>
@@ -15785,7 +15785,7 @@
           <w:color w:val="1F4E79"/>
           <w:sz w:val="28"/>
         </w:rPr>
-        <w:t>Limites de l'etude et perspectives de recherche</w:t>
+        <w:t>Limites de l'étude et perspectives de recherche</w:t>
       </w:r>
     </w:p>
     <w:p>
@@ -15801,7 +15801,7 @@
           <w:color w:val="1A1A1A"/>
           <w:sz w:val="24"/>
         </w:rPr>
-        <w:t>Ce travail comporte plusieurs limites qu'il convient de mentionner. L'echantillon de notre enquete quantitative, bien que suffisant pour une etude exploratoire, ne permet pas de generalisation statistique a l'ensemble du secteur du marketing digital marocain. L'etude de cas Varcadia, aussi riche soit-elle, reste une experience singuliere dont les resultats ne peuvent etre systematiquement reproduits dans d'autres contextes sans adaptation.</w:t>
+        <w:t>Ce travail comporte plusieurs limites qu'il convient de mentionner. L'échantillon de notre enquête quantitative, bien que suffisant pour une étude exploratoire, ne permet pas de generalisation statistique à l'ensemble du secteur du marketing digital marocain. L'étude de cas Varcadia, aussi riche soit-elle, reste une expérience singuliere dont les résultats ne peuvent être systematiquement reproduits dans d'autres contextes sans adaptation.</w:t>
       </w:r>
     </w:p>
     <w:p>
@@ -15817,7 +15817,7 @@
           <w:color w:val="1A1A1A"/>
           <w:sz w:val="24"/>
         </w:rPr>
-        <w:t>Par ailleurs, le domaine de l'IA generative evolue a une vitesse telle que certains des outils et des pratiques decrits dans ce rapport seront probablement depasses dans les prochains mois. Cette obsolescence rapide est inherente au champ et constitue en elle-meme un objet de reflexion pour les chercheurs et les praticiens.</w:t>
+        <w:t>Par ailleurs, le domaine de l'IA générative evolue à une vitesse telle que certains des outils et des pratiques décrits dans ce rapport seront probablement depasses dans les prochains mois. Cette obsolescence rapide est inherente au champ et constitué en elle-même un objet de réflexion pour les chercheurs et les praticiens.</w:t>
       </w:r>
     </w:p>
     <w:p>
@@ -15833,7 +15833,7 @@
           <w:color w:val="1A1A1A"/>
           <w:sz w:val="24"/>
         </w:rPr>
-        <w:t>Les perspectives de recherche ouvertes par ce travail sont nombreuses. Une etude longitudinale sur l'evolution de l'adoption de l'IA marketing au Maroc permettrait de suivre les dynamiques du secteur dans le temps. Une analyse comparative entre des campagnes entierement pilotees par IA et des campagnes conventionnelles, dans des contextes similaires, offrirait une base empirique plus solide pour mesurer l'apport reel de l'IA. Enfin, une recherche centree sur les impacts ethiques et sociaux de la diffusion de l'IA generative dans la communication commerciale au Maroc constituerait un champ d'exploration pertinent et peu explore a ce jour.</w:t>
+        <w:t>Les perspectives de recherche ouvertes par ce travail sont nombreuses. Une étude longitudinale sur l'évolution de l'adoption de l'IA marketing au Maroc permettrait de suivre les dynamiques du secteur dans le temps. Une analysé comparative entre des campagnes entièrement pilotees par IA et des campagnes conventionnelles, dans des contextes similaires, offrirait une basé empirique plus solide pour mesurer l'apport réel de l'IA. Enfin, une recherche centree sur les impacts éthiques et sociaux de la diffusion de l'IA générative dans la communication commerciale au Maroc constituerait un champ d'exploration pertinent et peu explore à ce jour.</w:t>
       </w:r>
     </w:p>
     <w:p>
@@ -15872,7 +15872,7 @@
           <w:color w:val="1F4E79"/>
           <w:sz w:val="28"/>
         </w:rPr>
-        <w:t>Ouvrages et references academiques</w:t>
+        <w:t>Ouvrages et références académiques</w:t>
       </w:r>
     </w:p>
     <w:p>
@@ -15888,7 +15888,7 @@
           <w:color w:val="1A1A1A"/>
           <w:sz w:val="23"/>
         </w:rPr>
-        <w:t>Chollet, F. (2021). Deep Learning with Python (2e edition). Manning Publications.</w:t>
+        <w:t>Chollet, F. (2021). Deep Learning with Python (2e édition). Manning Publications.</w:t>
       </w:r>
     </w:p>
     <w:p>
@@ -15904,7 +15904,7 @@
           <w:color w:val="1A1A1A"/>
           <w:sz w:val="23"/>
         </w:rPr>
-        <w:t>Chaffey, D., &amp; Ellis-Chadwick, F. (2022). Digital Marketing: Strategy, Implementation and Practice (8e edition). Pearson.</w:t>
+        <w:t>Chaffey, D., &amp; Ellis-Chadwick, F. (2022). Digital Marketing: Strategy, Implementation and Practice (8e édition). Pearson.</w:t>
       </w:r>
     </w:p>
     <w:p>
@@ -15936,7 +15936,7 @@
           <w:color w:val="1A1A1A"/>
           <w:sz w:val="23"/>
         </w:rPr>
-        <w:t>Russell, S., &amp; Norvig, P. (2020). Artificial Intelligence: A Modern Approach (4e edition). Pearson.</w:t>
+        <w:t>Russell, S., &amp; Norvig, P. (2020). Artificial Intelligence: À Modern Approach (4e édition). Pearson.</w:t>
       </w:r>
     </w:p>
     <w:p>
@@ -15999,7 +15999,7 @@
           <w:color w:val="1A1A1A"/>
           <w:sz w:val="23"/>
         </w:rPr>
-        <w:t>Agence Nationale de Reglementation des Telecommunications - ANRT (2024). Tableau de bord du marche des telecommunications au Maroc. Disponible sur : anrt.ma.</w:t>
+        <w:t>Agence Nationale de Réglementation des Telecommunications - ANRT (2024). Tableau de bord du marché des telecommunications au Maroc. Disponible sur : anrt.ma.</w:t>
       </w:r>
     </w:p>
     <w:p>
@@ -16015,7 +16015,7 @@
           <w:color w:val="1A1A1A"/>
           <w:sz w:val="23"/>
         </w:rPr>
-        <w:t>Google Ads Help (2024). A propos des campagnes Performance Max. Disponible sur : support.google.com/google-ads.</w:t>
+        <w:t>Google Ads Help (2024). À propos des campagnes Performance Max. Disponible sur : support.google.com/google-ads.</w:t>
       </w:r>
     </w:p>
     <w:p>
@@ -16031,7 +16031,7 @@
           <w:color w:val="1A1A1A"/>
           <w:sz w:val="23"/>
         </w:rPr>
-        <w:t>Kuaishou Technology (2024). Kling AI - Generative Video Platform. Documentation officielle. Disponible sur : kling.kuaishou.com.</w:t>
+        <w:t>Kuaishou Technology (2024). Kling AI - Générative Video Platform. Documentation officielle. Disponible sur : kling.kuaishou.com.</w:t>
       </w:r>
     </w:p>
     <w:p>
@@ -16094,7 +16094,7 @@
           <w:color w:val="1A1A1A"/>
           <w:sz w:val="23"/>
         </w:rPr>
-        <w:t>McKinsey &amp; Company (2023). The Economic Potential of Generative AI: The Next Productivity Frontier. McKinsey Global Institute.</w:t>
+        <w:t>McKinsey &amp; Company (2023). The Economic Potential of Générative AI: The Next Productivity Frontier. McKinsey Global Institute.</w:t>
       </w:r>
     </w:p>
     <w:p>
@@ -16165,7 +16165,7 @@
           <w:color w:val="1A1A1A"/>
           <w:sz w:val="24"/>
         </w:rPr>
-        <w:t>Le guide d'entretien utilise pour la phase qualitative s'articulait autour des themes suivants :</w:t>
+        <w:t>Le guide d'entretien utilise pour la phase qualitative s'articulait autour des thèmes suivants :</w:t>
       </w:r>
     </w:p>
     <w:p>
@@ -16199,7 +16199,7 @@
           <w:color w:val="1A1A1A"/>
           <w:sz w:val="23"/>
         </w:rPr>
-        <w:t>Pour quelles taches l'IA vous apporte-t-elle le plus de valeur ?</w:t>
+        <w:t>Pour quelles tâches l'IA vous apporte-t-elle le plus de valeur ?</w:t>
       </w:r>
     </w:p>
     <w:p>
@@ -16216,7 +16216,7 @@
           <w:color w:val="1A1A1A"/>
           <w:sz w:val="23"/>
         </w:rPr>
-        <w:t>Quels sont, selon vous, les principaux freins a l'adoption de l'IA dans votre structure ?</w:t>
+        <w:t>Quels sont, selon vous, les principaux freins à l'adoption de l'IA dans votre structure ?</w:t>
       </w:r>
     </w:p>
     <w:p>
@@ -16233,7 +16233,7 @@
           <w:color w:val="1A1A1A"/>
           <w:sz w:val="23"/>
         </w:rPr>
-        <w:t>Comment evaluez-vous la qualite des contenus generes par IA par rapport a une production humaine ?</w:t>
+        <w:t>Comment evaluez-vous la qualité des contenus générés par IA par rapport à une production humaine ?</w:t>
       </w:r>
     </w:p>
     <w:p>
@@ -16250,7 +16250,7 @@
           <w:color w:val="1A1A1A"/>
           <w:sz w:val="23"/>
         </w:rPr>
-        <w:t>Quelle place accordez-vous a la supervision humaine dans vos processus assistes par IA ?</w:t>
+        <w:t>Quelle place accordez-vous à la supervision humaine dans vos processus assistes par IA ?</w:t>
       </w:r>
     </w:p>
     <w:p>
@@ -16284,7 +16284,7 @@
           <w:color w:val="1A1A1A"/>
           <w:sz w:val="23"/>
         </w:rPr>
-        <w:t>Comment imaginez-vous l'evolution de votre metier dans les trois prochaines annees ?</w:t>
+        <w:t>Comment imaginez-vous l'évolution de votre metier dans les trois prochaines années ?</w:t>
       </w:r>
     </w:p>
     <w:p>
@@ -16315,7 +16315,7 @@
           <w:color w:val="1A1A1A"/>
           <w:sz w:val="24"/>
         </w:rPr>
-        <w:t>Le questionnaire en ligne (Google Forms) etait structure en quatre sections :</w:t>
+        <w:t>Le questionnaire en ligne (Google Forms) était structure en quatre sections :</w:t>
       </w:r>
     </w:p>
     <w:p>
@@ -16332,7 +16332,7 @@
           <w:color w:val="1A1A1A"/>
           <w:sz w:val="23"/>
         </w:rPr>
-        <w:t>Profil du repondant :</w:t>
+        <w:t>Profil du répondant :</w:t>
       </w:r>
       <w:r>
         <w:rPr>
@@ -16342,7 +16342,7 @@
           <w:color w:val="1A1A1A"/>
           <w:sz w:val="23"/>
         </w:rPr>
-        <w:t xml:space="preserve"> type de structure, anciennete, secteur, tranche d'age.</w:t>
+        <w:t xml:space="preserve"> type de structure, anciennete, secteur, tranche d'âge.</w:t>
       </w:r>
     </w:p>
     <w:p>
@@ -16369,7 +16369,7 @@
           <w:color w:val="1A1A1A"/>
           <w:sz w:val="23"/>
         </w:rPr>
-        <w:t xml:space="preserve"> outils utilises, frequence d'usage, taches concernees.</w:t>
+        <w:t xml:space="preserve"> outils utilises, frequence d'usage, tâches concernees.</w:t>
       </w:r>
     </w:p>
     <w:p>
@@ -16386,7 +16386,7 @@
           <w:color w:val="1A1A1A"/>
           <w:sz w:val="23"/>
         </w:rPr>
-        <w:t>Impact percu :</w:t>
+        <w:t>Impact perçu :</w:t>
       </w:r>
       <w:r>
         <w:rPr>
@@ -16396,7 +16396,7 @@
           <w:color w:val="1A1A1A"/>
           <w:sz w:val="23"/>
         </w:rPr>
-        <w:t xml:space="preserve"> effets sur les couts, l'engagement, le taux de clics, le temps de production.</w:t>
+        <w:t xml:space="preserve"> effets sur les coûts, l'engagement, le taux de clics, le temps de production.</w:t>
       </w:r>
     </w:p>
     <w:p>
@@ -16423,7 +16423,7 @@
           <w:color w:val="1A1A1A"/>
           <w:sz w:val="23"/>
         </w:rPr>
-        <w:t xml:space="preserve"> qualite, authenticite, comparaison avec la production humaine.</w:t>
+        <w:t xml:space="preserve"> qualité, authenticite, comparaison avec la production humaine.</w:t>
       </w:r>
     </w:p>
     <w:p>
@@ -16454,7 +16454,7 @@
           <w:color w:val="1A1A1A"/>
           <w:sz w:val="24"/>
         </w:rPr>
-        <w:t>Les decoupages plan par plan des deux videos figurent aux tableaux 6.3 (Video 1 - L'Evasion) et 6.4 (Video 2 - La Mascotte) du chapitre 6. Ils ont servi de base a la redaction des prompts soumis a Kling AI et a l'assemblage realise sous Nano Banana Pro.</w:t>
+        <w:t>Les decoupages plan par plan des deux videos figurent aux tableaux 6.3 (Video 1 - L'Evasion) et 6.4 (Video 2 - La Mascotte) du chapitre 6. Ils ont servi de basé à la redaction des prompts soumis à Kling AI et à l'assemblage réalisé sous Nano Banana Pro.</w:t>
       </w:r>
     </w:p>
     <w:p>
@@ -16737,7 +16737,7 @@
                 <w:color w:val="1A1A1A"/>
                 <w:sz w:val="21"/>
               </w:rPr>
-              <w:t>Story compte a rebours + sondage</w:t>
+              <w:t>Story compte à rebours + sondage</w:t>
             </w:r>
           </w:p>
         </w:tc>
@@ -16802,7 +16802,7 @@
                 <w:color w:val="1A1A1A"/>
                 <w:sz w:val="21"/>
               </w:rPr>
-              <w:t>Reel coulisses (production IA)</w:t>
+              <w:t>Réel coulisses (production IA)</w:t>
             </w:r>
           </w:p>
         </w:tc>
@@ -16867,7 +16867,7 @@
                 <w:color w:val="1A1A1A"/>
                 <w:sz w:val="21"/>
               </w:rPr>
-              <w:t>Post compte a rebours</w:t>
+              <w:t>Post compte à rebours</w:t>
             </w:r>
           </w:p>
         </w:tc>
@@ -17062,7 +17062,7 @@
                 <w:color w:val="1A1A1A"/>
                 <w:sz w:val="21"/>
               </w:rPr>
-              <w:t>Devoilement - Video 2 (mascotte)</w:t>
+              <w:t>Dévoilement - Video 2 (mascotte)</w:t>
             </w:r>
           </w:p>
         </w:tc>
@@ -17106,7 +17106,7 @@
                 <w:color w:val="1A1A1A"/>
                 <w:sz w:val="21"/>
               </w:rPr>
-              <w:t>J+1 a J+15</w:t>
+              <w:t>J+1 à J+15</w:t>
             </w:r>
           </w:p>
         </w:tc>
@@ -17187,7 +17187,7 @@
           <w:color w:val="1A1A1A"/>
           <w:sz w:val="24"/>
         </w:rPr>
-        <w:t>Conformement a l'esprit de transparence evoque au chapitre 3, il est precise que les contenus de la campagne Varcadia ont ete produits a l'aide d'outils d'IA generative (Kling AI, Nano Banana Pro), sous supervision humaine constante. La conception strategique, la direction artistique, l'analyse des donnees et la redaction de ce rapport relevent du travail personnel de l'auteur.</w:t>
+        <w:t>Conformement à l'esprit de transparence evoque au chapitre 3, il est precise que les contenus de la campagne Varcadia ont été produits à l'aide d'outils d'IA générative (Kling AI, Nano Banana Pro), sous supervision humaine constante. La conception stratégique, la direction artistique, l'analysé des donnees et la redaction de ce rapport relevent du travail personnel de l'auteur.</w:t>
       </w:r>
     </w:p>
     <w:p>
@@ -17211,7 +17211,7 @@
           <w:color w:val="1F4E79"/>
           <w:sz w:val="36"/>
         </w:rPr>
-        <w:t>Table des matieres</w:t>
+        <w:t>Table des matières</w:t>
       </w:r>
     </w:p>
     <w:p>
@@ -17241,7 +17241,7 @@
           <w:color w:val="1A1A1A"/>
           <w:sz w:val="24"/>
         </w:rPr>
-        <w:t>Resume / Abstract</w:t>
+        <w:t>Résumé / Abstract</w:t>
       </w:r>
     </w:p>
     <w:p>
@@ -17301,7 +17301,7 @@
           <w:color w:val="1A1A1A"/>
           <w:sz w:val="24"/>
         </w:rPr>
-        <w:t>Chapitre 1 - Le marketing digital a l'ere de l'IA</w:t>
+        <w:t>Chapitre 1 - Le marketing digital à l'ere de l'IA</w:t>
       </w:r>
     </w:p>
     <w:p>
@@ -17316,7 +17316,7 @@
           <w:color w:val="1A1A1A"/>
           <w:sz w:val="23"/>
         </w:rPr>
-        <w:t xml:space="preserve">   1.1  Evolution du marketing digital</w:t>
+        <w:t xml:space="preserve">   1.1  Évolution du marketing digital</w:t>
       </w:r>
     </w:p>
     <w:p>
@@ -17361,7 +17361,7 @@
           <w:color w:val="1A1A1A"/>
           <w:sz w:val="23"/>
         </w:rPr>
-        <w:t xml:space="preserve">   1.4  Etat de l'adoption de l'IA au Maroc</w:t>
+        <w:t xml:space="preserve">   1.4  État de l'adoption de l'IA au Maroc</w:t>
       </w:r>
     </w:p>
     <w:p>
@@ -17466,7 +17466,7 @@
           <w:color w:val="1A1A1A"/>
           <w:sz w:val="23"/>
         </w:rPr>
-        <w:t xml:space="preserve">   3.1  Le contenu a l'ere de l'IA generative</w:t>
+        <w:t xml:space="preserve">   3.1  Le contenu à l'ere de l'IA générative</w:t>
       </w:r>
     </w:p>
     <w:p>
@@ -17496,7 +17496,7 @@
           <w:color w:val="1A1A1A"/>
           <w:sz w:val="23"/>
         </w:rPr>
-        <w:t xml:space="preserve">   3.3  Performance du contenu genere par IA</w:t>
+        <w:t xml:space="preserve">   3.3  Performance du contenu généré par IA</w:t>
       </w:r>
     </w:p>
     <w:p>
@@ -17511,7 +17511,7 @@
           <w:color w:val="1A1A1A"/>
           <w:sz w:val="23"/>
         </w:rPr>
-        <w:t xml:space="preserve">   3.4  Limites ethiques et propriete intellectuelle</w:t>
+        <w:t xml:space="preserve">   3.4  Limites éthiques et propriété intellectuelle</w:t>
       </w:r>
     </w:p>
     <w:p>
@@ -17541,7 +17541,7 @@
           <w:color w:val="1A1A1A"/>
           <w:sz w:val="24"/>
         </w:rPr>
-        <w:t>Chapitre 4 - Methodologie de recherche</w:t>
+        <w:t>Chapitre 4 - Méthodologie de recherche</w:t>
       </w:r>
     </w:p>
     <w:p>
@@ -17556,7 +17556,7 @@
           <w:color w:val="1A1A1A"/>
           <w:sz w:val="24"/>
         </w:rPr>
-        <w:t>Chapitre 5 - Resultats et analyse</w:t>
+        <w:t>Chapitre 5 - Résultats et analysé</w:t>
       </w:r>
     </w:p>
     <w:p>
@@ -17571,7 +17571,7 @@
           <w:color w:val="1A1A1A"/>
           <w:sz w:val="24"/>
         </w:rPr>
-        <w:t>Chapitre 6 - Campagne Varcadia : demonstration appliquee</w:t>
+        <w:t>Chapitre 6 - Campagne Varcadia : démonstration appliquee</w:t>
       </w:r>
     </w:p>
     <w:p>
@@ -17601,7 +17601,7 @@
           <w:color w:val="1A1A1A"/>
           <w:sz w:val="23"/>
         </w:rPr>
-        <w:t xml:space="preserve">   6.2  Strategie de lancement : le teasing</w:t>
+        <w:t xml:space="preserve">   6.2  Stratégie de lancement : le teasing</w:t>
       </w:r>
     </w:p>
     <w:p>
@@ -17631,7 +17631,7 @@
           <w:color w:val="1A1A1A"/>
           <w:sz w:val="23"/>
         </w:rPr>
-        <w:t xml:space="preserve">   6.4  Analyse des deux videos de la campagne</w:t>
+        <w:t xml:space="preserve">   6.4  Analysé des deux videos de la campagne</w:t>
       </w:r>
     </w:p>
     <w:p>
@@ -17661,7 +17661,7 @@
           <w:color w:val="1A1A1A"/>
           <w:sz w:val="23"/>
         </w:rPr>
-        <w:t xml:space="preserve">   6.6  Diffusion multicanale et resultats reels</w:t>
+        <w:t xml:space="preserve">   6.6  Diffusion multicanale et résultats réels</w:t>
       </w:r>
     </w:p>
     <w:p>

</xml_diff>